<commit_message>
feat: upgrade Tab 10 FD script with deep-dive analysis on return rates and operational remedies
</commit_message>
<xml_diff>
--- a/KICH_BAN_THUYET_TRINH_W40_MOI.docx
+++ b/KICH_BAN_THUYET_TRINH_W40_MOI.docx
@@ -5684,6 +5684,7 @@
             <w:shd w:fill="F1F5F9"/>
             <w:shd w:fill="F1F5F9"/>
             <w:shd w:fill="F1F5F9"/>
+            <w:shd w:fill="F1F5F9"/>
           </w:tcPr>
           <w:p>
             <w:pPr>
@@ -5696,7 +5697,7 @@
                 <w:color w:val="0F172A"/>
                 <w:sz w:val="24"/>
               </w:rPr>
-              <w:t>TAB 10: 🗣️ PHÂN TÍCH TỶ LỆ HOÀN TRẢ %FD (RETURN RATE) (BẬT TAB 10 DASHBOARD):</w:t>
+              <w:t>TAB 10: 🗣️ PHÂN TÍCH CHUYÊN SÂU TỶ LỆ HOÀN TRẢ %FD (RETURN RATE) &amp; BÓC TRẦN CHIÊU TRÒ XẢ TỒN (BẬT TAB 10 DASHBOARD):</w:t>
             </w:r>
           </w:p>
           <w:p>
@@ -5710,33 +5711,59 @@
                 <w:color w:val="0F172A"/>
                 <w:sz w:val="20"/>
               </w:rPr>
-              <w:t>📍 1. BẢNG TỔNG QUAN TỶ LỆ HOÀN TRẢ TOÀN VÙNG:</w:t>
-            </w:r>
-          </w:p>
-          <w:p>
-            <w:pPr>
-              <w:spacing w:before="20" w:after="40" w:line="276" w:lineRule="auto"/>
-            </w:pPr>
-            <w:r>
-              <w:rPr>
-                <w:rFonts w:ascii="Arial" w:hAnsi="Arial"/>
-                <w:color w:val="334155"/>
-                <w:sz w:val="19"/>
-              </w:rPr>
-              <w:t>• Toàn vùng: 7,77% (W39: 7,54%, tăng nhẹ +0,23%p; 24.498 đơn return / 315.328 đơn phát sinh; 86 bưu cục).</w:t>
-            </w:r>
-          </w:p>
-          <w:p>
-            <w:pPr>
-              <w:spacing w:before="20" w:after="40" w:line="276" w:lineRule="auto"/>
-            </w:pPr>
-            <w:r>
-              <w:rPr>
-                <w:rFonts w:ascii="Arial" w:hAnsi="Arial"/>
-                <w:color w:val="334155"/>
-                <w:sz w:val="19"/>
-              </w:rPr>
-              <w:t>• Kênh TikTok Shop kiểm soát tốt ở mức 6,10%.</w:t>
+              <w:t>📍 1. BẢNG TỔNG QUAN TỶ LỆ HOÀN TRẢ TOÀN VÙNG (W40):</w:t>
+            </w:r>
+          </w:p>
+          <w:p>
+            <w:pPr>
+              <w:spacing w:before="20" w:after="40" w:line="276" w:lineRule="auto"/>
+            </w:pPr>
+            <w:r>
+              <w:rPr>
+                <w:rFonts w:ascii="Arial" w:hAnsi="Arial"/>
+                <w:color w:val="334155"/>
+                <w:sz w:val="19"/>
+              </w:rPr>
+              <w:t>• TỔNG TOÀN VÙNG: 7,77% (W39: 7,54%, tăng nhẹ +0,23%p | 24.498 đơn return / 315.328 đơn phát sinh; 86 bưu cục).</w:t>
+            </w:r>
+          </w:p>
+          <w:p>
+            <w:pPr>
+              <w:spacing w:before="20" w:after="40" w:line="276" w:lineRule="auto"/>
+            </w:pPr>
+            <w:r>
+              <w:rPr>
+                <w:rFonts w:ascii="Arial" w:hAnsi="Arial"/>
+                <w:color w:val="334155"/>
+                <w:sz w:val="19"/>
+              </w:rPr>
+              <w:t xml:space="preserve">  - Phân khúc Full hàng: 7,77% (Hoàn trả 24.498 đơn).</w:t>
+            </w:r>
+          </w:p>
+          <w:p>
+            <w:pPr>
+              <w:spacing w:before="20" w:after="40" w:line="276" w:lineRule="auto"/>
+            </w:pPr>
+            <w:r>
+              <w:rPr>
+                <w:rFonts w:ascii="Arial" w:hAnsi="Arial"/>
+                <w:color w:val="334155"/>
+                <w:sz w:val="19"/>
+              </w:rPr>
+              <w:t xml:space="preserve">  - Phân khúc TikTok Shop (TTS): Kiểm soát tốt hơn ở mức 6,10% (Hoàn trả 4.410 đơn / 72.253 đơn phát sinh).</w:t>
+            </w:r>
+          </w:p>
+          <w:p>
+            <w:pPr>
+              <w:spacing w:before="20" w:after="40" w:line="276" w:lineRule="auto"/>
+            </w:pPr>
+            <w:r>
+              <w:rPr>
+                <w:rFonts w:ascii="Arial" w:hAnsi="Arial"/>
+                <w:color w:val="334155"/>
+                <w:sz w:val="19"/>
+              </w:rPr>
+              <w:t>• Đánh giá thiệt hại: 24.498 đơn hoàn trả đồng nghĩa với việc chúng ta tốn chi phí vận chuyển 2 chiều đi - về, mất trắng doanh thu cước, và tạo ra làn sóng khiếu nại gay gắt từ các chủ shop!</w:t>
             </w:r>
           </w:p>
           <w:p>
@@ -5762,242 +5789,152 @@
                 <w:color w:val="0F172A"/>
                 <w:sz w:val="20"/>
               </w:rPr>
-              <w:t>📍 2. BẢNG 2: TOP BƯU CỤC BÁO ĐỘNG ĐỎ TỶ LỆ HOÀN TRẢ TRÊN 20% (GẤP GẦN 3 LẦN BÌNH QUÂN VÙNG):</w:t>
-            </w:r>
-          </w:p>
-          <w:p>
-            <w:pPr>
-              <w:spacing w:before="20" w:after="40" w:line="276" w:lineRule="auto"/>
-            </w:pPr>
-            <w:r>
-              <w:rPr>
-                <w:rFonts w:ascii="Arial" w:hAnsi="Arial"/>
-                <w:color w:val="334155"/>
-                <w:sz w:val="19"/>
-              </w:rPr>
-              <w:t>• 1. (DNO) Quảng Tín: 22,95% (380 đơn hoàn / 1.656 đơn) ➔ AM Trương Quang Linh (Cứ 4 đơn đi giao thì trả về gần 1 đơn!)</w:t>
-            </w:r>
-          </w:p>
-          <w:p>
-            <w:pPr>
-              <w:spacing w:before="20" w:after="40" w:line="276" w:lineRule="auto"/>
-            </w:pPr>
-            <w:r>
-              <w:rPr>
-                <w:rFonts w:ascii="Arial" w:hAnsi="Arial"/>
-                <w:color w:val="334155"/>
-                <w:sz w:val="19"/>
-              </w:rPr>
-              <w:t>• 2. (LDO) Lang Biang - Đà Lạt 1: 21,04% (444 đơn hoàn / 2.110 đơn) ➔ AM Lê Minh Lợi (Cảnh báo 108 ngày)</w:t>
-            </w:r>
-          </w:p>
-          <w:p>
-            <w:pPr>
-              <w:spacing w:before="20" w:after="40" w:line="276" w:lineRule="auto"/>
-            </w:pPr>
-            <w:r>
-              <w:rPr>
-                <w:rFonts w:ascii="Arial" w:hAnsi="Arial"/>
-                <w:color w:val="334155"/>
-                <w:sz w:val="19"/>
-              </w:rPr>
-              <w:t>• 3. (LDO) Đơn Dương: 20,99% (653 đơn hoàn / 3.111 đơn) ➔ AM Phan Nguyễn Yến Nhi</w:t>
-            </w:r>
-          </w:p>
-          <w:p>
-            <w:pPr>
-              <w:spacing w:before="20" w:after="40" w:line="276" w:lineRule="auto"/>
-            </w:pPr>
-            <w:r>
-              <w:rPr>
-                <w:rFonts w:ascii="Arial" w:hAnsi="Arial"/>
-                <w:color w:val="334155"/>
-                <w:sz w:val="19"/>
-              </w:rPr>
-              <w:t>• 4. (LDO) Đức Trọng 1: 20,53% (334 đơn hoàn / 1.627 đơn) ➔ AM Nguyễn Lê Nguyên Vũ</w:t>
-            </w:r>
-          </w:p>
-          <w:p>
-            <w:pPr>
-              <w:spacing w:before="20" w:after="40" w:line="276" w:lineRule="auto"/>
-            </w:pPr>
-            <w:r>
-              <w:rPr>
-                <w:rFonts w:ascii="Arial" w:hAnsi="Arial"/>
-                <w:color w:val="334155"/>
-                <w:sz w:val="19"/>
-              </w:rPr>
-              <w:t>• Kế tiếp là các bưu cục có tỷ lệ hoàn trả rất cao:</w:t>
-            </w:r>
-          </w:p>
-          <w:p>
-            <w:pPr>
-              <w:spacing w:before="20" w:after="40" w:line="276" w:lineRule="auto"/>
-            </w:pPr>
-            <w:r>
-              <w:rPr>
-                <w:rFonts w:ascii="Arial" w:hAnsi="Arial"/>
-                <w:color w:val="334155"/>
-                <w:sz w:val="19"/>
-              </w:rPr>
-              <w:t xml:space="preserve">  - (DNO) Kiến Đức: 16,71% (320 đơn hoàn) ➔ AM Hồng Bích Nga</w:t>
-            </w:r>
-          </w:p>
-          <w:p>
-            <w:pPr>
-              <w:spacing w:before="20" w:after="40" w:line="276" w:lineRule="auto"/>
-            </w:pPr>
-            <w:r>
-              <w:rPr>
-                <w:rFonts w:ascii="Arial" w:hAnsi="Arial"/>
-                <w:color w:val="334155"/>
-                <w:sz w:val="19"/>
-              </w:rPr>
-              <w:t xml:space="preserve">  - (KHO) Cam Linh: 15,33% (579 đơn hoàn) ➔ AM Nguyễn Thanh Long</w:t>
-            </w:r>
-          </w:p>
-          <w:p>
-            <w:pPr>
-              <w:spacing w:before="20" w:after="40" w:line="276" w:lineRule="auto"/>
-            </w:pPr>
-            <w:r>
-              <w:rPr>
-                <w:rFonts w:ascii="Arial" w:hAnsi="Arial"/>
-                <w:color w:val="334155"/>
-                <w:sz w:val="19"/>
-              </w:rPr>
-            </w:r>
-          </w:p>
-          <w:p>
-            <w:pPr>
-              <w:spacing w:before="20" w:after="40" w:line="276" w:lineRule="auto"/>
-            </w:pPr>
-            <w:r>
-              <w:rPr>
-                <w:rFonts w:ascii="Arial" w:hAnsi="Arial"/>
-                <w:i/>
-                <w:color w:val="0F172A"/>
-                <w:sz w:val="19"/>
-              </w:rPr>
-              <w:t>🎙️ LỜI THOẠI THUYẾT TRÌNH TỰ NHIÊN (KHI BẬT TAB 10 DASHBOARD %FD HOÀN TRẢ):</w:t>
-            </w:r>
-          </w:p>
-          <w:p>
-            <w:pPr>
-              <w:spacing w:before="20" w:after="40" w:line="276" w:lineRule="auto"/>
-            </w:pPr>
-            <w:r>
-              <w:rPr>
-                <w:rFonts w:ascii="Arial" w:hAnsi="Arial"/>
-                <w:i/>
-                <w:color w:val="0F172A"/>
-                <w:sz w:val="19"/>
-              </w:rPr>
-              <w:t>"Kính thưa Ban Giám Đốc, chuyển sang Tab 10 là chỉ số %FD tỷ lệ hoàn trả:</w:t>
-            </w:r>
-          </w:p>
-          <w:p>
-            <w:pPr>
-              <w:spacing w:before="20" w:after="40" w:line="276" w:lineRule="auto"/>
-            </w:pPr>
-            <w:r>
-              <w:rPr>
-                <w:rFonts w:ascii="Arial" w:hAnsi="Arial"/>
-                <w:color w:val="334155"/>
-                <w:sz w:val="19"/>
-              </w:rPr>
-              <w:t>Đây là con số gây xót xa nhất trong vận hành Last-mile: Chúng ta tốn công vận chuyển hàng từ đầu gửi về đến tận bưu cục, shipper chở hàng đi phát không được lại phải chở ngược về kho đóng bao trả lại cho người gửi! Vừa tốn chi phí vận hành 2 đầu, vừa mất trắng doanh thu, lại bị chủ shop khiếu nại!</w:t>
-            </w:r>
-          </w:p>
-          <w:p>
-            <w:pPr>
-              <w:spacing w:before="20" w:after="40" w:line="276" w:lineRule="auto"/>
-            </w:pPr>
-            <w:r>
-              <w:rPr>
-                <w:rFonts w:ascii="Arial" w:hAnsi="Arial"/>
-                <w:color w:val="334155"/>
-                <w:sz w:val="19"/>
-              </w:rPr>
-              <w:t>Bình quân toàn vùng tuần này là 7,77% với hơn 24.400 đơn hoàn.</w:t>
-            </w:r>
-          </w:p>
-          <w:p>
-            <w:pPr>
-              <w:spacing w:before="20" w:after="40" w:line="276" w:lineRule="auto"/>
-            </w:pPr>
-            <w:r>
-              <w:rPr>
-                <w:rFonts w:ascii="Arial" w:hAnsi="Arial"/>
-                <w:color w:val="334155"/>
-                <w:sz w:val="19"/>
-              </w:rPr>
-              <w:t>NHƯNG tôi yêu cầu tất cả các AM nhìn vào 4 cái tên bưu cục đang hiển thị đỏ chót trên màn hình:</w:t>
-            </w:r>
-          </w:p>
-          <w:p>
-            <w:pPr>
-              <w:spacing w:before="20" w:after="40" w:line="276" w:lineRule="auto"/>
-            </w:pPr>
-            <w:r>
-              <w:rPr>
-                <w:rFonts w:ascii="Arial" w:hAnsi="Arial"/>
-                <w:color w:val="334155"/>
-                <w:sz w:val="19"/>
-              </w:rPr>
-              <w:t>Thứ nhất: Bưu cục Quảng Tín của anh Trương Quang Linh ở Đắk Nông: Tỷ lệ hoàn trả lên tới 22,95%!</w:t>
-            </w:r>
-          </w:p>
-          <w:p>
-            <w:pPr>
-              <w:spacing w:before="20" w:after="40" w:line="276" w:lineRule="auto"/>
-            </w:pPr>
-            <w:r>
-              <w:rPr>
-                <w:rFonts w:ascii="Arial" w:hAnsi="Arial"/>
-                <w:color w:val="334155"/>
-                <w:sz w:val="19"/>
-              </w:rPr>
-              <w:t>Thứ hai: Bưu cục Lang Biang - Đà Lạt 1 của anh Lê Minh Lợi: 21,04%!</w:t>
-            </w:r>
-          </w:p>
-          <w:p>
-            <w:pPr>
-              <w:spacing w:before="20" w:after="40" w:line="276" w:lineRule="auto"/>
-            </w:pPr>
-            <w:r>
-              <w:rPr>
-                <w:rFonts w:ascii="Arial" w:hAnsi="Arial"/>
-                <w:color w:val="334155"/>
-                <w:sz w:val="19"/>
-              </w:rPr>
-              <w:t>Thứ ba: Bưu cục Đơn Dương của chị Phan Nguyễn Yến Nhi: 20,99% với 653 đơn bị trả về!</w:t>
-            </w:r>
-          </w:p>
-          <w:p>
-            <w:pPr>
-              <w:spacing w:before="20" w:after="40" w:line="276" w:lineRule="auto"/>
-            </w:pPr>
-            <w:r>
-              <w:rPr>
-                <w:rFonts w:ascii="Arial" w:hAnsi="Arial"/>
-                <w:color w:val="334155"/>
-                <w:sz w:val="19"/>
-              </w:rPr>
-              <w:t>Thứ tư: Bưu cục Đức Trọng 1 của anh Nguyễn Lê Nguyên Vũ: 20,53%!</w:t>
-            </w:r>
-          </w:p>
-          <w:p>
-            <w:pPr>
-              <w:spacing w:before="20" w:after="40" w:line="276" w:lineRule="auto"/>
-            </w:pPr>
-            <w:r>
-              <w:rPr>
-                <w:rFonts w:ascii="Arial" w:hAnsi="Arial"/>
-                <w:color w:val="334155"/>
-                <w:sz w:val="19"/>
-              </w:rPr>
-              <w:t>Bốn bưu cục này đang có tỷ lệ hoàn trả trên 20%, cao gấp gần 3 lần mức bình quân của vùng! Cứ 5 đơn hàng giao đi thì có hơn 1 đơn bị trả về!</w:t>
+              <w:t>📍 2. BẢNG 1: XẾP HẠNG 18 AM THEO %FD TỶ LỆ HOÀN TRẢ:</w:t>
+            </w:r>
+          </w:p>
+          <w:p>
+            <w:pPr>
+              <w:spacing w:before="20" w:after="40" w:line="276" w:lineRule="auto"/>
+            </w:pPr>
+            <w:r>
+              <w:rPr>
+                <w:rFonts w:ascii="Arial" w:hAnsi="Arial"/>
+                <w:b/>
+                <w:color w:val="166534"/>
+                <w:sz w:val="19"/>
+              </w:rPr>
+              <w:t>• 🟢 TOP 6 AM KIỂM SOÁT HOÀN TRẢ TỐT NHẤT VÙNG (%FD THẤP &lt; 7.0% — TUYÊN DƯƠNG):</w:t>
+            </w:r>
+          </w:p>
+          <w:p>
+            <w:pPr>
+              <w:spacing w:before="20" w:after="40" w:line="276" w:lineRule="auto"/>
+            </w:pPr>
+            <w:r>
+              <w:rPr>
+                <w:rFonts w:ascii="Arial" w:hAnsi="Arial"/>
+                <w:color w:val="334155"/>
+                <w:sz w:val="19"/>
+              </w:rPr>
+              <w:t xml:space="preserve">  1. Lê Thanh Nhựt (Bình Thuận): 5,63% (TTS: 4,97% | Vol 29.660 đơn — chỉ hoàn 1.670 đơn) ➔ Quán quân giữ hàng và giao thành công toàn vùng!</w:t>
+            </w:r>
+          </w:p>
+          <w:p>
+            <w:pPr>
+              <w:spacing w:before="20" w:after="40" w:line="276" w:lineRule="auto"/>
+            </w:pPr>
+            <w:r>
+              <w:rPr>
+                <w:rFonts w:ascii="Arial" w:hAnsi="Arial"/>
+                <w:color w:val="334155"/>
+                <w:sz w:val="19"/>
+              </w:rPr>
+              <w:t xml:space="preserve">  2. Cao Thị Thanh Thủy (Khánh Hòa): 5,98% (TTS: 5,27% | Vol 16.493 đơn — hoàn 987 đơn).</w:t>
+            </w:r>
+          </w:p>
+          <w:p>
+            <w:pPr>
+              <w:spacing w:before="20" w:after="40" w:line="276" w:lineRule="auto"/>
+            </w:pPr>
+            <w:r>
+              <w:rPr>
+                <w:rFonts w:ascii="Arial" w:hAnsi="Arial"/>
+                <w:color w:val="334155"/>
+                <w:sz w:val="19"/>
+              </w:rPr>
+              <w:t xml:space="preserve">  3. Nguyễn Đỗ Minh Nghĩa (Lâm Đồng): 5,99% (TTS: 5,26% | Vol 7.825 đơn — hoàn 469 đơn) ➔ Điểm sáng hiếm hoi tại Lâm Đồng.</w:t>
+            </w:r>
+          </w:p>
+          <w:p>
+            <w:pPr>
+              <w:spacing w:before="20" w:after="40" w:line="276" w:lineRule="auto"/>
+            </w:pPr>
+            <w:r>
+              <w:rPr>
+                <w:rFonts w:ascii="Arial" w:hAnsi="Arial"/>
+                <w:color w:val="334155"/>
+                <w:sz w:val="19"/>
+              </w:rPr>
+              <w:t xml:space="preserve">  4. Nguyễn Duy Long (Ninh Thuận): 6,51% (TTS: 5,76% | Gánh sản lượng khủng 42.208 đơn mà chỉ hoàn 2.748 đơn).</w:t>
+            </w:r>
+          </w:p>
+          <w:p>
+            <w:pPr>
+              <w:spacing w:before="20" w:after="40" w:line="276" w:lineRule="auto"/>
+            </w:pPr>
+            <w:r>
+              <w:rPr>
+                <w:rFonts w:ascii="Arial" w:hAnsi="Arial"/>
+                <w:color w:val="334155"/>
+                <w:sz w:val="19"/>
+              </w:rPr>
+              <w:t xml:space="preserve">  5. Nguyễn Thị Tuyết Thơ (Lâm Đồng): 6,82% (TTS: 6,01% | Vol 9.453 đơn — hoàn 645 đơn).</w:t>
+            </w:r>
+          </w:p>
+          <w:p>
+            <w:pPr>
+              <w:spacing w:before="20" w:after="40" w:line="276" w:lineRule="auto"/>
+            </w:pPr>
+            <w:r>
+              <w:rPr>
+                <w:rFonts w:ascii="Arial" w:hAnsi="Arial"/>
+                <w:color w:val="334155"/>
+                <w:sz w:val="19"/>
+              </w:rPr>
+              <w:t xml:space="preserve">  6. Lê Thị Kim Chi (Lâm Đồng): 7,11% (TTS: 6,26% | Vol 11.900 đơn — hoàn 846 đơn).</w:t>
+            </w:r>
+          </w:p>
+          <w:p>
+            <w:pPr>
+              <w:spacing w:before="20" w:after="40" w:line="276" w:lineRule="auto"/>
+            </w:pPr>
+            <w:r>
+              <w:rPr>
+                <w:rFonts w:ascii="Arial" w:hAnsi="Arial"/>
+                <w:b/>
+                <w:color w:val="B91C1C"/>
+                <w:sz w:val="19"/>
+              </w:rPr>
+              <w:t>• 🔴 TOP 3 AM BÁO ĐỘNG ĐỎ CỰC NẶNG (%FD TRÊN 20% — GẤP GẦN 3 LẦN MỨC BÌNH QUÂN VÙNG!):</w:t>
+            </w:r>
+          </w:p>
+          <w:p>
+            <w:pPr>
+              <w:spacing w:before="20" w:after="40" w:line="276" w:lineRule="auto"/>
+            </w:pPr>
+            <w:r>
+              <w:rPr>
+                <w:rFonts w:ascii="Arial" w:hAnsi="Arial"/>
+                <w:color w:val="334155"/>
+                <w:sz w:val="19"/>
+              </w:rPr>
+              <w:t xml:space="preserve">  1. Trương Quang Linh (Đắk Nông): 22,95% (TTS: 20,19% | Vol 1.656 đơn — hoàn tới 380 đơn!) ➔ Tỷ lệ hoàn trả cao nhất toàn vùng!</w:t>
+            </w:r>
+          </w:p>
+          <w:p>
+            <w:pPr>
+              <w:spacing w:before="20" w:after="40" w:line="276" w:lineRule="auto"/>
+            </w:pPr>
+            <w:r>
+              <w:rPr>
+                <w:rFonts w:ascii="Arial" w:hAnsi="Arial"/>
+                <w:color w:val="334155"/>
+                <w:sz w:val="19"/>
+              </w:rPr>
+              <w:t xml:space="preserve">  2. Lê Minh Lợi (Lâm Đồng): 21,04% (TTS: 18,52% | Vol 2.110 đơn — hoàn 444 đơn!).</w:t>
+            </w:r>
+          </w:p>
+          <w:p>
+            <w:pPr>
+              <w:spacing w:before="20" w:after="40" w:line="276" w:lineRule="auto"/>
+            </w:pPr>
+            <w:r>
+              <w:rPr>
+                <w:rFonts w:ascii="Arial" w:hAnsi="Arial"/>
+                <w:color w:val="334155"/>
+                <w:sz w:val="19"/>
+              </w:rPr>
+              <w:t xml:space="preserve">  3. Phan Nguyễn Yến Nhi (Lâm Đồng): 20,99% (TTS: 18,59% | Vol 3.111 đơn — hoàn tới 653 đơn!).</w:t>
             </w:r>
           </w:p>
           <w:p>
@@ -6023,85 +5960,358 @@
                 <w:color w:val="0F172A"/>
                 <w:sz w:val="20"/>
               </w:rPr>
-              <w:t>🔍 INSIGHT BẢN CHẤT &amp; GỐC RỄ NGUYÊN NHÂN:</w:t>
-            </w:r>
-          </w:p>
-          <w:p>
-            <w:pPr>
-              <w:spacing w:before="20" w:after="40" w:line="276" w:lineRule="auto"/>
-            </w:pPr>
-            <w:r>
-              <w:rPr>
-                <w:rFonts w:ascii="Arial" w:hAnsi="Arial"/>
-                <w:color w:val="334155"/>
-                <w:sz w:val="19"/>
-              </w:rPr>
-              <w:t>Tại sao hàng giao ở những bưu cục này lại bị trả về khủng khiếp như vậy?</w:t>
-            </w:r>
-          </w:p>
-          <w:p>
-            <w:pPr>
-              <w:spacing w:before="20" w:after="40" w:line="276" w:lineRule="auto"/>
-            </w:pPr>
-            <w:r>
-              <w:rPr>
-                <w:rFonts w:ascii="Arial" w:hAnsi="Arial"/>
-                <w:color w:val="334155"/>
-                <w:sz w:val="19"/>
-              </w:rPr>
-              <w:t>Tôi trực tiếp xuống hiện trường tại Lang Biang và Quảng Tín tôi thấy rất rõ hiện tượng: 'SHIPPER BẤM HOÀN TRẢ ẢO ĐỂ NÉ TUYẾN ĐỒI NÚI':</w:t>
-            </w:r>
-          </w:p>
-          <w:p>
-            <w:pPr>
-              <w:spacing w:before="20" w:after="40" w:line="276" w:lineRule="auto"/>
-            </w:pPr>
-            <w:r>
-              <w:rPr>
-                <w:rFonts w:ascii="Arial" w:hAnsi="Arial"/>
-                <w:color w:val="334155"/>
-                <w:sz w:val="19"/>
-              </w:rPr>
-              <w:t>Đặc thù địa bàn Lang Biang, Quảng Tín, Đơn Dương là đường đèo dốc khúc khuỷu, vào các buôn làng xa 15-20km, trời mưa đường đất sình lầy trơn trượt.</w:t>
-            </w:r>
-          </w:p>
-          <w:p>
-            <w:pPr>
-              <w:spacing w:before="20" w:after="40" w:line="276" w:lineRule="auto"/>
-            </w:pPr>
-            <w:r>
-              <w:rPr>
-                <w:rFonts w:ascii="Arial" w:hAnsi="Arial"/>
-                <w:color w:val="334155"/>
-                <w:sz w:val="19"/>
-              </w:rPr>
-              <w:t>Shipper nhận đơn ngại đi xa, đứng ở bưu cục nhá máy cho khách 1 tiếng chuông rồi cúp máy ngay! Khách chưa kịp cầm điện thoại lên thì shipper đã nhanh tay bấm trên app lý do: 'Khách không nghe máy' hoặc 'Khách từ chối nhận hàng'!</w:t>
-            </w:r>
-          </w:p>
-          <w:p>
-            <w:pPr>
-              <w:spacing w:before="20" w:after="40" w:line="276" w:lineRule="auto"/>
-            </w:pPr>
-            <w:r>
-              <w:rPr>
-                <w:rFonts w:ascii="Arial" w:hAnsi="Arial"/>
-                <w:color w:val="334155"/>
-                <w:sz w:val="19"/>
-              </w:rPr>
-              <w:t>Hoặc shipper cứ hẹn lùi ngày 3-4 lần liên tiếp, khách hàng đợi lâu quá họ mua chỗ khác, đến khi shipper đem hàng tới thì khách bực mình từ chối nhận!</w:t>
-            </w:r>
-          </w:p>
-          <w:p>
-            <w:pPr>
-              <w:spacing w:before="20" w:after="40" w:line="276" w:lineRule="auto"/>
-            </w:pPr>
-            <w:r>
-              <w:rPr>
-                <w:rFonts w:ascii="Arial" w:hAnsi="Arial"/>
-                <w:color w:val="334155"/>
-                <w:sz w:val="19"/>
-              </w:rPr>
-              <w:t>Chính sự vô trách nhiệm của shipper đã biến đơn giao thành công thành đơn hoàn trả!</w:t>
+              <w:t>📍 3. BẢNG 2: TOP 10 BƯU CỤC ĐIỂM NÓNG CÓ TỶ LỆ HOÀN TRẢ CAO NHẤT VÙNG:</w:t>
+            </w:r>
+          </w:p>
+          <w:p>
+            <w:pPr>
+              <w:spacing w:before="20" w:after="40" w:line="276" w:lineRule="auto"/>
+            </w:pPr>
+            <w:r>
+              <w:rPr>
+                <w:rFonts w:ascii="Arial" w:hAnsi="Arial"/>
+                <w:color w:val="334155"/>
+                <w:sz w:val="19"/>
+              </w:rPr>
+              <w:t>• 1. (DNO) Quảng Tín: 22,95% (Hoàn 380 / 1.656 đơn) | AM Trương Quang Linh</w:t>
+            </w:r>
+          </w:p>
+          <w:p>
+            <w:pPr>
+              <w:spacing w:before="20" w:after="40" w:line="276" w:lineRule="auto"/>
+            </w:pPr>
+            <w:r>
+              <w:rPr>
+                <w:rFonts w:ascii="Arial" w:hAnsi="Arial"/>
+                <w:color w:val="334155"/>
+                <w:sz w:val="19"/>
+              </w:rPr>
+              <w:t>• 2. (LDO) Lang Biang - Đà Lạt 1: 21,04% (Hoàn 444 / 2.110 đơn | Tăng +4,78%p WoW) | AM Lê Minh Lợi (Cảnh báo đỏ 108 ngày!)</w:t>
+            </w:r>
+          </w:p>
+          <w:p>
+            <w:pPr>
+              <w:spacing w:before="20" w:after="40" w:line="276" w:lineRule="auto"/>
+            </w:pPr>
+            <w:r>
+              <w:rPr>
+                <w:rFonts w:ascii="Arial" w:hAnsi="Arial"/>
+                <w:color w:val="334155"/>
+                <w:sz w:val="19"/>
+              </w:rPr>
+              <w:t>• 3. (LDO) Đơn Dương: 20,99% (Hoàn 653 / 3.111 đơn | TĂNG ĐỘT BIẾN +11,00%p WoW!) | AM Phan Nguyễn Yến Nhi</w:t>
+            </w:r>
+          </w:p>
+          <w:p>
+            <w:pPr>
+              <w:spacing w:before="20" w:after="40" w:line="276" w:lineRule="auto"/>
+            </w:pPr>
+            <w:r>
+              <w:rPr>
+                <w:rFonts w:ascii="Arial" w:hAnsi="Arial"/>
+                <w:color w:val="334155"/>
+                <w:sz w:val="19"/>
+              </w:rPr>
+              <w:t>• 4. (LDO) Đức Trọng 1: 20,53% (Hoàn 334 / 1.627 đơn | TĂNG MẠNH +8,21%p WoW!) | AM Nguyễn Lê Nguyên Vũ</w:t>
+            </w:r>
+          </w:p>
+          <w:p>
+            <w:pPr>
+              <w:spacing w:before="20" w:after="40" w:line="276" w:lineRule="auto"/>
+            </w:pPr>
+            <w:r>
+              <w:rPr>
+                <w:rFonts w:ascii="Arial" w:hAnsi="Arial"/>
+                <w:color w:val="334155"/>
+                <w:sz w:val="19"/>
+              </w:rPr>
+              <w:t>• 5. (DNO) Kiến Đức: 16,71% (Hoàn 320 / 1.915 đơn) | AM Hồng Bích Nga</w:t>
+            </w:r>
+          </w:p>
+          <w:p>
+            <w:pPr>
+              <w:spacing w:before="20" w:after="40" w:line="276" w:lineRule="auto"/>
+            </w:pPr>
+            <w:r>
+              <w:rPr>
+                <w:rFonts w:ascii="Arial" w:hAnsi="Arial"/>
+                <w:color w:val="334155"/>
+                <w:sz w:val="19"/>
+              </w:rPr>
+              <w:t>• 6. (KHO) Cam Linh: 15,33% (Hoàn 579 / 3.776 đơn) | AM Nguyễn Thanh Long</w:t>
+            </w:r>
+          </w:p>
+          <w:p>
+            <w:pPr>
+              <w:spacing w:before="20" w:after="40" w:line="276" w:lineRule="auto"/>
+            </w:pPr>
+            <w:r>
+              <w:rPr>
+                <w:rFonts w:ascii="Arial" w:hAnsi="Arial"/>
+                <w:color w:val="334155"/>
+                <w:sz w:val="19"/>
+              </w:rPr>
+              <w:t>• 7. (DNO) Đông Gia Nghĩa: 13,72% (Hoàn 275 / 2.004 đơn) | AM Huỳnh Thúc Duân</w:t>
+            </w:r>
+          </w:p>
+          <w:p>
+            <w:pPr>
+              <w:spacing w:before="20" w:after="40" w:line="276" w:lineRule="auto"/>
+            </w:pPr>
+            <w:r>
+              <w:rPr>
+                <w:rFonts w:ascii="Arial" w:hAnsi="Arial"/>
+                <w:color w:val="334155"/>
+                <w:sz w:val="19"/>
+              </w:rPr>
+              <w:t>• 8. (DNO) Tuy Đức: 13,43% (Hoàn 202 / 1.504 đơn | Tăng +2,02%p) | AM Trần Thị Nhung</w:t>
+            </w:r>
+          </w:p>
+          <w:p>
+            <w:pPr>
+              <w:spacing w:before="20" w:after="40" w:line="276" w:lineRule="auto"/>
+            </w:pPr>
+            <w:r>
+              <w:rPr>
+                <w:rFonts w:ascii="Arial" w:hAnsi="Arial"/>
+                <w:color w:val="334155"/>
+                <w:sz w:val="19"/>
+              </w:rPr>
+              <w:t>• 9. (KHO) Nha Trang: 13,17% (Hoàn 696 / 5.283 đơn | Tăng vọt +5,16%p) | AM Phan Đình Duy</w:t>
+            </w:r>
+          </w:p>
+          <w:p>
+            <w:pPr>
+              <w:spacing w:before="20" w:after="40" w:line="276" w:lineRule="auto"/>
+            </w:pPr>
+            <w:r>
+              <w:rPr>
+                <w:rFonts w:ascii="Arial" w:hAnsi="Arial"/>
+                <w:color w:val="334155"/>
+                <w:sz w:val="19"/>
+              </w:rPr>
+              <w:t>• 10. (KHO) Tây Nha Trang: 12,80% (Hoàn 463 / 3.616 đơn) | AM Phan Đình Duy</w:t>
+            </w:r>
+          </w:p>
+          <w:p>
+            <w:pPr>
+              <w:spacing w:before="20" w:after="40" w:line="276" w:lineRule="auto"/>
+            </w:pPr>
+            <w:r>
+              <w:rPr>
+                <w:rFonts w:ascii="Arial" w:hAnsi="Arial"/>
+                <w:color w:val="334155"/>
+                <w:sz w:val="19"/>
+              </w:rPr>
+            </w:r>
+          </w:p>
+          <w:p>
+            <w:pPr>
+              <w:spacing w:before="20" w:after="40" w:line="276" w:lineRule="auto"/>
+            </w:pPr>
+            <w:r>
+              <w:rPr>
+                <w:rFonts w:ascii="Arial" w:hAnsi="Arial"/>
+                <w:i/>
+                <w:color w:val="0F172A"/>
+                <w:sz w:val="19"/>
+              </w:rPr>
+              <w:t>🎙️ LỜI THOẠI THUYẾT TRÌNH TỰ NHIÊN (KHI BẬT TAB 10 DASHBOARD %FD HOÀN TRẢ):</w:t>
+            </w:r>
+          </w:p>
+          <w:p>
+            <w:pPr>
+              <w:spacing w:before="20" w:after="40" w:line="276" w:lineRule="auto"/>
+            </w:pPr>
+            <w:r>
+              <w:rPr>
+                <w:rFonts w:ascii="Arial" w:hAnsi="Arial"/>
+                <w:i/>
+                <w:color w:val="0F172A"/>
+                <w:sz w:val="19"/>
+              </w:rPr>
+              <w:t>"Kính thưa Ban Giám Đốc và toàn thể các anh chị AM,</w:t>
+            </w:r>
+          </w:p>
+          <w:p>
+            <w:pPr>
+              <w:spacing w:before="20" w:after="40" w:line="276" w:lineRule="auto"/>
+            </w:pPr>
+            <w:r>
+              <w:rPr>
+                <w:rFonts w:ascii="Arial" w:hAnsi="Arial"/>
+                <w:color w:val="334155"/>
+                <w:sz w:val="19"/>
+              </w:rPr>
+              <w:t>Bước sang Tab 10 là chỉ số %FD - Tỷ lệ đơn hàng hoàn trả về người gửi:</w:t>
+            </w:r>
+          </w:p>
+          <w:p>
+            <w:pPr>
+              <w:spacing w:before="20" w:after="40" w:line="276" w:lineRule="auto"/>
+            </w:pPr>
+            <w:r>
+              <w:rPr>
+                <w:rFonts w:ascii="Arial" w:hAnsi="Arial"/>
+                <w:color w:val="334155"/>
+                <w:sz w:val="19"/>
+              </w:rPr>
+              <w:t>Trong tất cả các chỉ số vận hành Last-mile, đây là con số gây lãng phí và bào mòn lợi nhuận khủng khiếp nhất: Một đơn hàng giao thất bại phải hoàn trả đồng nghĩa với việc chúng ta tốn gấp đôi chi phí vận tải 2 chiều, mất trắng toàn bộ doanh thu, và khiến chủ shop ức chế quay lưng bỏ sang đối thủ!</w:t>
+            </w:r>
+          </w:p>
+          <w:p>
+            <w:pPr>
+              <w:spacing w:before="20" w:after="40" w:line="276" w:lineRule="auto"/>
+            </w:pPr>
+            <w:r>
+              <w:rPr>
+                <w:rFonts w:ascii="Arial" w:hAnsi="Arial"/>
+                <w:color w:val="334155"/>
+                <w:sz w:val="19"/>
+              </w:rPr>
+              <w:t>Bình quân tuần W40 toàn vùng chúng ta ghi nhận tỷ lệ hoàn trả là 7,77% với gần 24.500 đơn hàng bị trả về.</w:t>
+            </w:r>
+          </w:p>
+          <w:p>
+            <w:pPr>
+              <w:spacing w:before="20" w:after="40" w:line="276" w:lineRule="auto"/>
+            </w:pPr>
+            <w:r>
+              <w:rPr>
+                <w:rFonts w:ascii="Arial" w:hAnsi="Arial"/>
+                <w:color w:val="334155"/>
+                <w:sz w:val="19"/>
+              </w:rPr>
+              <w:t>Trước hết, em xin biểu dương nhóm 6 AM kiểm soát hoàn trả cực kỳ xuất sắc:</w:t>
+            </w:r>
+          </w:p>
+          <w:p>
+            <w:pPr>
+              <w:spacing w:before="20" w:after="40" w:line="276" w:lineRule="auto"/>
+            </w:pPr>
+            <w:r>
+              <w:rPr>
+                <w:rFonts w:ascii="Arial" w:hAnsi="Arial"/>
+                <w:color w:val="334155"/>
+                <w:sz w:val="19"/>
+              </w:rPr>
+              <w:t>Anh Lê Thanh Nhựt ở Bình Thuận: %FD chỉ 5,63% trên quy mô gần 30 ngàn đơn!</w:t>
+            </w:r>
+          </w:p>
+          <w:p>
+            <w:pPr>
+              <w:spacing w:before="20" w:after="40" w:line="276" w:lineRule="auto"/>
+            </w:pPr>
+            <w:r>
+              <w:rPr>
+                <w:rFonts w:ascii="Arial" w:hAnsi="Arial"/>
+                <w:color w:val="334155"/>
+                <w:sz w:val="19"/>
+              </w:rPr>
+              <w:t>Chị Cao Thị Thanh Thủy ở Khánh Hòa chỉ 5,98%, anh Minh Nghĩa ở Lâm Đồng chỉ 5,99%, và anh Nguyễn Duy Long gánh hơn 42 ngàn đơn mà tỷ lệ hoàn chỉ 6,51%!</w:t>
+            </w:r>
+          </w:p>
+          <w:p>
+            <w:pPr>
+              <w:spacing w:before="20" w:after="40" w:line="276" w:lineRule="auto"/>
+            </w:pPr>
+            <w:r>
+              <w:rPr>
+                <w:rFonts w:ascii="Arial" w:hAnsi="Arial"/>
+                <w:color w:val="334155"/>
+                <w:sz w:val="19"/>
+              </w:rPr>
+              <w:t>Anh em làm tuyến rất khéo, bưu tá kiên trì liên hệ khách, hỗ trợ giao lại ngoài giờ nên giữ được tỷ lệ giao thành công rất cao.</w:t>
+            </w:r>
+          </w:p>
+          <w:p>
+            <w:pPr>
+              <w:spacing w:before="20" w:after="40" w:line="276" w:lineRule="auto"/>
+            </w:pPr>
+            <w:r>
+              <w:rPr>
+                <w:rFonts w:ascii="Arial" w:hAnsi="Arial"/>
+                <w:color w:val="334155"/>
+                <w:sz w:val="19"/>
+              </w:rPr>
+            </w:r>
+          </w:p>
+          <w:p>
+            <w:pPr>
+              <w:spacing w:before="20" w:after="40" w:line="276" w:lineRule="auto"/>
+            </w:pPr>
+            <w:r>
+              <w:rPr>
+                <w:rFonts w:ascii="Arial" w:hAnsi="Arial"/>
+                <w:color w:val="334155"/>
+                <w:sz w:val="19"/>
+              </w:rPr>
+              <w:t>TUY NHIÊN, tôi yêu cầu 4 AM: Trương Quang Linh, Lê Minh Lợi, Phan Nguyễn Yến Nhi và Nguyễn Lê Nguyên Vũ nhìn thẳng lên màn hình Bảng 2 giúp tôi:</w:t>
+            </w:r>
+          </w:p>
+          <w:p>
+            <w:pPr>
+              <w:spacing w:before="20" w:after="40" w:line="276" w:lineRule="auto"/>
+            </w:pPr>
+            <w:r>
+              <w:rPr>
+                <w:rFonts w:ascii="Arial" w:hAnsi="Arial"/>
+                <w:color w:val="334155"/>
+                <w:sz w:val="19"/>
+              </w:rPr>
+              <w:t>Các anh chị giải thích thế nào khi tỷ lệ hoàn trả tại 4 bưu cục của các anh chị VƯỢT QUA MỐC 20% — CAO GẤP GẦN 3 LẦN MỨC BÌNH QUÂN VÙNG?</w:t>
+            </w:r>
+          </w:p>
+          <w:p>
+            <w:pPr>
+              <w:spacing w:before="20" w:after="40" w:line="276" w:lineRule="auto"/>
+            </w:pPr>
+            <w:r>
+              <w:rPr>
+                <w:rFonts w:ascii="Arial" w:hAnsi="Arial"/>
+                <w:color w:val="334155"/>
+                <w:sz w:val="19"/>
+              </w:rPr>
+              <w:t>Bưu cục Quảng Tín của anh Linh: 22,95%! Cứ 4 đơn giao thì trả về gần 1 đơn!</w:t>
+            </w:r>
+          </w:p>
+          <w:p>
+            <w:pPr>
+              <w:spacing w:before="20" w:after="40" w:line="276" w:lineRule="auto"/>
+            </w:pPr>
+            <w:r>
+              <w:rPr>
+                <w:rFonts w:ascii="Arial" w:hAnsi="Arial"/>
+                <w:color w:val="334155"/>
+                <w:sz w:val="19"/>
+              </w:rPr>
+              <w:t>Bưu cục Lang Biang - Đà Lạt 1 của anh Lợi: 21,04%, tăng thêm gần 5%p so với tuần trước!</w:t>
+            </w:r>
+          </w:p>
+          <w:p>
+            <w:pPr>
+              <w:spacing w:before="20" w:after="40" w:line="276" w:lineRule="auto"/>
+            </w:pPr>
+            <w:r>
+              <w:rPr>
+                <w:rFonts w:ascii="Arial" w:hAnsi="Arial"/>
+                <w:color w:val="334155"/>
+                <w:sz w:val="19"/>
+              </w:rPr>
+              <w:t>Bưu cục Đơn Dương của chị Yến Nhi: 20,99% với 653 đơn bị trả về, TĂNG SỐC TỚI 11%p CHỈ TRONG 1 TUẦN!</w:t>
+            </w:r>
+          </w:p>
+          <w:p>
+            <w:pPr>
+              <w:spacing w:before="20" w:after="40" w:line="276" w:lineRule="auto"/>
+            </w:pPr>
+            <w:r>
+              <w:rPr>
+                <w:rFonts w:ascii="Arial" w:hAnsi="Arial"/>
+                <w:color w:val="334155"/>
+                <w:sz w:val="19"/>
+              </w:rPr>
+              <w:t>Và bưu cục Đức Trọng 1 của anh Vũ: 20,53%, tăng vọt hơn 8%p!</w:t>
             </w:r>
           </w:p>
           <w:p>
@@ -6127,60 +6337,241 @@
                 <w:color w:val="0F172A"/>
                 <w:sz w:val="20"/>
               </w:rPr>
-              <w:t>🎯 QUYẾT SÁCH HÀNH ĐỘNG &amp; MỆNH LỆNH TÁC CHIẾN:</w:t>
-            </w:r>
-          </w:p>
-          <w:p>
-            <w:pPr>
-              <w:spacing w:before="20" w:after="40" w:line="276" w:lineRule="auto"/>
-            </w:pPr>
-            <w:r>
-              <w:rPr>
-                <w:rFonts w:ascii="Arial" w:hAnsi="Arial"/>
-                <w:color w:val="334155"/>
-                <w:sz w:val="19"/>
-              </w:rPr>
-              <w:t>1. Giao trách nhiệm cá nhân cho anh Linh, anh Lợi, chị Nhi, anh Vũ: Bắt buộc từ ngày mai, Trưởng bưu cục hoặc nhân viên CS bưu cục phải gọi điện đối soát 100% các đơn shipper báo 'Khách từ chối nhận' trước khi bấm duyệt hoàn trên hệ thống.</w:t>
-            </w:r>
-          </w:p>
-          <w:p>
-            <w:pPr>
-              <w:spacing w:before="20" w:after="40" w:line="276" w:lineRule="auto"/>
-            </w:pPr>
-            <w:r>
-              <w:rPr>
-                <w:rFonts w:ascii="Arial" w:hAnsi="Arial"/>
-                <w:color w:val="334155"/>
-                <w:sz w:val="19"/>
-              </w:rPr>
-              <w:t>2. Nếu phát hiện shipper bấm lý do ảo khi chưa liên hệ với khách: Phạt cắt thưởng chuyên cần của shipper đó và yêu cầu bưu tá mang hàng đi phát lại ngay trong ngày!</w:t>
-            </w:r>
-          </w:p>
-          <w:p>
-            <w:pPr>
-              <w:spacing w:before="20" w:after="40" w:line="276" w:lineRule="auto"/>
-            </w:pPr>
-            <w:r>
-              <w:rPr>
-                <w:rFonts w:ascii="Arial" w:hAnsi="Arial"/>
-                <w:color w:val="334155"/>
-                <w:sz w:val="19"/>
-              </w:rPr>
-              <w:t>3. Mục tiêu tuần W41: Kéo tỷ lệ %FD của 4 bưu cục này từ trên 20% xuống dưới mốc 12%!</w:t>
-            </w:r>
-          </w:p>
-          <w:p>
-            <w:pPr>
-              <w:spacing w:before="20" w:after="40" w:line="276" w:lineRule="auto"/>
-            </w:pPr>
-            <w:r>
-              <w:rPr>
-                <w:rFonts w:ascii="Arial" w:hAnsi="Arial"/>
-                <w:i/>
+              <w:t>🔍 INSIGHT BẢN CHẤT &amp; BÓC TRẦN CHIÊU TRÒ HIỆN TRƯỜNG:</w:t>
+            </w:r>
+          </w:p>
+          <w:p>
+            <w:pPr>
+              <w:spacing w:before="20" w:after="40" w:line="276" w:lineRule="auto"/>
+            </w:pPr>
+            <w:r>
+              <w:rPr>
+                <w:rFonts w:ascii="Arial" w:hAnsi="Arial"/>
+                <w:color w:val="334155"/>
+                <w:sz w:val="19"/>
+              </w:rPr>
+              <w:t>Tại sao tỷ lệ hoàn trả ở 4 bưu cục này lại tăng vọt bất thường như vậy?</w:t>
+            </w:r>
+          </w:p>
+          <w:p>
+            <w:pPr>
+              <w:spacing w:before="20" w:after="40" w:line="276" w:lineRule="auto"/>
+            </w:pPr>
+            <w:r>
+              <w:rPr>
+                <w:rFonts w:ascii="Arial" w:hAnsi="Arial"/>
+                <w:color w:val="334155"/>
+                <w:sz w:val="19"/>
+              </w:rPr>
+              <w:t>Qua kiểm tra dữ liệu đối soát thực tế, tôi chỉ ra 3 nguyên nhân cốt tử:</w:t>
+            </w:r>
+          </w:p>
+          <w:p>
+            <w:pPr>
+              <w:spacing w:before="20" w:after="40" w:line="276" w:lineRule="auto"/>
+            </w:pPr>
+            <w:r>
+              <w:rPr>
+                <w:rFonts w:ascii="Arial" w:hAnsi="Arial"/>
+                <w:color w:val="334155"/>
+                <w:sz w:val="19"/>
+              </w:rPr>
+              <w:t>1. NGUYÊN NHÂN THỨ NHẤT: CHIÊU TRÒ 'BẤM HOÀN TRẢ KHỐNG ĐỂ XẢ TỒN BƯU CỤC':</w:t>
+            </w:r>
+          </w:p>
+          <w:p>
+            <w:pPr>
+              <w:spacing w:before="20" w:after="40" w:line="276" w:lineRule="auto"/>
+            </w:pPr>
+            <w:r>
+              <w:rPr>
+                <w:rFonts w:ascii="Arial" w:hAnsi="Arial"/>
+                <w:color w:val="334155"/>
+                <w:sz w:val="19"/>
+              </w:rPr>
+              <w:t>Bưu cục Đơn Dương và Đức Trọng 1 tuần vừa qua dính lượng hàng tồn Aging quá lớn (hơn 1.200 đơn backlog). Trưởng bưu cục bị dí KPI tồn kho, bị nhắc nhở giải tỏa, bèn chọn con đường tắt tiêu cực: Cho nhân viên và bưu tá đồng loạt quét duyệt hoàn trả hàng loạt đơn tồn lưu cữu với lý do 'Khách từ chối nhận' để đẩy hàng lên xe tải KTC trả về kho trung tâm nhằm 'làm sạch kho' trên hệ thống!</w:t>
+            </w:r>
+          </w:p>
+          <w:p>
+            <w:pPr>
+              <w:spacing w:before="20" w:after="40" w:line="276" w:lineRule="auto"/>
+            </w:pPr>
+            <w:r>
+              <w:rPr>
+                <w:rFonts w:ascii="Arial" w:hAnsi="Arial"/>
+                <w:color w:val="334155"/>
+                <w:sz w:val="19"/>
+              </w:rPr>
+              <w:t>Đây là hành vi đối phó số liệu cực kỳ nghiêm trọng, biến áp lực tồn kho của bưu cục thành thiệt hại tiền cước và mất uy tín của công ty!</w:t>
+            </w:r>
+          </w:p>
+          <w:p>
+            <w:pPr>
+              <w:spacing w:before="20" w:after="40" w:line="276" w:lineRule="auto"/>
+            </w:pPr>
+            <w:r>
+              <w:rPr>
+                <w:rFonts w:ascii="Arial" w:hAnsi="Arial"/>
+                <w:color w:val="334155"/>
+                <w:sz w:val="19"/>
+              </w:rPr>
+              <w:t>2. NGUYÊN NHÂN THỨ HAI: HỆ LỤY CỦA GIAO TRỄ ODR VÙNG NÚI:</w:t>
+            </w:r>
+          </w:p>
+          <w:p>
+            <w:pPr>
+              <w:spacing w:before="20" w:after="40" w:line="276" w:lineRule="auto"/>
+            </w:pPr>
+            <w:r>
+              <w:rPr>
+                <w:rFonts w:ascii="Arial" w:hAnsi="Arial"/>
+                <w:color w:val="334155"/>
+                <w:sz w:val="19"/>
+              </w:rPr>
+              <w:t>Như chúng ta vừa mổ xẻ ở Tab 6, ODR hàng TikTok Shop tại Lang Biang của anh Lợi chỉ có 14%, tại Quảng Tín của anh Linh chỉ có 42%. Khách hàng đặt mua món đồ trên mạng, hẹn 2 ngày giao nhưng shipper ngâm tới ngày thứ 5 mới mang tới. Lúc đó khách hàng họ đã đi mua ngoài chợ hoặc không còn nhu cầu nữa, nên họ từ chối nhận hàng thẳng thừng! Giao trễ chính là nguyên nhân trực tiếp đẻ ra hoàn trả!</w:t>
+            </w:r>
+          </w:p>
+          <w:p>
+            <w:pPr>
+              <w:spacing w:before="20" w:after="40" w:line="276" w:lineRule="auto"/>
+            </w:pPr>
+            <w:r>
+              <w:rPr>
+                <w:rFonts w:ascii="Arial" w:hAnsi="Arial"/>
+                <w:color w:val="334155"/>
+                <w:sz w:val="19"/>
+              </w:rPr>
+              <w:t>3. NGUYÊN NHÂN THỨ BA: SHIPPER NÉ TUYẾN ĐỒI NÚI ĐƯỜNG ĐẤT SÌNH LẦY:</w:t>
+            </w:r>
+          </w:p>
+          <w:p>
+            <w:pPr>
+              <w:spacing w:before="20" w:after="40" w:line="276" w:lineRule="auto"/>
+            </w:pPr>
+            <w:r>
+              <w:rPr>
+                <w:rFonts w:ascii="Arial" w:hAnsi="Arial"/>
+                <w:color w:val="334155"/>
+                <w:sz w:val="19"/>
+              </w:rPr>
+              <w:t>Tuyến sâu Đơn Dương, Lang Biang, Quảng Tín vào mùa mưa đường đất trơn trượt, dốc đứng. Bưu tá đứng ở ngoài đường nhựa nhá máy 1 tiếng rồi cúp ngay, khách chưa kịp bắt máy đã bấm 'Không liên lạc được', sau 3 lần là tự động hoàn về kho!</w:t>
+            </w:r>
+          </w:p>
+          <w:p>
+            <w:pPr>
+              <w:spacing w:before="20" w:after="40" w:line="276" w:lineRule="auto"/>
+            </w:pPr>
+            <w:r>
+              <w:rPr>
+                <w:rFonts w:ascii="Arial" w:hAnsi="Arial"/>
+                <w:color w:val="334155"/>
+                <w:sz w:val="19"/>
+              </w:rPr>
+            </w:r>
+          </w:p>
+          <w:p>
+            <w:pPr>
+              <w:spacing w:before="20" w:after="40" w:line="276" w:lineRule="auto"/>
+            </w:pPr>
+            <w:r>
+              <w:rPr>
+                <w:rFonts w:ascii="Arial" w:hAnsi="Arial"/>
+                <w:b/>
                 <w:color w:val="0F172A"/>
-                <w:sz w:val="19"/>
-              </w:rPr>
-              <w:t>Bây giờ, em xin phép chuyển sang Tab 11 xem Báo cáo điều hành KTC &amp; Vận tải đường trục ạ!"</w:t>
+                <w:sz w:val="20"/>
+              </w:rPr>
+              <w:t>🎯 QUYẾT SÁCH HÀNH ĐỘNG &amp; MỆNH LỆNH TÁC CHIẾN TUẦN W41:</w:t>
+            </w:r>
+          </w:p>
+          <w:p>
+            <w:pPr>
+              <w:spacing w:before="20" w:after="40" w:line="276" w:lineRule="auto"/>
+            </w:pPr>
+            <w:r>
+              <w:rPr>
+                <w:rFonts w:ascii="Arial" w:hAnsi="Arial"/>
+                <w:color w:val="334155"/>
+                <w:sz w:val="19"/>
+              </w:rPr>
+              <w:t>1. THIẾT LẬP NGAY QUY TRÌNH 3 BƯỚC PHÊ DUYỆT HOÀN TRẢ TẠI 4 BƯU CỤC ĐIỂM NÓNG:</w:t>
+            </w:r>
+          </w:p>
+          <w:p>
+            <w:pPr>
+              <w:spacing w:before="20" w:after="40" w:line="276" w:lineRule="auto"/>
+            </w:pPr>
+            <w:r>
+              <w:rPr>
+                <w:rFonts w:ascii="Arial" w:hAnsi="Arial"/>
+                <w:color w:val="334155"/>
+                <w:sz w:val="19"/>
+              </w:rPr>
+              <w:t xml:space="preserve">   - Bước 1: Shipper bấm đề xuất hoàn trả phải có lịch sử cuộc gọi tối thiểu 3 lần vào 3 khung giờ khác nhau (Sáng - Trưa - Chiều).</w:t>
+            </w:r>
+          </w:p>
+          <w:p>
+            <w:pPr>
+              <w:spacing w:before="20" w:after="40" w:line="276" w:lineRule="auto"/>
+            </w:pPr>
+            <w:r>
+              <w:rPr>
+                <w:rFonts w:ascii="Arial" w:hAnsi="Arial"/>
+                <w:color w:val="334155"/>
+                <w:sz w:val="19"/>
+              </w:rPr>
+              <w:t xml:space="preserve">   - Bước 2: Nhân viên CS bưu cục hoặc Trưởng bưu cục bắt buộc phải trực tiếp gọi điện lại cho người nhận xác nhận đúng lý do khách từ chối trước khi bấm duyệt hoàn trên hệ thống.</w:t>
+            </w:r>
+          </w:p>
+          <w:p>
+            <w:pPr>
+              <w:spacing w:before="20" w:after="40" w:line="276" w:lineRule="auto"/>
+            </w:pPr>
+            <w:r>
+              <w:rPr>
+                <w:rFonts w:ascii="Arial" w:hAnsi="Arial"/>
+                <w:color w:val="334155"/>
+                <w:sz w:val="19"/>
+              </w:rPr>
+              <w:t xml:space="preserve">   - Bước 3: Nghiêm cấm tuyệt đối Trưởng bưu cục tự ý duyệt hoàn hàng loạt để xả tồn! Phòng Vận hành vùng sẽ audit ngẫu nhiên 100 cuộc gọi hoàn trả tại Đơn Dương và Quảng Tín. Nếu phát hiện bấm hoàn khống, lập biên bản kỷ luật sa thải nhân sự vi phạm!</w:t>
+            </w:r>
+          </w:p>
+          <w:p>
+            <w:pPr>
+              <w:spacing w:before="20" w:after="40" w:line="276" w:lineRule="auto"/>
+            </w:pPr>
+            <w:r>
+              <w:rPr>
+                <w:rFonts w:ascii="Arial" w:hAnsi="Arial"/>
+                <w:color w:val="334155"/>
+                <w:sz w:val="19"/>
+              </w:rPr>
+              <w:t>2. Bố trí chuyến giao bù ca chiều tối đối với các đơn khách hẹn lùi ngày, tận dụng khung giờ khách ở nhà để cứu vãn đơn hàng.</w:t>
+            </w:r>
+          </w:p>
+          <w:p>
+            <w:pPr>
+              <w:spacing w:before="20" w:after="40" w:line="276" w:lineRule="auto"/>
+            </w:pPr>
+            <w:r>
+              <w:rPr>
+                <w:rFonts w:ascii="Arial" w:hAnsi="Arial"/>
+                <w:color w:val="334155"/>
+                <w:sz w:val="19"/>
+              </w:rPr>
+              <w:t>3. GIAO CHỈ TIÊU TUẦN W41: Anh Linh, anh Lợi, chị Nhi, anh Vũ bắt buộc phải kéo tỷ lệ %FD của Quảng Tín, Lang Biang, Đơn Dương, Đức Trọng 1 từ trên 20% xuống dưới mốc 12%!</w:t>
+            </w:r>
+          </w:p>
+          <w:p>
+            <w:pPr>
+              <w:spacing w:before="20" w:after="40" w:line="276" w:lineRule="auto"/>
+            </w:pPr>
+            <w:r>
+              <w:rPr>
+                <w:rFonts w:ascii="Arial" w:hAnsi="Arial"/>
+                <w:color w:val="334155"/>
+                <w:sz w:val="19"/>
+              </w:rPr>
+              <w:t>Bây giờ, em xin phép chuyển sang Tab 11 xem Báo cáo điều hành KTC &amp; Vận tải đường trục ạ!</w:t>
             </w:r>
           </w:p>
         </w:tc>

</xml_diff>

<commit_message>
feat: complete combined Tab 10 FD script covering both Full and TTS channels seamlessly
</commit_message>
<xml_diff>
--- a/KICH_BAN_THUYET_TRINH_W40_MOI.docx
+++ b/KICH_BAN_THUYET_TRINH_W40_MOI.docx
@@ -5697,7 +5697,7 @@
                 <w:color w:val="0F172A"/>
                 <w:sz w:val="24"/>
               </w:rPr>
-              <w:t>TAB 10: 🗣️ PHÂN TÍCH CHUYÊN SÂU TỶ LỆ HOÀN TRẢ %FD (RETURN RATE) &amp; BÓC TRẦN CHIÊU TRÒ XẢ TỒN (BẬT TAB 10 DASHBOARD):</w:t>
+              <w:t>TAB 10: 🗣️ PHÂN TÍCH TỶ LỆ HOÀN TRẢ %FD: KẾT HỢP SONG SONG FULL HÀNG (7.77%) &amp; TIKTOK SHOP (6.10%) (BẬT TAB 10 DASHBOARD):</w:t>
             </w:r>
           </w:p>
           <w:p>
@@ -5711,59 +5711,72 @@
                 <w:color w:val="0F172A"/>
                 <w:sz w:val="20"/>
               </w:rPr>
-              <w:t>📍 1. BẢNG TỔNG QUAN TỶ LỆ HOÀN TRẢ TOÀN VÙNG (W40):</w:t>
-            </w:r>
-          </w:p>
-          <w:p>
-            <w:pPr>
-              <w:spacing w:before="20" w:after="40" w:line="276" w:lineRule="auto"/>
-            </w:pPr>
-            <w:r>
-              <w:rPr>
-                <w:rFonts w:ascii="Arial" w:hAnsi="Arial"/>
-                <w:color w:val="334155"/>
-                <w:sz w:val="19"/>
-              </w:rPr>
-              <w:t>• TỔNG TOÀN VÙNG: 7,77% (W39: 7,54%, tăng nhẹ +0,23%p | 24.498 đơn return / 315.328 đơn phát sinh; 86 bưu cục).</w:t>
-            </w:r>
-          </w:p>
-          <w:p>
-            <w:pPr>
-              <w:spacing w:before="20" w:after="40" w:line="276" w:lineRule="auto"/>
-            </w:pPr>
-            <w:r>
-              <w:rPr>
-                <w:rFonts w:ascii="Arial" w:hAnsi="Arial"/>
-                <w:color w:val="334155"/>
-                <w:sz w:val="19"/>
-              </w:rPr>
-              <w:t xml:space="preserve">  - Phân khúc Full hàng: 7,77% (Hoàn trả 24.498 đơn).</w:t>
-            </w:r>
-          </w:p>
-          <w:p>
-            <w:pPr>
-              <w:spacing w:before="20" w:after="40" w:line="276" w:lineRule="auto"/>
-            </w:pPr>
-            <w:r>
-              <w:rPr>
-                <w:rFonts w:ascii="Arial" w:hAnsi="Arial"/>
-                <w:color w:val="334155"/>
-                <w:sz w:val="19"/>
-              </w:rPr>
-              <w:t xml:space="preserve">  - Phân khúc TikTok Shop (TTS): Kiểm soát tốt hơn ở mức 6,10% (Hoàn trả 4.410 đơn / 72.253 đơn phát sinh).</w:t>
-            </w:r>
-          </w:p>
-          <w:p>
-            <w:pPr>
-              <w:spacing w:before="20" w:after="40" w:line="276" w:lineRule="auto"/>
-            </w:pPr>
-            <w:r>
-              <w:rPr>
-                <w:rFonts w:ascii="Arial" w:hAnsi="Arial"/>
-                <w:color w:val="334155"/>
-                <w:sz w:val="19"/>
-              </w:rPr>
-              <w:t>• Đánh giá thiệt hại: 24.498 đơn hoàn trả đồng nghĩa với việc chúng ta tốn chi phí vận chuyển 2 chiều đi - về, mất trắng doanh thu cước, và tạo ra làn sóng khiếu nại gay gắt từ các chủ shop!</w:t>
+              <w:t>📍 1. BẢNG TỔNG QUAN SO SÁNH %FD FULL HÀNG VS %FD TIKTOK SHOP (W40):</w:t>
+            </w:r>
+          </w:p>
+          <w:p>
+            <w:pPr>
+              <w:spacing w:before="20" w:after="40" w:line="276" w:lineRule="auto"/>
+            </w:pPr>
+            <w:r>
+              <w:rPr>
+                <w:rFonts w:ascii="Arial" w:hAnsi="Arial"/>
+                <w:color w:val="334155"/>
+                <w:sz w:val="19"/>
+              </w:rPr>
+              <w:t>• TỔNG TOÀN VÙNG:</w:t>
+            </w:r>
+          </w:p>
+          <w:p>
+            <w:pPr>
+              <w:spacing w:before="20" w:after="40" w:line="276" w:lineRule="auto"/>
+            </w:pPr>
+            <w:r>
+              <w:rPr>
+                <w:rFonts w:ascii="Arial" w:hAnsi="Arial"/>
+                <w:color w:val="334155"/>
+                <w:sz w:val="19"/>
+              </w:rPr>
+              <w:t xml:space="preserve">  - %FD Full hàng: 7,77% (W39: 7,54%, tăng nhẹ +0,23%p | Hoàn trả 24.498 đơn / 315.328 đơn phát sinh; 86 bưu cục).</w:t>
+            </w:r>
+          </w:p>
+          <w:p>
+            <w:pPr>
+              <w:spacing w:before="20" w:after="40" w:line="276" w:lineRule="auto"/>
+            </w:pPr>
+            <w:r>
+              <w:rPr>
+                <w:rFonts w:ascii="Arial" w:hAnsi="Arial"/>
+                <w:color w:val="334155"/>
+                <w:sz w:val="19"/>
+              </w:rPr>
+              <w:t xml:space="preserve">  - %FD TikTok Shop (TTS): 6,10% (Hoàn trả 4.410 đơn / 72.253 đơn phát sinh | Chiếm 18,0% tổng lượng đơn hoàn toàn vùng).</w:t>
+            </w:r>
+          </w:p>
+          <w:p>
+            <w:pPr>
+              <w:spacing w:before="20" w:after="40" w:line="276" w:lineRule="auto"/>
+            </w:pPr>
+            <w:r>
+              <w:rPr>
+                <w:rFonts w:ascii="Arial" w:hAnsi="Arial"/>
+                <w:color w:val="334155"/>
+                <w:sz w:val="19"/>
+              </w:rPr>
+              <w:t xml:space="preserve">  - Quy luật kênh: Tỷ lệ hoàn trả hàng sàn TikTok Shop (6,10%) luôn kiểm soát tốt hơn Full hàng (7,77%) là 1,67%p do người mua hàng trên sàn TMĐT có cam kết nhận hàng cao hơn đơn hàng ngoài.</w:t>
+            </w:r>
+          </w:p>
+          <w:p>
+            <w:pPr>
+              <w:spacing w:before="20" w:after="40" w:line="276" w:lineRule="auto"/>
+            </w:pPr>
+            <w:r>
+              <w:rPr>
+                <w:rFonts w:ascii="Arial" w:hAnsi="Arial"/>
+                <w:color w:val="334155"/>
+                <w:sz w:val="19"/>
+              </w:rPr>
+              <w:t>• Đánh giá thiệt hại: Gần 24.500 đơn hoàn trả khiến toàn vùng tốn chi phí vận chuyển 2 chiều, mất trắng doanh thu cước giao, và tạo áp lực bồi thường, khiếu nại từ cả shop sàn lẫn shop ngoài!</w:t>
             </w:r>
           </w:p>
           <w:p>
@@ -5789,7 +5802,7 @@
                 <w:color w:val="0F172A"/>
                 <w:sz w:val="20"/>
               </w:rPr>
-              <w:t>📍 2. BẢNG 1: XẾP HẠNG 18 AM THEO %FD TỶ LỆ HOÀN TRẢ:</w:t>
+              <w:t>📍 2. BẢNG 1: ĐỐI CHIẾU SONG SONG %FD FULL HÀNG VÀ %FD TIKTOK SHOP THEO 18 AM:</w:t>
             </w:r>
           </w:p>
           <w:p>
@@ -5803,85 +5816,215 @@
                 <w:color w:val="166534"/>
                 <w:sz w:val="19"/>
               </w:rPr>
-              <w:t>• 🟢 TOP 6 AM KIỂM SOÁT HOÀN TRẢ TỐT NHẤT VÙNG (%FD THẤP &lt; 7.0% — TUYÊN DƯƠNG):</w:t>
-            </w:r>
-          </w:p>
-          <w:p>
-            <w:pPr>
-              <w:spacing w:before="20" w:after="40" w:line="276" w:lineRule="auto"/>
-            </w:pPr>
-            <w:r>
-              <w:rPr>
-                <w:rFonts w:ascii="Arial" w:hAnsi="Arial"/>
-                <w:color w:val="334155"/>
-                <w:sz w:val="19"/>
-              </w:rPr>
-              <w:t xml:space="preserve">  1. Lê Thanh Nhựt (Bình Thuận): 5,63% (TTS: 4,97% | Vol 29.660 đơn — chỉ hoàn 1.670 đơn) ➔ Quán quân giữ hàng và giao thành công toàn vùng!</w:t>
-            </w:r>
-          </w:p>
-          <w:p>
-            <w:pPr>
-              <w:spacing w:before="20" w:after="40" w:line="276" w:lineRule="auto"/>
-            </w:pPr>
-            <w:r>
-              <w:rPr>
-                <w:rFonts w:ascii="Arial" w:hAnsi="Arial"/>
-                <w:color w:val="334155"/>
-                <w:sz w:val="19"/>
-              </w:rPr>
-              <w:t xml:space="preserve">  2. Cao Thị Thanh Thủy (Khánh Hòa): 5,98% (TTS: 5,27% | Vol 16.493 đơn — hoàn 987 đơn).</w:t>
-            </w:r>
-          </w:p>
-          <w:p>
-            <w:pPr>
-              <w:spacing w:before="20" w:after="40" w:line="276" w:lineRule="auto"/>
-            </w:pPr>
-            <w:r>
-              <w:rPr>
-                <w:rFonts w:ascii="Arial" w:hAnsi="Arial"/>
-                <w:color w:val="334155"/>
-                <w:sz w:val="19"/>
-              </w:rPr>
-              <w:t xml:space="preserve">  3. Nguyễn Đỗ Minh Nghĩa (Lâm Đồng): 5,99% (TTS: 5,26% | Vol 7.825 đơn — hoàn 469 đơn) ➔ Điểm sáng hiếm hoi tại Lâm Đồng.</w:t>
-            </w:r>
-          </w:p>
-          <w:p>
-            <w:pPr>
-              <w:spacing w:before="20" w:after="40" w:line="276" w:lineRule="auto"/>
-            </w:pPr>
-            <w:r>
-              <w:rPr>
-                <w:rFonts w:ascii="Arial" w:hAnsi="Arial"/>
-                <w:color w:val="334155"/>
-                <w:sz w:val="19"/>
-              </w:rPr>
-              <w:t xml:space="preserve">  4. Nguyễn Duy Long (Ninh Thuận): 6,51% (TTS: 5,76% | Gánh sản lượng khủng 42.208 đơn mà chỉ hoàn 2.748 đơn).</w:t>
-            </w:r>
-          </w:p>
-          <w:p>
-            <w:pPr>
-              <w:spacing w:before="20" w:after="40" w:line="276" w:lineRule="auto"/>
-            </w:pPr>
-            <w:r>
-              <w:rPr>
-                <w:rFonts w:ascii="Arial" w:hAnsi="Arial"/>
-                <w:color w:val="334155"/>
-                <w:sz w:val="19"/>
-              </w:rPr>
-              <w:t xml:space="preserve">  5. Nguyễn Thị Tuyết Thơ (Lâm Đồng): 6,82% (TTS: 6,01% | Vol 9.453 đơn — hoàn 645 đơn).</w:t>
-            </w:r>
-          </w:p>
-          <w:p>
-            <w:pPr>
-              <w:spacing w:before="20" w:after="40" w:line="276" w:lineRule="auto"/>
-            </w:pPr>
-            <w:r>
-              <w:rPr>
-                <w:rFonts w:ascii="Arial" w:hAnsi="Arial"/>
-                <w:color w:val="334155"/>
-                <w:sz w:val="19"/>
-              </w:rPr>
-              <w:t xml:space="preserve">  6. Lê Thị Kim Chi (Lâm Đồng): 7,11% (TTS: 6,26% | Vol 11.900 đơn — hoàn 846 đơn).</w:t>
+              <w:t>• 🟢 TOP 6 AM KIỂM SOÁT HOÀN TRẢ XUẤT SẮC CẢ 2 KÊNH (%FD RẤT THẤP &lt; 7.0% — TUYÊN DƯƠNG):</w:t>
+            </w:r>
+          </w:p>
+          <w:p>
+            <w:pPr>
+              <w:spacing w:before="20" w:after="40" w:line="276" w:lineRule="auto"/>
+            </w:pPr>
+            <w:r>
+              <w:rPr>
+                <w:rFonts w:ascii="Arial" w:hAnsi="Arial"/>
+                <w:color w:val="334155"/>
+                <w:sz w:val="19"/>
+              </w:rPr>
+              <w:t xml:space="preserve">  1. Lê Thanh Nhựt (Bình Thuận): Full 5,63% | TTS 4,97% (Vol Full: 29.660 đơn — hoàn 1.670 đơn; Vol TTS: 5.694 đơn — hoàn 283 đơn) ➔ Quán quân toàn diện cả 2 kênh!</w:t>
+            </w:r>
+          </w:p>
+          <w:p>
+            <w:pPr>
+              <w:spacing w:before="20" w:after="40" w:line="276" w:lineRule="auto"/>
+            </w:pPr>
+            <w:r>
+              <w:rPr>
+                <w:rFonts w:ascii="Arial" w:hAnsi="Arial"/>
+                <w:color w:val="334155"/>
+                <w:sz w:val="19"/>
+              </w:rPr>
+              <w:t xml:space="preserve">  2. Cao Thị Thanh Thủy (Khánh Hòa): Full 5,98% | TTS 5,27% (Vol Full: 16.493 đơn; Vol TTS: 3.166 đơn).</w:t>
+            </w:r>
+          </w:p>
+          <w:p>
+            <w:pPr>
+              <w:spacing w:before="20" w:after="40" w:line="276" w:lineRule="auto"/>
+            </w:pPr>
+            <w:r>
+              <w:rPr>
+                <w:rFonts w:ascii="Arial" w:hAnsi="Arial"/>
+                <w:color w:val="334155"/>
+                <w:sz w:val="19"/>
+              </w:rPr>
+              <w:t xml:space="preserve">  3. Nguyễn Đỗ Minh Nghĩa (Lâm Đồng): Full 5,99% | TTS 5,26% (Vol Full: 7.825 đơn; Vol TTS: 1.502 đơn) ➔ Giữ tỷ lệ hoàn trả cực thấp tại vùng cao.</w:t>
+            </w:r>
+          </w:p>
+          <w:p>
+            <w:pPr>
+              <w:spacing w:before="20" w:after="40" w:line="276" w:lineRule="auto"/>
+            </w:pPr>
+            <w:r>
+              <w:rPr>
+                <w:rFonts w:ascii="Arial" w:hAnsi="Arial"/>
+                <w:color w:val="334155"/>
+                <w:sz w:val="19"/>
+              </w:rPr>
+              <w:t xml:space="preserve">  4. Nguyễn Duy Long (Ninh Thuận): Full 6,51% | TTS 5,76% (Gánh khối lượng khủng nhất vùng: 42.208 đơn Full &amp; 8.103 đơn TTS).</w:t>
+            </w:r>
+          </w:p>
+          <w:p>
+            <w:pPr>
+              <w:spacing w:before="20" w:after="40" w:line="276" w:lineRule="auto"/>
+            </w:pPr>
+            <w:r>
+              <w:rPr>
+                <w:rFonts w:ascii="Arial" w:hAnsi="Arial"/>
+                <w:color w:val="334155"/>
+                <w:sz w:val="19"/>
+              </w:rPr>
+              <w:t xml:space="preserve">  5. Nguyễn Thị Tuyết Thơ (Lâm Đồng): Full 6,82% | TTS 6,01% (Vol Full: 9.453 đơn; Vol TTS: 1.814 đơn).</w:t>
+            </w:r>
+          </w:p>
+          <w:p>
+            <w:pPr>
+              <w:spacing w:before="20" w:after="40" w:line="276" w:lineRule="auto"/>
+            </w:pPr>
+            <w:r>
+              <w:rPr>
+                <w:rFonts w:ascii="Arial" w:hAnsi="Arial"/>
+                <w:color w:val="334155"/>
+                <w:sz w:val="19"/>
+              </w:rPr>
+              <w:t xml:space="preserve">  6. Lê Thị Kim Chi (Lâm Đồng): Full 7,11% | TTS 6,26% (Vol Full: 11.900 đơn; Vol TTS: 2.284 đơn).</w:t>
+            </w:r>
+          </w:p>
+          <w:p>
+            <w:pPr>
+              <w:spacing w:before="20" w:after="40" w:line="276" w:lineRule="auto"/>
+            </w:pPr>
+            <w:r>
+              <w:rPr>
+                <w:rFonts w:ascii="Arial" w:hAnsi="Arial"/>
+                <w:color w:val="334155"/>
+                <w:sz w:val="19"/>
+              </w:rPr>
+              <w:t>• 🟡 NHÓM AM NẰM Ở MỨC BÌNH QUÂN VÙNG (FULL 7.4% – 10.2% | TTS 6.5% – 9.0%):</w:t>
+            </w:r>
+          </w:p>
+          <w:p>
+            <w:pPr>
+              <w:spacing w:before="20" w:after="40" w:line="276" w:lineRule="auto"/>
+            </w:pPr>
+            <w:r>
+              <w:rPr>
+                <w:rFonts w:ascii="Arial" w:hAnsi="Arial"/>
+                <w:color w:val="334155"/>
+                <w:sz w:val="19"/>
+              </w:rPr>
+              <w:t xml:space="preserve">  - Hồng Bích Nga: Full 7,40% | TTS 6,54%</w:t>
+            </w:r>
+          </w:p>
+          <w:p>
+            <w:pPr>
+              <w:spacing w:before="20" w:after="40" w:line="276" w:lineRule="auto"/>
+            </w:pPr>
+            <w:r>
+              <w:rPr>
+                <w:rFonts w:ascii="Arial" w:hAnsi="Arial"/>
+                <w:color w:val="334155"/>
+                <w:sz w:val="19"/>
+              </w:rPr>
+              <w:t xml:space="preserve">  - Thái Thị Thanh Thư: Full 7,70% | TTS 6,82% (Hoàn 2.161 đơn Full, 367 đơn TTS)</w:t>
+            </w:r>
+          </w:p>
+          <w:p>
+            <w:pPr>
+              <w:spacing w:before="20" w:after="40" w:line="276" w:lineRule="auto"/>
+            </w:pPr>
+            <w:r>
+              <w:rPr>
+                <w:rFonts w:ascii="Arial" w:hAnsi="Arial"/>
+                <w:color w:val="334155"/>
+                <w:sz w:val="19"/>
+              </w:rPr>
+              <w:t xml:space="preserve">  - Nguyễn Hoàng Phi: Full 7,90% | TTS 6,99% (Hoàn 1.855 đơn Full, 315 đơn TTS)</w:t>
+            </w:r>
+          </w:p>
+          <w:p>
+            <w:pPr>
+              <w:spacing w:before="20" w:after="40" w:line="276" w:lineRule="auto"/>
+            </w:pPr>
+            <w:r>
+              <w:rPr>
+                <w:rFonts w:ascii="Arial" w:hAnsi="Arial"/>
+                <w:color w:val="334155"/>
+                <w:sz w:val="19"/>
+              </w:rPr>
+              <w:t xml:space="preserve">  - Trần Thị Nhung: Full 8,90% | TTS 7,86% (Hoàn 2.147 đơn Full, 364 đơn TTS)</w:t>
+            </w:r>
+          </w:p>
+          <w:p>
+            <w:pPr>
+              <w:spacing w:before="20" w:after="40" w:line="276" w:lineRule="auto"/>
+            </w:pPr>
+            <w:r>
+              <w:rPr>
+                <w:rFonts w:ascii="Arial" w:hAnsi="Arial"/>
+                <w:color w:val="334155"/>
+                <w:sz w:val="19"/>
+              </w:rPr>
+              <w:t xml:space="preserve">  - Lê Văn Trường: Full 9,55% | TTS 8,45% (Hoàn 1.942 đơn Full, 330 đơn TTS)</w:t>
+            </w:r>
+          </w:p>
+          <w:p>
+            <w:pPr>
+              <w:spacing w:before="20" w:after="40" w:line="276" w:lineRule="auto"/>
+            </w:pPr>
+            <w:r>
+              <w:rPr>
+                <w:rFonts w:ascii="Arial" w:hAnsi="Arial"/>
+                <w:color w:val="334155"/>
+                <w:sz w:val="19"/>
+              </w:rPr>
+              <w:t xml:space="preserve">  - Phan Đình Duy: Full 9,60% | TTS 8,49% (Hoàn 2.103 đơn Full, 357 đơn TTS)</w:t>
+            </w:r>
+          </w:p>
+          <w:p>
+            <w:pPr>
+              <w:spacing w:before="20" w:after="40" w:line="276" w:lineRule="auto"/>
+            </w:pPr>
+            <w:r>
+              <w:rPr>
+                <w:rFonts w:ascii="Arial" w:hAnsi="Arial"/>
+                <w:color w:val="334155"/>
+                <w:sz w:val="19"/>
+              </w:rPr>
+              <w:t xml:space="preserve">  - Huỳnh Thúc Duân: Full 9,99% | TTS 8,83% (Hoàn 501 đơn Full, 85 đơn TTS)</w:t>
+            </w:r>
+          </w:p>
+          <w:p>
+            <w:pPr>
+              <w:spacing w:before="20" w:after="40" w:line="276" w:lineRule="auto"/>
+            </w:pPr>
+            <w:r>
+              <w:rPr>
+                <w:rFonts w:ascii="Arial" w:hAnsi="Arial"/>
+                <w:color w:val="334155"/>
+                <w:sz w:val="19"/>
+              </w:rPr>
+              <w:t xml:space="preserve">  - Nguyễn Thanh Long: Full 10,01% | TTS 8,84% (Hoàn 1.114 đơn Full, 189 đơn TTS)</w:t>
+            </w:r>
+          </w:p>
+          <w:p>
+            <w:pPr>
+              <w:spacing w:before="20" w:after="40" w:line="276" w:lineRule="auto"/>
+            </w:pPr>
+            <w:r>
+              <w:rPr>
+                <w:rFonts w:ascii="Arial" w:hAnsi="Arial"/>
+                <w:color w:val="334155"/>
+                <w:sz w:val="19"/>
+              </w:rPr>
+              <w:t xml:space="preserve">  - Nguyễn Lê Nguyên Vũ: Full 10,18% | TTS 8,97% (Hoàn 1.123 đơn Full, 190 đơn TTS)</w:t>
             </w:r>
           </w:p>
           <w:p>
@@ -5895,46 +6038,46 @@
                 <w:color w:val="B91C1C"/>
                 <w:sz w:val="19"/>
               </w:rPr>
-              <w:t>• 🔴 TOP 3 AM BÁO ĐỘNG ĐỎ CỰC NẶNG (%FD TRÊN 20% — GẤP GẦN 3 LẦN MỨC BÌNH QUÂN VÙNG!):</w:t>
-            </w:r>
-          </w:p>
-          <w:p>
-            <w:pPr>
-              <w:spacing w:before="20" w:after="40" w:line="276" w:lineRule="auto"/>
-            </w:pPr>
-            <w:r>
-              <w:rPr>
-                <w:rFonts w:ascii="Arial" w:hAnsi="Arial"/>
-                <w:color w:val="334155"/>
-                <w:sz w:val="19"/>
-              </w:rPr>
-              <w:t xml:space="preserve">  1. Trương Quang Linh (Đắk Nông): 22,95% (TTS: 20,19% | Vol 1.656 đơn — hoàn tới 380 đơn!) ➔ Tỷ lệ hoàn trả cao nhất toàn vùng!</w:t>
-            </w:r>
-          </w:p>
-          <w:p>
-            <w:pPr>
-              <w:spacing w:before="20" w:after="40" w:line="276" w:lineRule="auto"/>
-            </w:pPr>
-            <w:r>
-              <w:rPr>
-                <w:rFonts w:ascii="Arial" w:hAnsi="Arial"/>
-                <w:color w:val="334155"/>
-                <w:sz w:val="19"/>
-              </w:rPr>
-              <w:t xml:space="preserve">  2. Lê Minh Lợi (Lâm Đồng): 21,04% (TTS: 18,52% | Vol 2.110 đơn — hoàn 444 đơn!).</w:t>
-            </w:r>
-          </w:p>
-          <w:p>
-            <w:pPr>
-              <w:spacing w:before="20" w:after="40" w:line="276" w:lineRule="auto"/>
-            </w:pPr>
-            <w:r>
-              <w:rPr>
-                <w:rFonts w:ascii="Arial" w:hAnsi="Arial"/>
-                <w:color w:val="334155"/>
-                <w:sz w:val="19"/>
-              </w:rPr>
-              <w:t xml:space="preserve">  3. Phan Nguyễn Yến Nhi (Lâm Đồng): 20,99% (TTS: 18,59% | Vol 3.111 đơn — hoàn tới 653 đơn!).</w:t>
+              <w:t>• 🔴 TOP 3 AM BÁO ĐỘNG ĐỎ CỰC NẶNG (CẢ FULL LẪN TTS ĐỀU VƯỢT TRẦN 18% – 23%!):</w:t>
+            </w:r>
+          </w:p>
+          <w:p>
+            <w:pPr>
+              <w:spacing w:before="20" w:after="40" w:line="276" w:lineRule="auto"/>
+            </w:pPr>
+            <w:r>
+              <w:rPr>
+                <w:rFonts w:ascii="Arial" w:hAnsi="Arial"/>
+                <w:color w:val="334155"/>
+                <w:sz w:val="19"/>
+              </w:rPr>
+              <w:t xml:space="preserve">  1. Trương Quang Linh (Đắk Nông): Full 22,95% | TTS 20,19% (Hoàn 380 đơn Full, 64 đơn TTS) ➔ Đỉnh hoàn trả cao nhất toàn vùng!</w:t>
+            </w:r>
+          </w:p>
+          <w:p>
+            <w:pPr>
+              <w:spacing w:before="20" w:after="40" w:line="276" w:lineRule="auto"/>
+            </w:pPr>
+            <w:r>
+              <w:rPr>
+                <w:rFonts w:ascii="Arial" w:hAnsi="Arial"/>
+                <w:color w:val="334155"/>
+                <w:sz w:val="19"/>
+              </w:rPr>
+              <w:t xml:space="preserve">  2. Lê Minh Lợi (Lâm Đồng): Full 21,04% | TTS 18,52% (Hoàn 444 đơn Full, 75 đơn TTS).</w:t>
+            </w:r>
+          </w:p>
+          <w:p>
+            <w:pPr>
+              <w:spacing w:before="20" w:after="40" w:line="276" w:lineRule="auto"/>
+            </w:pPr>
+            <w:r>
+              <w:rPr>
+                <w:rFonts w:ascii="Arial" w:hAnsi="Arial"/>
+                <w:color w:val="334155"/>
+                <w:sz w:val="19"/>
+              </w:rPr>
+              <w:t xml:space="preserve">  3. Phan Nguyễn Yến Nhi (Lâm Đồng): Full 20,99% | TTS 18,59% (Hoàn 653 đơn Full, 111 đơn TTS).</w:t>
             </w:r>
           </w:p>
           <w:p>
@@ -5960,7 +6103,7 @@
                 <w:color w:val="0F172A"/>
                 <w:sz w:val="20"/>
               </w:rPr>
-              <w:t>📍 3. BẢNG 2: TOP 10 BƯU CỤC ĐIỂM NÓNG CÓ TỶ LỆ HOÀN TRẢ CAO NHẤT VÙNG:</w:t>
+              <w:t>📍 3. BẢNG 2: TOP 10 BƯU CỤC ĐIỂM NÓNG CÓ TỶ LỆ HOÀN TRẢ CAO NHẤT VÙNG (TÍNH THEO TOTAL ĐƠN BƯU CỤC):</w:t>
             </w:r>
           </w:p>
           <w:p>
@@ -6064,20 +6207,20 @@
                 <w:color w:val="334155"/>
                 <w:sz w:val="19"/>
               </w:rPr>
-              <w:t>• 8. (DNO) Tuy Đức: 13,43% (Hoàn 202 / 1.504 đơn | Tăng +2,02%p) | AM Trần Thị Nhung</w:t>
-            </w:r>
-          </w:p>
-          <w:p>
-            <w:pPr>
-              <w:spacing w:before="20" w:after="40" w:line="276" w:lineRule="auto"/>
-            </w:pPr>
-            <w:r>
-              <w:rPr>
-                <w:rFonts w:ascii="Arial" w:hAnsi="Arial"/>
-                <w:color w:val="334155"/>
-                <w:sz w:val="19"/>
-              </w:rPr>
-              <w:t>• 9. (KHO) Nha Trang: 13,17% (Hoàn 696 / 5.283 đơn | Tăng vọt +5,16%p) | AM Phan Đình Duy</w:t>
+              <w:t>• 8. (DNO) Tuy Đức: 13,43% (Hoàn 202 / 1.504 đơn) | AM Trần Thị Nhung</w:t>
+            </w:r>
+          </w:p>
+          <w:p>
+            <w:pPr>
+              <w:spacing w:before="20" w:after="40" w:line="276" w:lineRule="auto"/>
+            </w:pPr>
+            <w:r>
+              <w:rPr>
+                <w:rFonts w:ascii="Arial" w:hAnsi="Arial"/>
+                <w:color w:val="334155"/>
+                <w:sz w:val="19"/>
+              </w:rPr>
+              <w:t>• 9. (KHO) Nha Trang: 13,17% (Hoàn 696 / 5.283 đơn | Tăng +5,16%p) | AM Phan Đình Duy</w:t>
             </w:r>
           </w:p>
           <w:p>
@@ -6130,85 +6273,175 @@
                 <w:color w:val="0F172A"/>
                 <w:sz w:val="19"/>
               </w:rPr>
-              <w:t>"Kính thưa Ban Giám Đốc và toàn thể các anh chị AM,</w:t>
-            </w:r>
-          </w:p>
-          <w:p>
-            <w:pPr>
-              <w:spacing w:before="20" w:after="40" w:line="276" w:lineRule="auto"/>
-            </w:pPr>
-            <w:r>
-              <w:rPr>
-                <w:rFonts w:ascii="Arial" w:hAnsi="Arial"/>
-                <w:color w:val="334155"/>
-                <w:sz w:val="19"/>
-              </w:rPr>
-              <w:t>Bước sang Tab 10 là chỉ số %FD - Tỷ lệ đơn hàng hoàn trả về người gửi:</w:t>
-            </w:r>
-          </w:p>
-          <w:p>
-            <w:pPr>
-              <w:spacing w:before="20" w:after="40" w:line="276" w:lineRule="auto"/>
-            </w:pPr>
-            <w:r>
-              <w:rPr>
-                <w:rFonts w:ascii="Arial" w:hAnsi="Arial"/>
-                <w:color w:val="334155"/>
-                <w:sz w:val="19"/>
-              </w:rPr>
-              <w:t>Trong tất cả các chỉ số vận hành Last-mile, đây là con số gây lãng phí và bào mòn lợi nhuận khủng khiếp nhất: Một đơn hàng giao thất bại phải hoàn trả đồng nghĩa với việc chúng ta tốn gấp đôi chi phí vận tải 2 chiều, mất trắng toàn bộ doanh thu, và khiến chủ shop ức chế quay lưng bỏ sang đối thủ!</w:t>
-            </w:r>
-          </w:p>
-          <w:p>
-            <w:pPr>
-              <w:spacing w:before="20" w:after="40" w:line="276" w:lineRule="auto"/>
-            </w:pPr>
-            <w:r>
-              <w:rPr>
-                <w:rFonts w:ascii="Arial" w:hAnsi="Arial"/>
-                <w:color w:val="334155"/>
-                <w:sz w:val="19"/>
-              </w:rPr>
-              <w:t>Bình quân tuần W40 toàn vùng chúng ta ghi nhận tỷ lệ hoàn trả là 7,77% với gần 24.500 đơn hàng bị trả về.</w:t>
-            </w:r>
-          </w:p>
-          <w:p>
-            <w:pPr>
-              <w:spacing w:before="20" w:after="40" w:line="276" w:lineRule="auto"/>
-            </w:pPr>
-            <w:r>
-              <w:rPr>
-                <w:rFonts w:ascii="Arial" w:hAnsi="Arial"/>
-                <w:color w:val="334155"/>
-                <w:sz w:val="19"/>
-              </w:rPr>
-              <w:t>Trước hết, em xin biểu dương nhóm 6 AM kiểm soát hoàn trả cực kỳ xuất sắc:</w:t>
-            </w:r>
-          </w:p>
-          <w:p>
-            <w:pPr>
-              <w:spacing w:before="20" w:after="40" w:line="276" w:lineRule="auto"/>
-            </w:pPr>
-            <w:r>
-              <w:rPr>
-                <w:rFonts w:ascii="Arial" w:hAnsi="Arial"/>
-                <w:color w:val="334155"/>
-                <w:sz w:val="19"/>
-              </w:rPr>
-              <w:t>Anh Lê Thanh Nhựt ở Bình Thuận: %FD chỉ 5,63% trên quy mô gần 30 ngàn đơn!</w:t>
-            </w:r>
-          </w:p>
-          <w:p>
-            <w:pPr>
-              <w:spacing w:before="20" w:after="40" w:line="276" w:lineRule="auto"/>
-            </w:pPr>
-            <w:r>
-              <w:rPr>
-                <w:rFonts w:ascii="Arial" w:hAnsi="Arial"/>
-                <w:color w:val="334155"/>
-                <w:sz w:val="19"/>
-              </w:rPr>
-              <w:t>Chị Cao Thị Thanh Thủy ở Khánh Hòa chỉ 5,98%, anh Minh Nghĩa ở Lâm Đồng chỉ 5,99%, và anh Nguyễn Duy Long gánh hơn 42 ngàn đơn mà tỷ lệ hoàn chỉ 6,51%!</w:t>
+              <w:t>"Kính thưa Ban Giám Đốc và các anh chị AM,</w:t>
+            </w:r>
+          </w:p>
+          <w:p>
+            <w:pPr>
+              <w:spacing w:before="20" w:after="40" w:line="276" w:lineRule="auto"/>
+            </w:pPr>
+            <w:r>
+              <w:rPr>
+                <w:rFonts w:ascii="Arial" w:hAnsi="Arial"/>
+                <w:color w:val="334155"/>
+                <w:sz w:val="19"/>
+              </w:rPr>
+              <w:t>Bây giờ chúng ta bước sang Tab 10 là chỉ số %FD - Tỷ lệ hoàn trả hàng về người gửi. Trên màn hình Dashboard, các anh chị thấy hệ thống đang bóc tách song song 2 cột: Cột %FD Full hàng và cột %FD TikTok Shop đặt ngay cạnh nhau:</w:t>
+            </w:r>
+          </w:p>
+          <w:p>
+            <w:pPr>
+              <w:spacing w:before="20" w:after="40" w:line="276" w:lineRule="auto"/>
+            </w:pPr>
+            <w:r>
+              <w:rPr>
+                <w:rFonts w:ascii="Arial" w:hAnsi="Arial"/>
+                <w:color w:val="334155"/>
+                <w:sz w:val="19"/>
+              </w:rPr>
+              <w:t>Nhìn vào bình quân toàn vùng:</w:t>
+            </w:r>
+          </w:p>
+          <w:p>
+            <w:pPr>
+              <w:spacing w:before="20" w:after="40" w:line="276" w:lineRule="auto"/>
+            </w:pPr>
+            <w:r>
+              <w:rPr>
+                <w:rFonts w:ascii="Arial" w:hAnsi="Arial"/>
+                <w:color w:val="334155"/>
+                <w:sz w:val="19"/>
+              </w:rPr>
+              <w:t>Full hàng tuần W40 ghi nhận tỷ lệ hoàn trả là 7,77% với gần 24.500 đơn hàng bị trả về.</w:t>
+            </w:r>
+          </w:p>
+          <w:p>
+            <w:pPr>
+              <w:spacing w:before="20" w:after="40" w:line="276" w:lineRule="auto"/>
+            </w:pPr>
+            <w:r>
+              <w:rPr>
+                <w:rFonts w:ascii="Arial" w:hAnsi="Arial"/>
+                <w:color w:val="334155"/>
+                <w:sz w:val="19"/>
+              </w:rPr>
+              <w:t>Riêng phân khúc sàn TikTok Shop kiểm soát tốt hơn ở mức 6,10% với 4.410 đơn bị trả về.</w:t>
+            </w:r>
+          </w:p>
+          <w:p>
+            <w:pPr>
+              <w:spacing w:before="20" w:after="40" w:line="276" w:lineRule="auto"/>
+            </w:pPr>
+            <w:r>
+              <w:rPr>
+                <w:rFonts w:ascii="Arial" w:hAnsi="Arial"/>
+                <w:color w:val="334155"/>
+                <w:sz w:val="19"/>
+              </w:rPr>
+              <w:t>Hàng TikTok Shop tỷ lệ hoàn thấp hơn Full hàng khoảng 1,7%p vì khách đặt qua sàn TMĐT thường có nhu cầu nhận cao hơn đơn hàng ngoài.</w:t>
+            </w:r>
+          </w:p>
+          <w:p>
+            <w:pPr>
+              <w:spacing w:before="20" w:after="40" w:line="276" w:lineRule="auto"/>
+            </w:pPr>
+            <w:r>
+              <w:rPr>
+                <w:rFonts w:ascii="Arial" w:hAnsi="Arial"/>
+                <w:color w:val="334155"/>
+                <w:sz w:val="19"/>
+              </w:rPr>
+              <w:t>Tuy nhiên, dù là hàng sàn hay hàng ngoài, một khi đã bị bấm hoàn trả là chúng ta tốn gấp đôi chi phí xe tải chở đi chở về, mất trắng doanh thu cước, và tạo ra làn sóng khiếu nại gay gắt từ chủ shop!</w:t>
+            </w:r>
+          </w:p>
+          <w:p>
+            <w:pPr>
+              <w:spacing w:before="20" w:after="40" w:line="276" w:lineRule="auto"/>
+            </w:pPr>
+            <w:r>
+              <w:rPr>
+                <w:rFonts w:ascii="Arial" w:hAnsi="Arial"/>
+                <w:color w:val="334155"/>
+                <w:sz w:val="19"/>
+              </w:rPr>
+            </w:r>
+          </w:p>
+          <w:p>
+            <w:pPr>
+              <w:spacing w:before="20" w:after="40" w:line="276" w:lineRule="auto"/>
+            </w:pPr>
+            <w:r>
+              <w:rPr>
+                <w:rFonts w:ascii="Arial" w:hAnsi="Arial"/>
+                <w:color w:val="334155"/>
+                <w:sz w:val="19"/>
+              </w:rPr>
+              <w:t>Nhìn vào Bảng 1 so sánh cả 2 kênh giữa 18 AM, chúng ta thấy sự phân hóa cực kỳ rõ nét:</w:t>
+            </w:r>
+          </w:p>
+          <w:p>
+            <w:pPr>
+              <w:spacing w:before="20" w:after="40" w:line="276" w:lineRule="auto"/>
+            </w:pPr>
+            <w:r>
+              <w:rPr>
+                <w:rFonts w:ascii="Arial" w:hAnsi="Arial"/>
+                <w:color w:val="334155"/>
+                <w:sz w:val="19"/>
+              </w:rPr>
+              <w:t>Ở nhóm làm tốt: Em xin biểu dương 6 AM kiểm soát hoàn trả xuất sắc cả Full lẫn TikTok Shop dưới mốc 7,0%:</w:t>
+            </w:r>
+          </w:p>
+          <w:p>
+            <w:pPr>
+              <w:spacing w:before="20" w:after="40" w:line="276" w:lineRule="auto"/>
+            </w:pPr>
+            <w:r>
+              <w:rPr>
+                <w:rFonts w:ascii="Arial" w:hAnsi="Arial"/>
+                <w:color w:val="334155"/>
+                <w:sz w:val="19"/>
+              </w:rPr>
+              <w:t>Anh Lê Thanh Nhựt ở Bình Thuận tiếp tục là Quán quân toàn vùng: Full hàng chỉ hoàn 5,63%, còn TikTok Shop chỉ hoàn vỏn vẹn 4,97% trên gần 30 ngàn đơn!</w:t>
+            </w:r>
+          </w:p>
+          <w:p>
+            <w:pPr>
+              <w:spacing w:before="20" w:after="40" w:line="276" w:lineRule="auto"/>
+            </w:pPr>
+            <w:r>
+              <w:rPr>
+                <w:rFonts w:ascii="Arial" w:hAnsi="Arial"/>
+                <w:color w:val="334155"/>
+                <w:sz w:val="19"/>
+              </w:rPr>
+              <w:t>Chị Cao Thị Thanh Thủy ở Khánh Hòa: Full 5,98% và TTS 5,27%!</w:t>
+            </w:r>
+          </w:p>
+          <w:p>
+            <w:pPr>
+              <w:spacing w:before="20" w:after="40" w:line="276" w:lineRule="auto"/>
+            </w:pPr>
+            <w:r>
+              <w:rPr>
+                <w:rFonts w:ascii="Arial" w:hAnsi="Arial"/>
+                <w:color w:val="334155"/>
+                <w:sz w:val="19"/>
+              </w:rPr>
+              <w:t>Anh Nguyễn Đỗ Minh Nghĩa ở Lâm Đồng: Full 5,99% và TTS 5,26%!</w:t>
+            </w:r>
+          </w:p>
+          <w:p>
+            <w:pPr>
+              <w:spacing w:before="20" w:after="40" w:line="276" w:lineRule="auto"/>
+            </w:pPr>
+            <w:r>
+              <w:rPr>
+                <w:rFonts w:ascii="Arial" w:hAnsi="Arial"/>
+                <w:color w:val="334155"/>
+                <w:sz w:val="19"/>
+              </w:rPr>
+              <w:t>Và anh Nguyễn Duy Long ở Ninh Thuận: Gánh khối lượng khủng nhất vùng hơn 42 ngàn đơn Full và hơn 8 ngàn đơn TikTok Shop mà tỷ lệ hoàn chỉ 6,51% và 5,76%!</w:t>
             </w:r>
           </w:p>
           <w:p>
@@ -6246,72 +6479,85 @@
                 <w:color w:val="334155"/>
                 <w:sz w:val="19"/>
               </w:rPr>
-              <w:t>TUY NHIÊN, tôi yêu cầu 4 AM: Trương Quang Linh, Lê Minh Lợi, Phan Nguyễn Yến Nhi và Nguyễn Lê Nguyên Vũ nhìn thẳng lên màn hình Bảng 2 giúp tôi:</w:t>
-            </w:r>
-          </w:p>
-          <w:p>
-            <w:pPr>
-              <w:spacing w:before="20" w:after="40" w:line="276" w:lineRule="auto"/>
-            </w:pPr>
-            <w:r>
-              <w:rPr>
-                <w:rFonts w:ascii="Arial" w:hAnsi="Arial"/>
-                <w:color w:val="334155"/>
-                <w:sz w:val="19"/>
-              </w:rPr>
-              <w:t>Các anh chị giải thích thế nào khi tỷ lệ hoàn trả tại 4 bưu cục của các anh chị VƯỢT QUA MỐC 20% — CAO GẤP GẦN 3 LẦN MỨC BÌNH QUÂN VÙNG?</w:t>
-            </w:r>
-          </w:p>
-          <w:p>
-            <w:pPr>
-              <w:spacing w:before="20" w:after="40" w:line="276" w:lineRule="auto"/>
-            </w:pPr>
-            <w:r>
-              <w:rPr>
-                <w:rFonts w:ascii="Arial" w:hAnsi="Arial"/>
-                <w:color w:val="334155"/>
-                <w:sz w:val="19"/>
-              </w:rPr>
-              <w:t>Bưu cục Quảng Tín của anh Linh: 22,95%! Cứ 4 đơn giao thì trả về gần 1 đơn!</w:t>
-            </w:r>
-          </w:p>
-          <w:p>
-            <w:pPr>
-              <w:spacing w:before="20" w:after="40" w:line="276" w:lineRule="auto"/>
-            </w:pPr>
-            <w:r>
-              <w:rPr>
-                <w:rFonts w:ascii="Arial" w:hAnsi="Arial"/>
-                <w:color w:val="334155"/>
-                <w:sz w:val="19"/>
-              </w:rPr>
-              <w:t>Bưu cục Lang Biang - Đà Lạt 1 của anh Lợi: 21,04%, tăng thêm gần 5%p so với tuần trước!</w:t>
-            </w:r>
-          </w:p>
-          <w:p>
-            <w:pPr>
-              <w:spacing w:before="20" w:after="40" w:line="276" w:lineRule="auto"/>
-            </w:pPr>
-            <w:r>
-              <w:rPr>
-                <w:rFonts w:ascii="Arial" w:hAnsi="Arial"/>
-                <w:color w:val="334155"/>
-                <w:sz w:val="19"/>
-              </w:rPr>
-              <w:t>Bưu cục Đơn Dương của chị Yến Nhi: 20,99% với 653 đơn bị trả về, TĂNG SỐC TỚI 11%p CHỈ TRONG 1 TUẦN!</w:t>
-            </w:r>
-          </w:p>
-          <w:p>
-            <w:pPr>
-              <w:spacing w:before="20" w:after="40" w:line="276" w:lineRule="auto"/>
-            </w:pPr>
-            <w:r>
-              <w:rPr>
-                <w:rFonts w:ascii="Arial" w:hAnsi="Arial"/>
-                <w:color w:val="334155"/>
-                <w:sz w:val="19"/>
-              </w:rPr>
-              <w:t>Và bưu cục Đức Trọng 1 của anh Vũ: 20,53%, tăng vọt hơn 8%p!</w:t>
+              <w:t>TUY NHIÊN, tôi yêu cầu 3 AM: Trương Quang Linh, Lê Minh Lợi và Phan Nguyễn Yến Nhi nhìn thẳng vào cột Full và cột TTS của cụm mình:</w:t>
+            </w:r>
+          </w:p>
+          <w:p>
+            <w:pPr>
+              <w:spacing w:before="20" w:after="40" w:line="276" w:lineRule="auto"/>
+            </w:pPr>
+            <w:r>
+              <w:rPr>
+                <w:rFonts w:ascii="Arial" w:hAnsi="Arial"/>
+                <w:color w:val="334155"/>
+                <w:sz w:val="19"/>
+              </w:rPr>
+              <w:t>Dù là Full hàng hay TikTok Shop thì tỷ lệ hoàn trả của 3 anh chị đều vượt ngưỡng 18% đến 23% — cao gấp gần 3 lần mức bình quân của toàn vùng!</w:t>
+            </w:r>
+          </w:p>
+          <w:p>
+            <w:pPr>
+              <w:spacing w:before="20" w:after="40" w:line="276" w:lineRule="auto"/>
+            </w:pPr>
+            <w:r>
+              <w:rPr>
+                <w:rFonts w:ascii="Arial" w:hAnsi="Arial"/>
+                <w:color w:val="334155"/>
+                <w:sz w:val="19"/>
+              </w:rPr>
+              <w:t>- Anh Trương Quang Linh ở Đắk Nông: Full hàng hoàn 22,95%, TikTok Shop hoàn 20,19%!</w:t>
+            </w:r>
+          </w:p>
+          <w:p>
+            <w:pPr>
+              <w:spacing w:before="20" w:after="40" w:line="276" w:lineRule="auto"/>
+            </w:pPr>
+            <w:r>
+              <w:rPr>
+                <w:rFonts w:ascii="Arial" w:hAnsi="Arial"/>
+                <w:color w:val="334155"/>
+                <w:sz w:val="19"/>
+              </w:rPr>
+              <w:t>- Anh Lê Minh Lợi ở Lâm Đồng: Full hàng hoàn 21,04%, TikTok Shop hoàn 18,52%!</w:t>
+            </w:r>
+          </w:p>
+          <w:p>
+            <w:pPr>
+              <w:spacing w:before="20" w:after="40" w:line="276" w:lineRule="auto"/>
+            </w:pPr>
+            <w:r>
+              <w:rPr>
+                <w:rFonts w:ascii="Arial" w:hAnsi="Arial"/>
+                <w:color w:val="334155"/>
+                <w:sz w:val="19"/>
+              </w:rPr>
+              <w:t>- Chị Phan Nguyễn Yến Nhi ở Lâm Đồng: Full hàng hoàn 20,99%, TikTok Shop hoàn 18,59%!</w:t>
+            </w:r>
+          </w:p>
+          <w:p>
+            <w:pPr>
+              <w:spacing w:before="20" w:after="40" w:line="276" w:lineRule="auto"/>
+            </w:pPr>
+            <w:r>
+              <w:rPr>
+                <w:rFonts w:ascii="Arial" w:hAnsi="Arial"/>
+                <w:color w:val="334155"/>
+                <w:sz w:val="19"/>
+              </w:rPr>
+              <w:t>Cứ 5 kiện hàng gửi về Đơn Dương, Lang Biang, Quảng Tín thì bị trả ngược về kho tới 1 kiện!</w:t>
+            </w:r>
+          </w:p>
+          <w:p>
+            <w:pPr>
+              <w:spacing w:before="20" w:after="40" w:line="276" w:lineRule="auto"/>
+            </w:pPr>
+            <w:r>
+              <w:rPr>
+                <w:rFonts w:ascii="Arial" w:hAnsi="Arial"/>
+                <w:color w:val="334155"/>
+                <w:sz w:val="19"/>
+              </w:rPr>
+              <w:t>Nhìn xuống Bảng 2 Top bưu cục: Bưu cục Đơn Dương của chị Nhi tăng sốc tới +11%p hoàn trả chỉ trong 1 tuần (hoàn 653 đơn), bưu cục Đức Trọng 1 của anh Vũ cũng tăng vọt +8,2%p lên 20,53%!</w:t>
             </w:r>
           </w:p>
           <w:p>
@@ -6337,111 +6583,98 @@
                 <w:color w:val="0F172A"/>
                 <w:sz w:val="20"/>
               </w:rPr>
-              <w:t>🔍 INSIGHT BẢN CHẤT &amp; BÓC TRẦN CHIÊU TRÒ HIỆN TRƯỜNG:</w:t>
-            </w:r>
-          </w:p>
-          <w:p>
-            <w:pPr>
-              <w:spacing w:before="20" w:after="40" w:line="276" w:lineRule="auto"/>
-            </w:pPr>
-            <w:r>
-              <w:rPr>
-                <w:rFonts w:ascii="Arial" w:hAnsi="Arial"/>
-                <w:color w:val="334155"/>
-                <w:sz w:val="19"/>
-              </w:rPr>
-              <w:t>Tại sao tỷ lệ hoàn trả ở 4 bưu cục này lại tăng vọt bất thường như vậy?</w:t>
-            </w:r>
-          </w:p>
-          <w:p>
-            <w:pPr>
-              <w:spacing w:before="20" w:after="40" w:line="276" w:lineRule="auto"/>
-            </w:pPr>
-            <w:r>
-              <w:rPr>
-                <w:rFonts w:ascii="Arial" w:hAnsi="Arial"/>
-                <w:color w:val="334155"/>
-                <w:sz w:val="19"/>
-              </w:rPr>
-              <w:t>Qua kiểm tra dữ liệu đối soát thực tế, tôi chỉ ra 3 nguyên nhân cốt tử:</w:t>
-            </w:r>
-          </w:p>
-          <w:p>
-            <w:pPr>
-              <w:spacing w:before="20" w:after="40" w:line="276" w:lineRule="auto"/>
-            </w:pPr>
-            <w:r>
-              <w:rPr>
-                <w:rFonts w:ascii="Arial" w:hAnsi="Arial"/>
-                <w:color w:val="334155"/>
-                <w:sz w:val="19"/>
-              </w:rPr>
-              <w:t>1. NGUYÊN NHÂN THỨ NHẤT: CHIÊU TRÒ 'BẤM HOÀN TRẢ KHỐNG ĐỂ XẢ TỒN BƯU CỤC':</w:t>
-            </w:r>
-          </w:p>
-          <w:p>
-            <w:pPr>
-              <w:spacing w:before="20" w:after="40" w:line="276" w:lineRule="auto"/>
-            </w:pPr>
-            <w:r>
-              <w:rPr>
-                <w:rFonts w:ascii="Arial" w:hAnsi="Arial"/>
-                <w:color w:val="334155"/>
-                <w:sz w:val="19"/>
-              </w:rPr>
-              <w:t>Bưu cục Đơn Dương và Đức Trọng 1 tuần vừa qua dính lượng hàng tồn Aging quá lớn (hơn 1.200 đơn backlog). Trưởng bưu cục bị dí KPI tồn kho, bị nhắc nhở giải tỏa, bèn chọn con đường tắt tiêu cực: Cho nhân viên và bưu tá đồng loạt quét duyệt hoàn trả hàng loạt đơn tồn lưu cữu với lý do 'Khách từ chối nhận' để đẩy hàng lên xe tải KTC trả về kho trung tâm nhằm 'làm sạch kho' trên hệ thống!</w:t>
-            </w:r>
-          </w:p>
-          <w:p>
-            <w:pPr>
-              <w:spacing w:before="20" w:after="40" w:line="276" w:lineRule="auto"/>
-            </w:pPr>
-            <w:r>
-              <w:rPr>
-                <w:rFonts w:ascii="Arial" w:hAnsi="Arial"/>
-                <w:color w:val="334155"/>
-                <w:sz w:val="19"/>
-              </w:rPr>
-              <w:t>Đây là hành vi đối phó số liệu cực kỳ nghiêm trọng, biến áp lực tồn kho của bưu cục thành thiệt hại tiền cước và mất uy tín của công ty!</w:t>
-            </w:r>
-          </w:p>
-          <w:p>
-            <w:pPr>
-              <w:spacing w:before="20" w:after="40" w:line="276" w:lineRule="auto"/>
-            </w:pPr>
-            <w:r>
-              <w:rPr>
-                <w:rFonts w:ascii="Arial" w:hAnsi="Arial"/>
-                <w:color w:val="334155"/>
-                <w:sz w:val="19"/>
-              </w:rPr>
-              <w:t>2. NGUYÊN NHÂN THỨ HAI: HỆ LỤY CỦA GIAO TRỄ ODR VÙNG NÚI:</w:t>
-            </w:r>
-          </w:p>
-          <w:p>
-            <w:pPr>
-              <w:spacing w:before="20" w:after="40" w:line="276" w:lineRule="auto"/>
-            </w:pPr>
-            <w:r>
-              <w:rPr>
-                <w:rFonts w:ascii="Arial" w:hAnsi="Arial"/>
-                <w:color w:val="334155"/>
-                <w:sz w:val="19"/>
-              </w:rPr>
-              <w:t>Như chúng ta vừa mổ xẻ ở Tab 6, ODR hàng TikTok Shop tại Lang Biang của anh Lợi chỉ có 14%, tại Quảng Tín của anh Linh chỉ có 42%. Khách hàng đặt mua món đồ trên mạng, hẹn 2 ngày giao nhưng shipper ngâm tới ngày thứ 5 mới mang tới. Lúc đó khách hàng họ đã đi mua ngoài chợ hoặc không còn nhu cầu nữa, nên họ từ chối nhận hàng thẳng thừng! Giao trễ chính là nguyên nhân trực tiếp đẻ ra hoàn trả!</w:t>
-            </w:r>
-          </w:p>
-          <w:p>
-            <w:pPr>
-              <w:spacing w:before="20" w:after="40" w:line="276" w:lineRule="auto"/>
-            </w:pPr>
-            <w:r>
-              <w:rPr>
-                <w:rFonts w:ascii="Arial" w:hAnsi="Arial"/>
-                <w:color w:val="334155"/>
-                <w:sz w:val="19"/>
-              </w:rPr>
-              <w:t>3. NGUYÊN NHÂN THỨ BA: SHIPPER NÉ TUYẾN ĐỒI NÚI ĐƯỜNG ĐẤT SÌNH LẦY:</w:t>
+              <w:t>🔍 INSIGHT BẢN CHẤT &amp; BÓC TÁCH NGUYÊN NHÂN CẢ 2 KÊNH:</w:t>
+            </w:r>
+          </w:p>
+          <w:p>
+            <w:pPr>
+              <w:spacing w:before="20" w:after="40" w:line="276" w:lineRule="auto"/>
+            </w:pPr>
+            <w:r>
+              <w:rPr>
+                <w:rFonts w:ascii="Arial" w:hAnsi="Arial"/>
+                <w:color w:val="334155"/>
+                <w:sz w:val="19"/>
+              </w:rPr>
+              <w:t>Tại sao tỷ lệ hoàn trả của cả hàng Full lẫn hàng sàn TTS ở 3 cụm này lại cao bất thường như vậy?</w:t>
+            </w:r>
+          </w:p>
+          <w:p>
+            <w:pPr>
+              <w:spacing w:before="20" w:after="40" w:line="276" w:lineRule="auto"/>
+            </w:pPr>
+            <w:r>
+              <w:rPr>
+                <w:rFonts w:ascii="Arial" w:hAnsi="Arial"/>
+                <w:color w:val="334155"/>
+                <w:sz w:val="19"/>
+              </w:rPr>
+              <w:t>Bóc tách ra có 3 nguyên nhân cốt tử:</w:t>
+            </w:r>
+          </w:p>
+          <w:p>
+            <w:pPr>
+              <w:spacing w:before="20" w:after="40" w:line="276" w:lineRule="auto"/>
+            </w:pPr>
+            <w:r>
+              <w:rPr>
+                <w:rFonts w:ascii="Arial" w:hAnsi="Arial"/>
+                <w:color w:val="334155"/>
+                <w:sz w:val="19"/>
+              </w:rPr>
+              <w:t>1. ĐỐI VỚI HÀNG TIKTOK SHOP: NGUYÊN NHÂN TRỰC TIẾP LÀ DO GIAO TRỄ ODR!</w:t>
+            </w:r>
+          </w:p>
+          <w:p>
+            <w:pPr>
+              <w:spacing w:before="20" w:after="40" w:line="276" w:lineRule="auto"/>
+            </w:pPr>
+            <w:r>
+              <w:rPr>
+                <w:rFonts w:ascii="Arial" w:hAnsi="Arial"/>
+                <w:color w:val="334155"/>
+                <w:sz w:val="19"/>
+              </w:rPr>
+              <w:t>Như chúng ta vừa thấy ở Tab 6, ODR TikTok Shop tại Lang Biang của anh Lợi chỉ có 14%, tại Đơn Dương của chị Nhi chỉ có 44%. Khách hàng mua hàng xem livestream trên TikTok tâm lý họ muốn nhận ngay trong 1-2 ngày. Nhưng bưu tá ngâm hàng 4-5 ngày mới mang tới, lúc đó khách hết hứng thú hoặc đã mua món khác nên họ từ chối nhận hàng thẳng thừng! Giao trễ chính là nguyên nhân trực tiếp đẻ ra hoàn trả trên sàn TMĐT!</w:t>
+            </w:r>
+          </w:p>
+          <w:p>
+            <w:pPr>
+              <w:spacing w:before="20" w:after="40" w:line="276" w:lineRule="auto"/>
+            </w:pPr>
+            <w:r>
+              <w:rPr>
+                <w:rFonts w:ascii="Arial" w:hAnsi="Arial"/>
+                <w:color w:val="334155"/>
+                <w:sz w:val="19"/>
+              </w:rPr>
+              <w:t>2. ĐỐI VỚI FULL HÀNG: CHIÊU TRÒ 'BẤM HOÀN TRẢ KHỐNG ĐỂ XẢ TỒN BƯU CỤC':</w:t>
+            </w:r>
+          </w:p>
+          <w:p>
+            <w:pPr>
+              <w:spacing w:before="20" w:after="40" w:line="276" w:lineRule="auto"/>
+            </w:pPr>
+            <w:r>
+              <w:rPr>
+                <w:rFonts w:ascii="Arial" w:hAnsi="Arial"/>
+                <w:color w:val="334155"/>
+                <w:sz w:val="19"/>
+              </w:rPr>
+              <w:t>Bưu cục Đơn Dương và Đức Trọng 1 tuần vừa qua dính lượng hàng tồn Aging quá lớn (hơn 1.200 đơn backlog). Trưởng bưu cục bị dí KPI tồn kho, bị nhắc nhở giải tỏa, bèn chọn con đường tắt tiêu cực: Cho nhân viên và bưu tá đồng loạt quét duyệt hoàn trả hàng loạt đơn tồn lưu cữu với lý do 'Khách từ chối nhận' để đẩy hàng lên xe tải KTC trả về kho trung tâm nhằm 'làm sạch kho' trên hệ thống! Đây là hành vi đối phó số liệu cực kỳ nghiêm trọng, biến áp lực tồn kho của bưu cục thành thiệt hại tiền cước và mất uy tín của công ty!</w:t>
+            </w:r>
+          </w:p>
+          <w:p>
+            <w:pPr>
+              <w:spacing w:before="20" w:after="40" w:line="276" w:lineRule="auto"/>
+            </w:pPr>
+            <w:r>
+              <w:rPr>
+                <w:rFonts w:ascii="Arial" w:hAnsi="Arial"/>
+                <w:color w:val="334155"/>
+                <w:sz w:val="19"/>
+              </w:rPr>
+              <w:t>3. NGUYÊN NHÂN VẬN HÀNH CHUNG: SHIPPER NÉ TUYẾN ĐỒI NÚI ĐƯỜNG ĐẤT SÌNH LẦY:</w:t>
             </w:r>
           </w:p>
           <w:p>
@@ -6493,7 +6726,7 @@
                 <w:color w:val="334155"/>
                 <w:sz w:val="19"/>
               </w:rPr>
-              <w:t>1. THIẾT LẬP NGAY QUY TRÌNH 3 BƯỚC PHÊ DUYỆT HOÀN TRẢ TẠI 4 BƯU CỤC ĐIỂM NÓNG:</w:t>
+              <w:t>1. THIẾT LẬP NGAY QUY TRÌNH 3 BƯỚC PHÊ DUYỆT HOÀN TRẢ (ÁP DỤNG CHO CẢ FULL VÀ TTS):</w:t>
             </w:r>
           </w:p>
           <w:p>
@@ -6545,20 +6778,20 @@
                 <w:color w:val="334155"/>
                 <w:sz w:val="19"/>
               </w:rPr>
-              <w:t>2. Bố trí chuyến giao bù ca chiều tối đối với các đơn khách hẹn lùi ngày, tận dụng khung giờ khách ở nhà để cứu vãn đơn hàng.</w:t>
-            </w:r>
-          </w:p>
-          <w:p>
-            <w:pPr>
-              <w:spacing w:before="20" w:after="40" w:line="276" w:lineRule="auto"/>
-            </w:pPr>
-            <w:r>
-              <w:rPr>
-                <w:rFonts w:ascii="Arial" w:hAnsi="Arial"/>
-                <w:color w:val="334155"/>
-                <w:sz w:val="19"/>
-              </w:rPr>
-              <w:t>3. GIAO CHỈ TIÊU TUẦN W41: Anh Linh, anh Lợi, chị Nhi, anh Vũ bắt buộc phải kéo tỷ lệ %FD của Quảng Tín, Lang Biang, Đơn Dương, Đức Trọng 1 từ trên 20% xuống dưới mốc 12%!</w:t>
+              <w:t>2. Đối với đơn TikTok Shop: Bắt buộc shipper đi phát trong ngày đầu tiên khi hàng về kho, cấm ngâm đơn quá 24h để chặn đứng nguy cơ khách hủy đơn vì giao trễ.</w:t>
+            </w:r>
+          </w:p>
+          <w:p>
+            <w:pPr>
+              <w:spacing w:before="20" w:after="40" w:line="276" w:lineRule="auto"/>
+            </w:pPr>
+            <w:r>
+              <w:rPr>
+                <w:rFonts w:ascii="Arial" w:hAnsi="Arial"/>
+                <w:color w:val="334155"/>
+                <w:sz w:val="19"/>
+              </w:rPr>
+              <w:t>3. GIAO CHỈ TIÊU TUẦN W41: Anh Linh, anh Lợi, chị Nhi, anh Vũ bắt buộc phải kéo tỷ lệ %FD Full xuống dưới 12% và %FD TikTok Shop xuống dưới 8,0%!</w:t>
             </w:r>
           </w:p>
           <w:p>

</xml_diff>

<commit_message>
feat: upgrade Tab 13 QR COD and Tab 14 Truy Thu with executive depth and fraud root-cause analysis
</commit_message>
<xml_diff>
--- a/KICH_BAN_THUYET_TRINH_W40_MOI.docx
+++ b/KICH_BAN_THUYET_TRINH_W40_MOI.docx
@@ -7512,6 +7512,7 @@
             <w:shd w:fill="F1F5F9"/>
             <w:shd w:fill="F1F5F9"/>
             <w:shd w:fill="F1F5F9"/>
+            <w:shd w:fill="F1F5F9"/>
           </w:tcPr>
           <w:p>
             <w:pPr>
@@ -7524,7 +7525,7 @@
                 <w:color w:val="0F172A"/>
                 <w:sz w:val="24"/>
               </w:rPr>
-              <w:t>TAB 13: 🗣️ BÁO CÁO COD – QUẢN TRỊ DÒNG TIỀN &amp; TỶ LỆ NỘP BẰNG QR CODE (BẬT TAB 13 DASHBOARD):</w:t>
+              <w:t>TAB 13: 🗣️ PHÂN TÍCH QUẢN TRỊ DÒNG TIỀN COD (77.5 TỶ) &amp; CHUYỂN ĐỔI SỐ THANH TOÁN QR CODE (BẬT TAB 13 DASHBOARD):</w:t>
             </w:r>
           </w:p>
           <w:p>
@@ -7538,59 +7539,59 @@
                 <w:color w:val="0F172A"/>
                 <w:sz w:val="20"/>
               </w:rPr>
-              <w:t>📍 1. BẢNG 1: TỔNG QUAN DÒNG TIỀN COD TOÀN VÙNG (W40 vs W39):</w:t>
-            </w:r>
-          </w:p>
-          <w:p>
-            <w:pPr>
-              <w:spacing w:before="20" w:after="40" w:line="276" w:lineRule="auto"/>
-            </w:pPr>
-            <w:r>
-              <w:rPr>
-                <w:rFonts w:ascii="Arial" w:hAnsi="Arial"/>
-                <w:color w:val="334155"/>
-                <w:sz w:val="19"/>
-              </w:rPr>
-              <w:t>• Tổng COD thu hộ toàn vùng tuần W40: 77.502,0 Triệu VNĐ (~77,5 Tỷ đồng, giảm -3.231,6 Tr ₫ do sản lượng giảm nhẹ).</w:t>
-            </w:r>
-          </w:p>
-          <w:p>
-            <w:pPr>
-              <w:spacing w:before="20" w:after="40" w:line="276" w:lineRule="auto"/>
-            </w:pPr>
-            <w:r>
-              <w:rPr>
-                <w:rFonts w:ascii="Arial" w:hAnsi="Arial"/>
-                <w:color w:val="334155"/>
-                <w:sz w:val="19"/>
-              </w:rPr>
-              <w:t>• Tiền mặt thu về: 31.276,0 Triệu VNĐ (chiếm tỷ lệ 40,4% tiền mặt).</w:t>
-            </w:r>
-          </w:p>
-          <w:p>
-            <w:pPr>
-              <w:spacing w:before="20" w:after="40" w:line="276" w:lineRule="auto"/>
-            </w:pPr>
-            <w:r>
-              <w:rPr>
-                <w:rFonts w:ascii="Arial" w:hAnsi="Arial"/>
-                <w:color w:val="334155"/>
-                <w:sz w:val="19"/>
-              </w:rPr>
-              <w:t>• Chuyển khoản QR thu về: 46.226,0 Triệu VNĐ (chiếm tỷ lệ 59,6% chuyển khoản).</w:t>
-            </w:r>
-          </w:p>
-          <w:p>
-            <w:pPr>
-              <w:spacing w:before="20" w:after="40" w:line="276" w:lineRule="auto"/>
-            </w:pPr>
-            <w:r>
-              <w:rPr>
-                <w:rFonts w:ascii="Arial" w:hAnsi="Arial"/>
-                <w:color w:val="334155"/>
-                <w:sz w:val="19"/>
-              </w:rPr>
-              <w:t>• Đánh giá biến động: Tỷ lệ tiền mặt tăng nhẹ +0,2%p so với mức 40,1% của tuần W39 (Xu hướng Xấu đi ⚠️).</w:t>
+              <w:t>📍 1. BẢNG 1: TỔNG QUAN DÒNG TIỀN COD TOÀN VÙNG (W39 VS W40):</w:t>
+            </w:r>
+          </w:p>
+          <w:p>
+            <w:pPr>
+              <w:spacing w:before="20" w:after="40" w:line="276" w:lineRule="auto"/>
+            </w:pPr>
+            <w:r>
+              <w:rPr>
+                <w:rFonts w:ascii="Arial" w:hAnsi="Arial"/>
+                <w:color w:val="334155"/>
+                <w:sz w:val="19"/>
+              </w:rPr>
+              <w:t>• Tổng COD thu hộ toàn vùng tuần W40: 77.502,0 Triệu VNĐ (~77,5 Tỷ đồng, giảm -3.231,6 Tr ₫ / -4,0% do volume giảm nhẹ).</w:t>
+            </w:r>
+          </w:p>
+          <w:p>
+            <w:pPr>
+              <w:spacing w:before="20" w:after="40" w:line="276" w:lineRule="auto"/>
+            </w:pPr>
+            <w:r>
+              <w:rPr>
+                <w:rFonts w:ascii="Arial" w:hAnsi="Arial"/>
+                <w:color w:val="334155"/>
+                <w:sz w:val="19"/>
+              </w:rPr>
+              <w:t>• Tiền mặt thu về: 31.276,0 Triệu VNĐ (chiếm tỷ lệ 40,4% tiền mặt | Giảm -1.128,7 Tr ₫).</w:t>
+            </w:r>
+          </w:p>
+          <w:p>
+            <w:pPr>
+              <w:spacing w:before="20" w:after="40" w:line="276" w:lineRule="auto"/>
+            </w:pPr>
+            <w:r>
+              <w:rPr>
+                <w:rFonts w:ascii="Arial" w:hAnsi="Arial"/>
+                <w:color w:val="334155"/>
+                <w:sz w:val="19"/>
+              </w:rPr>
+              <w:t>• Chuyển khoản QR thu về: 46.226,0 Triệu VNĐ (chiếm tỷ lệ 59,6% chuyển khoản QR | Giảm -2.103,0 Tr ₫).</w:t>
+            </w:r>
+          </w:p>
+          <w:p>
+            <w:pPr>
+              <w:spacing w:before="20" w:after="40" w:line="276" w:lineRule="auto"/>
+            </w:pPr>
+            <w:r>
+              <w:rPr>
+                <w:rFonts w:ascii="Arial" w:hAnsi="Arial"/>
+                <w:color w:val="334155"/>
+                <w:sz w:val="19"/>
+              </w:rPr>
+              <w:t>• Đánh giá biến động: Tỷ lệ tiền mặt tăng nhẹ +0,2%p (từ 40,1% lên 40,4%), chuyển khoản QR giảm nhẹ -0,2%p ➔ XU HƯỚNG ĐANG XẤU ĐI ⚠️!</w:t>
             </w:r>
           </w:p>
           <w:p>
@@ -7616,46 +7617,99 @@
                 <w:color w:val="0F172A"/>
                 <w:sz w:val="20"/>
               </w:rPr>
-              <w:t>📍 2. BẢNG 2: SO SÁNH TỶ LỆ TIỀN MẶT THEO 18 AM (TARGET TIỀN MẶT &lt; 40%, QR &gt; 60%):</w:t>
-            </w:r>
-          </w:p>
-          <w:p>
-            <w:pPr>
-              <w:spacing w:before="20" w:after="40" w:line="276" w:lineRule="auto"/>
-            </w:pPr>
-            <w:r>
-              <w:rPr>
-                <w:rFonts w:ascii="Arial" w:hAnsi="Arial"/>
-                <w:color w:val="334155"/>
-                <w:sz w:val="19"/>
-              </w:rPr>
-              <w:t>• Quán quân thu COD bằng QR xuất sắc nhất toàn vùng:</w:t>
-            </w:r>
-          </w:p>
-          <w:p>
-            <w:pPr>
-              <w:spacing w:before="20" w:after="40" w:line="276" w:lineRule="auto"/>
-            </w:pPr>
-            <w:r>
-              <w:rPr>
-                <w:rFonts w:ascii="Arial" w:hAnsi="Arial"/>
-                <w:color w:val="334155"/>
-                <w:sz w:val="19"/>
-              </w:rPr>
-              <w:t xml:space="preserve">  1. Thái Thị Thanh Thư (Khánh Hòa): Tiền mặt chỉ 4,0% ➔ Tỷ lệ chuyển khoản QR đạt tới 96,0%! (Thu hơn 9 Tỷ COD mà chỉ cầm 360 triệu tiền mặt, số hóa dòng tiền gần như tuyệt đối!).</w:t>
-            </w:r>
-          </w:p>
-          <w:p>
-            <w:pPr>
-              <w:spacing w:before="20" w:after="40" w:line="276" w:lineRule="auto"/>
-            </w:pPr>
-            <w:r>
-              <w:rPr>
-                <w:rFonts w:ascii="Arial" w:hAnsi="Arial"/>
-                <w:color w:val="334155"/>
-                <w:sz w:val="19"/>
-              </w:rPr>
-              <w:t xml:space="preserve">  2. Cao Thị Thanh Thủy (Khánh Hòa): Tiền mặt 16,1% ➔ Tỷ lệ QR đạt 83,9%!</w:t>
+              <w:t>📍 2. BẢNG 2: SO SÁNH TỶ LỆ TIỀN MẶT THEO 18 AM (TARGET TIỀN MẶT &lt; 40.0%, QR &gt; 60.0%):</w:t>
+            </w:r>
+          </w:p>
+          <w:p>
+            <w:pPr>
+              <w:spacing w:before="20" w:after="40" w:line="276" w:lineRule="auto"/>
+            </w:pPr>
+            <w:r>
+              <w:rPr>
+                <w:rFonts w:ascii="Arial" w:hAnsi="Arial"/>
+                <w:b/>
+                <w:color w:val="166534"/>
+                <w:sz w:val="19"/>
+              </w:rPr>
+              <w:t>• 🟢 TOP AM CHUYỂN ĐỔI SỐ DÒNG TIỀN XUẤT SẮC NHẤT VÙNG (QR &gt; 70%, TIỀN MẶT RẤT THẤP):</w:t>
+            </w:r>
+          </w:p>
+          <w:p>
+            <w:pPr>
+              <w:spacing w:before="20" w:after="40" w:line="276" w:lineRule="auto"/>
+            </w:pPr>
+            <w:r>
+              <w:rPr>
+                <w:rFonts w:ascii="Arial" w:hAnsi="Arial"/>
+                <w:color w:val="334155"/>
+                <w:sz w:val="19"/>
+              </w:rPr>
+              <w:t xml:space="preserve">  1. Thái Thị Thanh Thư (Khánh Hòa): Tiền mặt chỉ 4,0% (W39: 4,4%) ➔ TỶ LỆ QR ĐẠT TỚI 96,0%! (Thu hơn 9 Tỷ COD mà tiền mặt chỉ có 360 triệu, số hóa dòng tiền gần như tuyệt đối!).</w:t>
+            </w:r>
+          </w:p>
+          <w:p>
+            <w:pPr>
+              <w:spacing w:before="20" w:after="40" w:line="276" w:lineRule="auto"/>
+            </w:pPr>
+            <w:r>
+              <w:rPr>
+                <w:rFonts w:ascii="Arial" w:hAnsi="Arial"/>
+                <w:color w:val="334155"/>
+                <w:sz w:val="19"/>
+              </w:rPr>
+              <w:t xml:space="preserve">  2. Cao Thị Thanh Thủy (Khánh Hòa): Tiền mặt 16,1% (giảm -3,6%p) ➔ QR đạt 83,9%!</w:t>
+            </w:r>
+          </w:p>
+          <w:p>
+            <w:pPr>
+              <w:spacing w:before="20" w:after="40" w:line="276" w:lineRule="auto"/>
+            </w:pPr>
+            <w:r>
+              <w:rPr>
+                <w:rFonts w:ascii="Arial" w:hAnsi="Arial"/>
+                <w:color w:val="334155"/>
+                <w:sz w:val="19"/>
+              </w:rPr>
+              <w:t xml:space="preserve">  3. Nguyễn Duy Long (Ninh Thuận): Tiền mặt 23,4% ➔ QR đạt 76,6% (trên quy mô thu COD cực lớn).</w:t>
+            </w:r>
+          </w:p>
+          <w:p>
+            <w:pPr>
+              <w:spacing w:before="20" w:after="40" w:line="276" w:lineRule="auto"/>
+            </w:pPr>
+            <w:r>
+              <w:rPr>
+                <w:rFonts w:ascii="Arial" w:hAnsi="Arial"/>
+                <w:color w:val="334155"/>
+                <w:sz w:val="19"/>
+              </w:rPr>
+              <w:t xml:space="preserve">  4. Nguyễn Ngọc Khánh (Bình Thuận): Tiền mặt 30,6% ➔ QR đạt 69,4%.</w:t>
+            </w:r>
+          </w:p>
+          <w:p>
+            <w:pPr>
+              <w:spacing w:before="20" w:after="40" w:line="276" w:lineRule="auto"/>
+            </w:pPr>
+            <w:r>
+              <w:rPr>
+                <w:rFonts w:ascii="Arial" w:hAnsi="Arial"/>
+                <w:color w:val="334155"/>
+                <w:sz w:val="19"/>
+              </w:rPr>
+              <w:t xml:space="preserve">  5. Nguyễn Thanh Long (Khánh Hòa): Tiền mặt 30,7% ➔ QR đạt 69,3%.</w:t>
+            </w:r>
+          </w:p>
+          <w:p>
+            <w:pPr>
+              <w:spacing w:before="20" w:after="40" w:line="276" w:lineRule="auto"/>
+            </w:pPr>
+            <w:r>
+              <w:rPr>
+                <w:rFonts w:ascii="Arial" w:hAnsi="Arial"/>
+                <w:color w:val="334155"/>
+                <w:sz w:val="19"/>
+              </w:rPr>
+              <w:t xml:space="preserve">  6. Phan Đình Duy (Khánh Hòa): Tiền mặt 34,2% ➔ QR đạt 65,8%.</w:t>
             </w:r>
           </w:p>
           <w:p>
@@ -7669,228 +7723,111 @@
                 <w:color w:val="B91C1C"/>
                 <w:sz w:val="19"/>
               </w:rPr>
-              <w:t>• 3 AM BÁO ĐỘNG ĐỎ VỀ NGUY CƠ THẤT THOÁT TIỀN MẶT (TỶ LỆ TIỀN MẶT TRÊN 75%):</w:t>
-            </w:r>
-          </w:p>
-          <w:p>
-            <w:pPr>
-              <w:spacing w:before="20" w:after="40" w:line="276" w:lineRule="auto"/>
-            </w:pPr>
-            <w:r>
-              <w:rPr>
-                <w:rFonts w:ascii="Arial" w:hAnsi="Arial"/>
-                <w:color w:val="334155"/>
-                <w:sz w:val="19"/>
-              </w:rPr>
-              <w:t xml:space="preserve">  1. Huỳnh Thúc Duân: 81,0% Tiền mặt! (W39: 71,5%, tăng vọt +9,5%p ➔ CỰC KỲ NGUY HIỂM)</w:t>
-            </w:r>
-          </w:p>
-          <w:p>
-            <w:pPr>
-              <w:spacing w:before="20" w:after="40" w:line="276" w:lineRule="auto"/>
-            </w:pPr>
-            <w:r>
-              <w:rPr>
-                <w:rFonts w:ascii="Arial" w:hAnsi="Arial"/>
-                <w:color w:val="334155"/>
-                <w:sz w:val="19"/>
-              </w:rPr>
-              <w:t xml:space="preserve">  2. Lê Thanh Nhựt: 80,4% Tiền mặt! (W39: 77,7%, tăng +2,7%p)</w:t>
-            </w:r>
-          </w:p>
-          <w:p>
-            <w:pPr>
-              <w:spacing w:before="20" w:after="40" w:line="276" w:lineRule="auto"/>
-            </w:pPr>
-            <w:r>
-              <w:rPr>
-                <w:rFonts w:ascii="Arial" w:hAnsi="Arial"/>
-                <w:color w:val="334155"/>
-                <w:sz w:val="19"/>
-              </w:rPr>
-              <w:t xml:space="preserve">  3. Huỳnh Thị Kim Chi: 75,8% Tiền mặt! (W39: 68,6%, tăng vọt +7,2%p)</w:t>
-            </w:r>
-          </w:p>
-          <w:p>
-            <w:pPr>
-              <w:spacing w:before="20" w:after="40" w:line="276" w:lineRule="auto"/>
-            </w:pPr>
-            <w:r>
-              <w:rPr>
-                <w:rFonts w:ascii="Arial" w:hAnsi="Arial"/>
-                <w:color w:val="334155"/>
-                <w:sz w:val="19"/>
-              </w:rPr>
-            </w:r>
-          </w:p>
-          <w:p>
-            <w:pPr>
-              <w:spacing w:before="20" w:after="40" w:line="276" w:lineRule="auto"/>
-            </w:pPr>
-            <w:r>
-              <w:rPr>
-                <w:rFonts w:ascii="Arial" w:hAnsi="Arial"/>
-                <w:i/>
-                <w:color w:val="0F172A"/>
-                <w:sz w:val="19"/>
-              </w:rPr>
-              <w:t>🎙️ LỜI THOẠI THUYẾT TRÌNH TỰ NHIÊN (KHI BẬT TAB 13 DASHBOARD COD &amp; QR CODE):</w:t>
-            </w:r>
-          </w:p>
-          <w:p>
-            <w:pPr>
-              <w:spacing w:before="20" w:after="40" w:line="276" w:lineRule="auto"/>
-            </w:pPr>
-            <w:r>
-              <w:rPr>
-                <w:rFonts w:ascii="Arial" w:hAnsi="Arial"/>
-                <w:i/>
-                <w:color w:val="0F172A"/>
-                <w:sz w:val="19"/>
-              </w:rPr>
-              <w:t>"Kính thưa Ban Giám Đốc, chuyển sang Tab 13 là Báo cáo Quản trị dòng tiền COD và thanh toán QR Code:</w:t>
-            </w:r>
-          </w:p>
-          <w:p>
-            <w:pPr>
-              <w:spacing w:before="20" w:after="40" w:line="276" w:lineRule="auto"/>
-            </w:pPr>
-            <w:r>
-              <w:rPr>
-                <w:rFonts w:ascii="Arial" w:hAnsi="Arial"/>
-                <w:color w:val="334155"/>
-                <w:sz w:val="19"/>
-              </w:rPr>
-              <w:t>Tuần W40 này, toàn vùng chúng ta luân chuyển dòng tiền COD lên tới 77,5 TỶ ĐỒNG!</w:t>
-            </w:r>
-          </w:p>
-          <w:p>
-            <w:pPr>
-              <w:spacing w:before="20" w:after="40" w:line="276" w:lineRule="auto"/>
-            </w:pPr>
-            <w:r>
-              <w:rPr>
-                <w:rFonts w:ascii="Arial" w:hAnsi="Arial"/>
-                <w:color w:val="334155"/>
-                <w:sz w:val="19"/>
-              </w:rPr>
-              <w:t>Trong đó, số tiền thu bằng chuyển khoản QR đạt 46,2 tỷ đồng (chiếm 59,6%), còn tiền mặt shipper ôm về là 31,3 tỷ đồng (chiếm 40,4%). So với tuần trước, tỷ lệ tiền mặt tăng nhẹ +0,2%p, tức là xu hướng đang xấu đi!</w:t>
-            </w:r>
-          </w:p>
-          <w:p>
-            <w:pPr>
-              <w:spacing w:before="20" w:after="40" w:line="276" w:lineRule="auto"/>
-            </w:pPr>
-            <w:r>
-              <w:rPr>
-                <w:rFonts w:ascii="Arial" w:hAnsi="Arial"/>
-                <w:color w:val="334155"/>
-                <w:sz w:val="19"/>
-              </w:rPr>
-            </w:r>
-          </w:p>
-          <w:p>
-            <w:pPr>
-              <w:spacing w:before="20" w:after="40" w:line="276" w:lineRule="auto"/>
-            </w:pPr>
-            <w:r>
-              <w:rPr>
-                <w:rFonts w:ascii="Arial" w:hAnsi="Arial"/>
-                <w:color w:val="334155"/>
-                <w:sz w:val="19"/>
-              </w:rPr>
-              <w:t>Nhìn vào bảng so sánh các AM, chúng ta thấy 2 bức tranh hoàn toàn đối lập:</w:t>
-            </w:r>
-          </w:p>
-          <w:p>
-            <w:pPr>
-              <w:spacing w:before="20" w:after="40" w:line="276" w:lineRule="auto"/>
-            </w:pPr>
-            <w:r>
-              <w:rPr>
-                <w:rFonts w:ascii="Arial" w:hAnsi="Arial"/>
-                <w:color w:val="334155"/>
-                <w:sz w:val="19"/>
-              </w:rPr>
-              <w:t>Một bên làm cực kỳ xuất sắc: Em xin biểu dương chị Thái Thị Thanh Thư ở Khánh Hòa: Chị Thư thu hơn 9 tỷ tiền COD mà tỷ lệ tiền mặt chỉ vỏn vẹn 4,0%, còn lại 96% khách hàng quét mã VietQR nộp tiền thẳng về tài khoản công ty! Chị Thủy ở Khánh Hòa cũng đạt tới 84% chuyển khoản QR!</w:t>
-            </w:r>
-          </w:p>
-          <w:p>
-            <w:pPr>
-              <w:spacing w:before="20" w:after="40" w:line="276" w:lineRule="auto"/>
-            </w:pPr>
-            <w:r>
-              <w:rPr>
-                <w:rFonts w:ascii="Arial" w:hAnsi="Arial"/>
-                <w:color w:val="334155"/>
-                <w:sz w:val="19"/>
-              </w:rPr>
-              <w:t>Khánh Hòa làm được như vậy chứng tỏ nếu bưu tá chịu khó hướng dẫn thì khách hàng ai cũng sẵn sàng quét QR!</w:t>
-            </w:r>
-          </w:p>
-          <w:p>
-            <w:pPr>
-              <w:spacing w:before="20" w:after="40" w:line="276" w:lineRule="auto"/>
-            </w:pPr>
-            <w:r>
-              <w:rPr>
-                <w:rFonts w:ascii="Arial" w:hAnsi="Arial"/>
-                <w:color w:val="334155"/>
-                <w:sz w:val="19"/>
-              </w:rPr>
-              <w:t>NHƯNG các anh chị nhìn sang 3 AM ở nhóm báo động đỏ nghiêm trọng:</w:t>
-            </w:r>
-          </w:p>
-          <w:p>
-            <w:pPr>
-              <w:spacing w:before="20" w:after="40" w:line="276" w:lineRule="auto"/>
-            </w:pPr>
-            <w:r>
-              <w:rPr>
-                <w:rFonts w:ascii="Arial" w:hAnsi="Arial"/>
-                <w:color w:val="334155"/>
-                <w:sz w:val="19"/>
-              </w:rPr>
-              <w:t>Anh Huỳnh Thúc Duân: 81,0% tiền mặt, tăng vọt gần 10%p so với tuần trước!</w:t>
-            </w:r>
-          </w:p>
-          <w:p>
-            <w:pPr>
-              <w:spacing w:before="20" w:after="40" w:line="276" w:lineRule="auto"/>
-            </w:pPr>
-            <w:r>
-              <w:rPr>
-                <w:rFonts w:ascii="Arial" w:hAnsi="Arial"/>
-                <w:color w:val="334155"/>
-                <w:sz w:val="19"/>
-              </w:rPr>
-              <w:t>Anh Lê Thanh Nhựt: 80,4% tiền mặt!</w:t>
-            </w:r>
-          </w:p>
-          <w:p>
-            <w:pPr>
-              <w:spacing w:before="20" w:after="40" w:line="276" w:lineRule="auto"/>
-            </w:pPr>
-            <w:r>
-              <w:rPr>
-                <w:rFonts w:ascii="Arial" w:hAnsi="Arial"/>
-                <w:color w:val="334155"/>
-                <w:sz w:val="19"/>
-              </w:rPr>
-              <w:t>Chị Huỳnh Thị Kim Chi: 75,8% tiền mặt!</w:t>
-            </w:r>
-          </w:p>
-          <w:p>
-            <w:pPr>
-              <w:spacing w:before="20" w:after="40" w:line="276" w:lineRule="auto"/>
-            </w:pPr>
-            <w:r>
-              <w:rPr>
-                <w:rFonts w:ascii="Arial" w:hAnsi="Arial"/>
-                <w:color w:val="334155"/>
-                <w:sz w:val="19"/>
-              </w:rPr>
-              <w:t>Cứ 10 đồng tiền thu hộ của khách thì shipper của anh Duân, anh Nhựt, chị Chi đang ôm tới 8 đồng tiền mặt trong người!</w:t>
+              <w:t>• 🔴 TOP 3 AM BÁO ĐỘNG ĐỎ NGUY CƠ THẤT THOÁT TIỀN MẶT (TỶ LỆ TIỀN MẶT VƯỢT 75% — MỨC ĐỘ NGHIÊM TRỌNG):</w:t>
+            </w:r>
+          </w:p>
+          <w:p>
+            <w:pPr>
+              <w:spacing w:before="20" w:after="40" w:line="276" w:lineRule="auto"/>
+            </w:pPr>
+            <w:r>
+              <w:rPr>
+                <w:rFonts w:ascii="Arial" w:hAnsi="Arial"/>
+                <w:color w:val="334155"/>
+                <w:sz w:val="19"/>
+              </w:rPr>
+              <w:t xml:space="preserve">  1. Huỳnh Thúc Duân (Đắk Nông): 81,0% Tiền mặt! (W39: 71,5%, TĂNG VỌT +9,5%p ➔ Đỉnh tiền mặt cao nhất toàn vùng!).</w:t>
+            </w:r>
+          </w:p>
+          <w:p>
+            <w:pPr>
+              <w:spacing w:before="20" w:after="40" w:line="276" w:lineRule="auto"/>
+            </w:pPr>
+            <w:r>
+              <w:rPr>
+                <w:rFonts w:ascii="Arial" w:hAnsi="Arial"/>
+                <w:color w:val="334155"/>
+                <w:sz w:val="19"/>
+              </w:rPr>
+              <w:t xml:space="preserve">  2. Lê Thanh Nhựt (Bình Thuận): 80,4% Tiền mặt! (W39: 77,7%, tăng +2,7%p ➔ Duy trì ở mức rất cao qua 2 tuần).</w:t>
+            </w:r>
+          </w:p>
+          <w:p>
+            <w:pPr>
+              <w:spacing w:before="20" w:after="40" w:line="276" w:lineRule="auto"/>
+            </w:pPr>
+            <w:r>
+              <w:rPr>
+                <w:rFonts w:ascii="Arial" w:hAnsi="Arial"/>
+                <w:color w:val="334155"/>
+                <w:sz w:val="19"/>
+              </w:rPr>
+              <w:t xml:space="preserve">  3. Huỳnh Thị Kim Chi (Lâm Đồng): 75,8% Tiền mặt! (W39: 68,6%, TĂNG MẠNH +7,2%p).</w:t>
+            </w:r>
+          </w:p>
+          <w:p>
+            <w:pPr>
+              <w:spacing w:before="20" w:after="40" w:line="276" w:lineRule="auto"/>
+            </w:pPr>
+            <w:r>
+              <w:rPr>
+                <w:rFonts w:ascii="Arial" w:hAnsi="Arial"/>
+                <w:color w:val="334155"/>
+                <w:sz w:val="19"/>
+              </w:rPr>
+              <w:t>• 🟡 NHÓM CẦN CẢI THIỆN (TIỀN MẶT TỪ 50% – 70%):</w:t>
+            </w:r>
+          </w:p>
+          <w:p>
+            <w:pPr>
+              <w:spacing w:before="20" w:after="40" w:line="276" w:lineRule="auto"/>
+            </w:pPr>
+            <w:r>
+              <w:rPr>
+                <w:rFonts w:ascii="Arial" w:hAnsi="Arial"/>
+                <w:color w:val="334155"/>
+                <w:sz w:val="19"/>
+              </w:rPr>
+              <w:t xml:space="preserve">  - Trần Thị Nhung: 64,1% TM (tăng +1,3%p)</w:t>
+            </w:r>
+          </w:p>
+          <w:p>
+            <w:pPr>
+              <w:spacing w:before="20" w:after="40" w:line="276" w:lineRule="auto"/>
+            </w:pPr>
+            <w:r>
+              <w:rPr>
+                <w:rFonts w:ascii="Arial" w:hAnsi="Arial"/>
+                <w:color w:val="334155"/>
+                <w:sz w:val="19"/>
+              </w:rPr>
+              <w:t xml:space="preserve">  - Phan Nguyễn Yến Nhi: 59,2% TM (tăng +2,1%p)</w:t>
+            </w:r>
+          </w:p>
+          <w:p>
+            <w:pPr>
+              <w:spacing w:before="20" w:after="40" w:line="276" w:lineRule="auto"/>
+            </w:pPr>
+            <w:r>
+              <w:rPr>
+                <w:rFonts w:ascii="Arial" w:hAnsi="Arial"/>
+                <w:color w:val="334155"/>
+                <w:sz w:val="19"/>
+              </w:rPr>
+              <w:t xml:space="preserve">  - Nguyễn Đỗ Minh Nghĩa: 58,6% TM (tăng vọt +7,2%p)</w:t>
+            </w:r>
+          </w:p>
+          <w:p>
+            <w:pPr>
+              <w:spacing w:before="20" w:after="40" w:line="276" w:lineRule="auto"/>
+            </w:pPr>
+            <w:r>
+              <w:rPr>
+                <w:rFonts w:ascii="Arial" w:hAnsi="Arial"/>
+                <w:color w:val="334155"/>
+                <w:sz w:val="19"/>
+              </w:rPr>
+              <w:t xml:space="preserve">  - Trương Quang Linh: 56,3% TM (tiến bộ lớn, giảm mạnh -24,3%p từ 80,6%)</w:t>
             </w:r>
           </w:p>
           <w:p>
@@ -7916,59 +7853,409 @@
                 <w:color w:val="0F172A"/>
                 <w:sz w:val="20"/>
               </w:rPr>
-              <w:t>🔍 INSIGHT BẢN CHẤT &amp; GỐC RỄ NGUYÊN NHÂN:</w:t>
-            </w:r>
-          </w:p>
-          <w:p>
-            <w:pPr>
-              <w:spacing w:before="20" w:after="40" w:line="276" w:lineRule="auto"/>
-            </w:pPr>
-            <w:r>
-              <w:rPr>
-                <w:rFonts w:ascii="Arial" w:hAnsi="Arial"/>
-                <w:color w:val="334155"/>
-                <w:sz w:val="19"/>
-              </w:rPr>
-              <w:t>Tại sao tỷ lệ tiền mặt ở cụm anh Duân, anh Nhựt, chị Chi lại cao bất thường như vậy?</w:t>
-            </w:r>
-          </w:p>
-          <w:p>
-            <w:pPr>
-              <w:spacing w:before="20" w:after="40" w:line="276" w:lineRule="auto"/>
-            </w:pPr>
-            <w:r>
-              <w:rPr>
-                <w:rFonts w:ascii="Arial" w:hAnsi="Arial"/>
-                <w:color w:val="334155"/>
-                <w:sz w:val="19"/>
-              </w:rPr>
-              <w:t>Insight: Shipper có thói quen ngại chìa mã QR trên app GHN cho khách quét vì muốn cầm tiền mặt để chi tiêu cá nhân, rồi lấy tiền thu của ngày hôm sau bù đắp cho ngày hôm trước!</w:t>
-            </w:r>
-          </w:p>
-          <w:p>
-            <w:pPr>
-              <w:spacing w:before="20" w:after="40" w:line="276" w:lineRule="auto"/>
-            </w:pPr>
-            <w:r>
-              <w:rPr>
-                <w:rFonts w:ascii="Arial" w:hAnsi="Arial"/>
-                <w:color w:val="334155"/>
-                <w:sz w:val="19"/>
-              </w:rPr>
-              <w:t>Nhiều bưu tá đổ lỗi rằng 'Bà con nông thôn không có tài khoản ngân hàng'. Điều đó hoàn toàn không đúng! Hiện nay bà con ở Đắk Nông hay Ninh Thuận đi chợ mua bó rau cũng quét VietQR.</w:t>
-            </w:r>
-          </w:p>
-          <w:p>
-            <w:pPr>
-              <w:spacing w:before="20" w:after="40" w:line="276" w:lineRule="auto"/>
-            </w:pPr>
-            <w:r>
-              <w:rPr>
-                <w:rFonts w:ascii="Arial" w:hAnsi="Arial"/>
-                <w:color w:val="334155"/>
-                <w:sz w:val="19"/>
-              </w:rPr>
-              <w:t>Chính sự buông lỏng kiểm tra của Trưởng bưu cục đã tạo kẽ hở cho shipper giữ tiền mặt qua đêm, là nguyên nhân trực tiếp dẫn đến chiếm dụng công nợ và vỡ nợ tập thể!</w:t>
+              <w:t>📍 3. BẢNG 3: TOP 8 BƯU CỤC ÔM TIỀN MẶT KHỦNG KHIẾP NHẤT VÙNG:</w:t>
+            </w:r>
+          </w:p>
+          <w:p>
+            <w:pPr>
+              <w:spacing w:before="20" w:after="40" w:line="276" w:lineRule="auto"/>
+            </w:pPr>
+            <w:r>
+              <w:rPr>
+                <w:rFonts w:ascii="Arial" w:hAnsi="Arial"/>
+                <w:color w:val="334155"/>
+                <w:sz w:val="19"/>
+              </w:rPr>
+              <w:t>• 1. (DNO) Quảng Khê (AM Nhung): 99,1% TM (Tiền mặt: 354,5 Tr ₫)</w:t>
+            </w:r>
+          </w:p>
+          <w:p>
+            <w:pPr>
+              <w:spacing w:before="20" w:after="40" w:line="276" w:lineRule="auto"/>
+            </w:pPr>
+            <w:r>
+              <w:rPr>
+                <w:rFonts w:ascii="Arial" w:hAnsi="Arial"/>
+                <w:color w:val="334155"/>
+                <w:sz w:val="19"/>
+              </w:rPr>
+              <w:t>• 2. (DNO) Bắc Gia Nghĩa (AM Duân): 97,3% TM (Tiền mặt: 371,5 Tr ₫)</w:t>
+            </w:r>
+          </w:p>
+          <w:p>
+            <w:pPr>
+              <w:spacing w:before="20" w:after="40" w:line="276" w:lineRule="auto"/>
+            </w:pPr>
+            <w:r>
+              <w:rPr>
+                <w:rFonts w:ascii="Arial" w:hAnsi="Arial"/>
+                <w:color w:val="334155"/>
+                <w:sz w:val="19"/>
+              </w:rPr>
+              <w:t>• 3. (BTH) Hàm Thuận (AM Nhựt): 89,5% TM (Tiền mặt: 1.200,5 Tr ₫ — HƠN 1,2 TỶ ĐỒNG TIỀN MẶT ÔM TRONG TÚI BƯU TÁ!)</w:t>
+            </w:r>
+          </w:p>
+          <w:p>
+            <w:pPr>
+              <w:spacing w:before="20" w:after="40" w:line="276" w:lineRule="auto"/>
+            </w:pPr>
+            <w:r>
+              <w:rPr>
+                <w:rFonts w:ascii="Arial" w:hAnsi="Arial"/>
+                <w:color w:val="334155"/>
+                <w:sz w:val="19"/>
+              </w:rPr>
+              <w:t>• 4. (LDO) Đam Rông 3 (AM Chi): 88,7% TM (Tiền mặt: 727,4 Tr ₫)</w:t>
+            </w:r>
+          </w:p>
+          <w:p>
+            <w:pPr>
+              <w:spacing w:before="20" w:after="40" w:line="276" w:lineRule="auto"/>
+            </w:pPr>
+            <w:r>
+              <w:rPr>
+                <w:rFonts w:ascii="Arial" w:hAnsi="Arial"/>
+                <w:color w:val="334155"/>
+                <w:sz w:val="19"/>
+              </w:rPr>
+              <w:t>• 5. (BTH) Hàm Liêm (AM Nhựt): 88,1% TM (Tiền mặt: 720,1 Tr ₫)</w:t>
+            </w:r>
+          </w:p>
+          <w:p>
+            <w:pPr>
+              <w:spacing w:before="20" w:after="40" w:line="276" w:lineRule="auto"/>
+            </w:pPr>
+            <w:r>
+              <w:rPr>
+                <w:rFonts w:ascii="Arial" w:hAnsi="Arial"/>
+                <w:color w:val="334155"/>
+                <w:sz w:val="19"/>
+              </w:rPr>
+              <w:t>• 6. (KHO) Cam Lâm 1 (AM Phi): 86,9% TM (Tiền mặt: 552,5 Tr ₫)</w:t>
+            </w:r>
+          </w:p>
+          <w:p>
+            <w:pPr>
+              <w:spacing w:before="20" w:after="40" w:line="276" w:lineRule="auto"/>
+            </w:pPr>
+            <w:r>
+              <w:rPr>
+                <w:rFonts w:ascii="Arial" w:hAnsi="Arial"/>
+                <w:color w:val="334155"/>
+                <w:sz w:val="19"/>
+              </w:rPr>
+              <w:t>• 7. (BTH) Lương Sơn (AM Khánh): 84,4% TM (Tiền mặt: 421,8 Tr ₫)</w:t>
+            </w:r>
+          </w:p>
+          <w:p>
+            <w:pPr>
+              <w:spacing w:before="20" w:after="40" w:line="276" w:lineRule="auto"/>
+            </w:pPr>
+            <w:r>
+              <w:rPr>
+                <w:rFonts w:ascii="Arial" w:hAnsi="Arial"/>
+                <w:color w:val="334155"/>
+                <w:sz w:val="19"/>
+              </w:rPr>
+              <w:t>• 8. (DNO) Đức Lập (AM Nhung): 82,3% TM (Tiền mặt: 1.358,5 Tr ₫ — HƠN 1,35 TỶ ĐỒNG TIỀN MẶT!)</w:t>
+            </w:r>
+          </w:p>
+          <w:p>
+            <w:pPr>
+              <w:spacing w:before="20" w:after="40" w:line="276" w:lineRule="auto"/>
+            </w:pPr>
+            <w:r>
+              <w:rPr>
+                <w:rFonts w:ascii="Arial" w:hAnsi="Arial"/>
+                <w:color w:val="334155"/>
+                <w:sz w:val="19"/>
+              </w:rPr>
+            </w:r>
+          </w:p>
+          <w:p>
+            <w:pPr>
+              <w:spacing w:before="20" w:after="40" w:line="276" w:lineRule="auto"/>
+            </w:pPr>
+            <w:r>
+              <w:rPr>
+                <w:rFonts w:ascii="Arial" w:hAnsi="Arial"/>
+                <w:i/>
+                <w:color w:val="0F172A"/>
+                <w:sz w:val="19"/>
+              </w:rPr>
+              <w:t>🎙️ LỜI THOẠI THUYẾT TRÌNH TỰ NHIÊN (KHI BẬT TAB 13 DASHBOARD COD &amp; QR CODE):</w:t>
+            </w:r>
+          </w:p>
+          <w:p>
+            <w:pPr>
+              <w:spacing w:before="20" w:after="40" w:line="276" w:lineRule="auto"/>
+            </w:pPr>
+            <w:r>
+              <w:rPr>
+                <w:rFonts w:ascii="Arial" w:hAnsi="Arial"/>
+                <w:i/>
+                <w:color w:val="0F172A"/>
+                <w:sz w:val="19"/>
+              </w:rPr>
+              <w:t>"Kính thưa Ban Giám Đốc và toàn thể các anh chị em AM,</w:t>
+            </w:r>
+          </w:p>
+          <w:p>
+            <w:pPr>
+              <w:spacing w:before="20" w:after="40" w:line="276" w:lineRule="auto"/>
+            </w:pPr>
+            <w:r>
+              <w:rPr>
+                <w:rFonts w:ascii="Arial" w:hAnsi="Arial"/>
+                <w:color w:val="334155"/>
+                <w:sz w:val="19"/>
+              </w:rPr>
+              <w:t>Chúng ta chuyển sang Tab 13 là Báo cáo Quản trị dòng tiền COD và thanh toán QR Code:</w:t>
+            </w:r>
+          </w:p>
+          <w:p>
+            <w:pPr>
+              <w:spacing w:before="20" w:after="40" w:line="276" w:lineRule="auto"/>
+            </w:pPr>
+            <w:r>
+              <w:rPr>
+                <w:rFonts w:ascii="Arial" w:hAnsi="Arial"/>
+                <w:color w:val="334155"/>
+                <w:sz w:val="19"/>
+              </w:rPr>
+              <w:t>Tuần W40 này, toàn vùng Nam Trung Bộ của chúng ta luân chuyển một dòng tiền COD cực kỳ lớn: 77,5 TỶ ĐỒNG!</w:t>
+            </w:r>
+          </w:p>
+          <w:p>
+            <w:pPr>
+              <w:spacing w:before="20" w:after="40" w:line="276" w:lineRule="auto"/>
+            </w:pPr>
+            <w:r>
+              <w:rPr>
+                <w:rFonts w:ascii="Arial" w:hAnsi="Arial"/>
+                <w:color w:val="334155"/>
+                <w:sz w:val="19"/>
+              </w:rPr>
+              <w:t>Trong đó, số tiền thu về bằng chuyển khoản QR đạt 46,2 tỷ đồng (chiếm 59,6%), còn tiền mặt shipper ôm về nộp là 31,3 tỷ đồng (chiếm 40,4%).</w:t>
+            </w:r>
+          </w:p>
+          <w:p>
+            <w:pPr>
+              <w:spacing w:before="20" w:after="40" w:line="276" w:lineRule="auto"/>
+            </w:pPr>
+            <w:r>
+              <w:rPr>
+                <w:rFonts w:ascii="Arial" w:hAnsi="Arial"/>
+                <w:color w:val="334155"/>
+                <w:sz w:val="19"/>
+              </w:rPr>
+              <w:t>So với tuần trước, tỷ lệ tiền mặt không những không giảm mà lại tăng nhẹ +0,2%p. Đây là tín hiệu báo động về tính kỷ luật tài chính!</w:t>
+            </w:r>
+          </w:p>
+          <w:p>
+            <w:pPr>
+              <w:spacing w:before="20" w:after="40" w:line="276" w:lineRule="auto"/>
+            </w:pPr>
+            <w:r>
+              <w:rPr>
+                <w:rFonts w:ascii="Arial" w:hAnsi="Arial"/>
+                <w:color w:val="334155"/>
+                <w:sz w:val="19"/>
+              </w:rPr>
+            </w:r>
+          </w:p>
+          <w:p>
+            <w:pPr>
+              <w:spacing w:before="20" w:after="40" w:line="276" w:lineRule="auto"/>
+            </w:pPr>
+            <w:r>
+              <w:rPr>
+                <w:rFonts w:ascii="Arial" w:hAnsi="Arial"/>
+                <w:color w:val="334155"/>
+                <w:sz w:val="19"/>
+              </w:rPr>
+              <w:t>Nhìn vào bức tranh toàn cảnh của 18 AM trên màn hình:</w:t>
+            </w:r>
+          </w:p>
+          <w:p>
+            <w:pPr>
+              <w:spacing w:before="20" w:after="40" w:line="276" w:lineRule="auto"/>
+            </w:pPr>
+            <w:r>
+              <w:rPr>
+                <w:rFonts w:ascii="Arial" w:hAnsi="Arial"/>
+                <w:color w:val="334155"/>
+                <w:sz w:val="19"/>
+              </w:rPr>
+              <w:t>Ở chiều tích cực: Em xin biểu dương chị Thái Thị Thanh Thư ở Khánh Hòa:</w:t>
+            </w:r>
+          </w:p>
+          <w:p>
+            <w:pPr>
+              <w:spacing w:before="20" w:after="40" w:line="276" w:lineRule="auto"/>
+            </w:pPr>
+            <w:r>
+              <w:rPr>
+                <w:rFonts w:ascii="Arial" w:hAnsi="Arial"/>
+                <w:color w:val="334155"/>
+                <w:sz w:val="19"/>
+              </w:rPr>
+              <w:t>Chị Thư quản lý thu hơn 9 tỷ tiền COD tại Nha Trang mà tỷ lệ tiền mặt chỉ vỏn vẹn có 4,0%, còn lại 96% khách hàng thanh toán qua mã VietQR chuyển thẳng về tài khoản công ty!</w:t>
+            </w:r>
+          </w:p>
+          <w:p>
+            <w:pPr>
+              <w:spacing w:before="20" w:after="40" w:line="276" w:lineRule="auto"/>
+            </w:pPr>
+            <w:r>
+              <w:rPr>
+                <w:rFonts w:ascii="Arial" w:hAnsi="Arial"/>
+                <w:color w:val="334155"/>
+                <w:sz w:val="19"/>
+              </w:rPr>
+              <w:t>Chị Thủy ở Khánh Hòa cũng đạt tới 84% chuyển khoản QR, anh Duy Long ở Ninh Thuận đạt gần 77% QR!</w:t>
+            </w:r>
+          </w:p>
+          <w:p>
+            <w:pPr>
+              <w:spacing w:before="20" w:after="40" w:line="276" w:lineRule="auto"/>
+            </w:pPr>
+            <w:r>
+              <w:rPr>
+                <w:rFonts w:ascii="Arial" w:hAnsi="Arial"/>
+                <w:color w:val="334155"/>
+                <w:sz w:val="19"/>
+              </w:rPr>
+              <w:t>Tại sao Khánh Hòa và Ninh Thuận làm được? Vì bưu tá chịu khó in mã QR dán lên gói hàng, shipper đến nơi mở sẵn app chìa mã cho khách quét, biến việc thanh toán không dùng tiền mặt thành thói quen!</w:t>
+            </w:r>
+          </w:p>
+          <w:p>
+            <w:pPr>
+              <w:spacing w:before="20" w:after="40" w:line="276" w:lineRule="auto"/>
+            </w:pPr>
+            <w:r>
+              <w:rPr>
+                <w:rFonts w:ascii="Arial" w:hAnsi="Arial"/>
+                <w:color w:val="334155"/>
+                <w:sz w:val="19"/>
+              </w:rPr>
+            </w:r>
+          </w:p>
+          <w:p>
+            <w:pPr>
+              <w:spacing w:before="20" w:after="40" w:line="276" w:lineRule="auto"/>
+            </w:pPr>
+            <w:r>
+              <w:rPr>
+                <w:rFonts w:ascii="Arial" w:hAnsi="Arial"/>
+                <w:color w:val="334155"/>
+                <w:sz w:val="19"/>
+              </w:rPr>
+              <w:t>NHƯNG các anh chị nhìn sang 3 AM ở nhóm báo động đỏ nghiêm trọng:</w:t>
+            </w:r>
+          </w:p>
+          <w:p>
+            <w:pPr>
+              <w:spacing w:before="20" w:after="40" w:line="276" w:lineRule="auto"/>
+            </w:pPr>
+            <w:r>
+              <w:rPr>
+                <w:rFonts w:ascii="Arial" w:hAnsi="Arial"/>
+                <w:color w:val="334155"/>
+                <w:sz w:val="19"/>
+              </w:rPr>
+              <w:t>Anh Huỳnh Thúc Duân: 81,0% tiền mặt, tăng vọt gần 10%p so với tuần trước!</w:t>
+            </w:r>
+          </w:p>
+          <w:p>
+            <w:pPr>
+              <w:spacing w:before="20" w:after="40" w:line="276" w:lineRule="auto"/>
+            </w:pPr>
+            <w:r>
+              <w:rPr>
+                <w:rFonts w:ascii="Arial" w:hAnsi="Arial"/>
+                <w:color w:val="334155"/>
+                <w:sz w:val="19"/>
+              </w:rPr>
+              <w:t>Anh Lê Thanh Nhựt: 80,4% tiền mặt, đứng yên ở mức nguy hiểm qua 2 tuần liền!</w:t>
+            </w:r>
+          </w:p>
+          <w:p>
+            <w:pPr>
+              <w:spacing w:before="20" w:after="40" w:line="276" w:lineRule="auto"/>
+            </w:pPr>
+            <w:r>
+              <w:rPr>
+                <w:rFonts w:ascii="Arial" w:hAnsi="Arial"/>
+                <w:color w:val="334155"/>
+                <w:sz w:val="19"/>
+              </w:rPr>
+              <w:t>Chị Huỳnh Thị Kim Chi: 75,8% tiền mặt, tăng hơn 7%p!</w:t>
+            </w:r>
+          </w:p>
+          <w:p>
+            <w:pPr>
+              <w:spacing w:before="20" w:after="40" w:line="276" w:lineRule="auto"/>
+            </w:pPr>
+            <w:r>
+              <w:rPr>
+                <w:rFonts w:ascii="Arial" w:hAnsi="Arial"/>
+                <w:color w:val="334155"/>
+                <w:sz w:val="19"/>
+              </w:rPr>
+              <w:t>Cứ 10 đồng tiền thu hộ của khách thì shipper của anh Duân, anh Nhựt, chị Chi đang ôm tới hơn 8 đồng tiền mặt trong người!</w:t>
+            </w:r>
+          </w:p>
+          <w:p>
+            <w:pPr>
+              <w:spacing w:before="20" w:after="40" w:line="276" w:lineRule="auto"/>
+            </w:pPr>
+            <w:r>
+              <w:rPr>
+                <w:rFonts w:ascii="Arial" w:hAnsi="Arial"/>
+                <w:color w:val="334155"/>
+                <w:sz w:val="19"/>
+              </w:rPr>
+              <w:t>Nhìn xuống Bảng 3 Top bưu cục ôm tiền mặt:</w:t>
+            </w:r>
+          </w:p>
+          <w:p>
+            <w:pPr>
+              <w:spacing w:before="20" w:after="40" w:line="276" w:lineRule="auto"/>
+            </w:pPr>
+            <w:r>
+              <w:rPr>
+                <w:rFonts w:ascii="Arial" w:hAnsi="Arial"/>
+                <w:color w:val="334155"/>
+                <w:sz w:val="19"/>
+              </w:rPr>
+              <w:t>Bưu cục Hàm Thuận của anh Nhựt ôm hơn 1,2 TỶ ĐỒNG tiền mặt! Bưu cục Hàm Liêm ôm 720 triệu!</w:t>
+            </w:r>
+          </w:p>
+          <w:p>
+            <w:pPr>
+              <w:spacing w:before="20" w:after="40" w:line="276" w:lineRule="auto"/>
+            </w:pPr>
+            <w:r>
+              <w:rPr>
+                <w:rFonts w:ascii="Arial" w:hAnsi="Arial"/>
+                <w:color w:val="334155"/>
+                <w:sz w:val="19"/>
+              </w:rPr>
+              <w:t>Bưu cục Đức Lập của chị Nhung ôm hơn 1,35 TỶ ĐỒNG tiền mặt!</w:t>
+            </w:r>
+          </w:p>
+          <w:p>
+            <w:pPr>
+              <w:spacing w:before="20" w:after="40" w:line="276" w:lineRule="auto"/>
+            </w:pPr>
+            <w:r>
+              <w:rPr>
+                <w:rFonts w:ascii="Arial" w:hAnsi="Arial"/>
+                <w:color w:val="334155"/>
+                <w:sz w:val="19"/>
+              </w:rPr>
+              <w:t>Các anh chị có biết cầm hàng tỷ đồng tiền mặt lưu động ngoài đường nguy hiểm đến mức nào không?</w:t>
             </w:r>
           </w:p>
           <w:p>
@@ -7994,60 +8281,176 @@
                 <w:color w:val="0F172A"/>
                 <w:sz w:val="20"/>
               </w:rPr>
-              <w:t>🎯 QUYẾT SÁCH HÀNH ĐỘNG &amp; MỆNH LỆNH TÁC CHIẾN:</w:t>
-            </w:r>
-          </w:p>
-          <w:p>
-            <w:pPr>
-              <w:spacing w:before="20" w:after="40" w:line="276" w:lineRule="auto"/>
-            </w:pPr>
-            <w:r>
-              <w:rPr>
-                <w:rFonts w:ascii="Arial" w:hAnsi="Arial"/>
-                <w:color w:val="334155"/>
-                <w:sz w:val="19"/>
-              </w:rPr>
-              <w:t>1. Yêu cầu anh Duân, anh Nhựt, chị Chi: Bắt buộc 100% bưu tá khi đi giao hàng phải in hoặc mở mã QR động trên app GHN cho khách thanh toán.</w:t>
-            </w:r>
-          </w:p>
-          <w:p>
-            <w:pPr>
-              <w:spacing w:before="20" w:after="40" w:line="276" w:lineRule="auto"/>
-            </w:pPr>
-            <w:r>
-              <w:rPr>
-                <w:rFonts w:ascii="Arial" w:hAnsi="Arial"/>
-                <w:color w:val="334155"/>
-                <w:sz w:val="19"/>
-              </w:rPr>
-              <w:t>2. Trưởng bưu cục phải thực hiện chốt sổ tiền mặt và đối soát nộp tiền vào tài khoản công ty 2 lần/ngày (lúc 12h00 trưa và 18h30 tối), tuyệt đối cấm shipper ôm tiền mặt về nhà qua đêm!</w:t>
-            </w:r>
-          </w:p>
-          <w:p>
-            <w:pPr>
-              <w:spacing w:before="20" w:after="40" w:line="276" w:lineRule="auto"/>
-            </w:pPr>
-            <w:r>
-              <w:rPr>
-                <w:rFonts w:ascii="Arial" w:hAnsi="Arial"/>
-                <w:color w:val="334155"/>
-                <w:sz w:val="19"/>
-              </w:rPr>
-              <w:t>3. Tuần W41 bắt buộc 3 cụm này phải ép tỷ lệ tiền mặt xuống dưới 60%!</w:t>
-            </w:r>
-          </w:p>
-          <w:p>
-            <w:pPr>
-              <w:spacing w:before="20" w:after="40" w:line="276" w:lineRule="auto"/>
-            </w:pPr>
-            <w:r>
-              <w:rPr>
-                <w:rFonts w:ascii="Arial" w:hAnsi="Arial"/>
-                <w:i/>
+              <w:t>🔍 INSIGHT BẢN CHẤT &amp; BÓC TRẦN NGUY CƠ HIỆN TRƯỜNG:</w:t>
+            </w:r>
+          </w:p>
+          <w:p>
+            <w:pPr>
+              <w:spacing w:before="20" w:after="40" w:line="276" w:lineRule="auto"/>
+            </w:pPr>
+            <w:r>
+              <w:rPr>
+                <w:rFonts w:ascii="Arial" w:hAnsi="Arial"/>
+                <w:color w:val="334155"/>
+                <w:sz w:val="19"/>
+              </w:rPr>
+              <w:t>Tại sao tỷ lệ tiền mặt ở bưu cục anh Duân, anh Nhựt, chị Chi lại cao ngất ngưởng như vậy?</w:t>
+            </w:r>
+          </w:p>
+          <w:p>
+            <w:pPr>
+              <w:spacing w:before="20" w:after="40" w:line="276" w:lineRule="auto"/>
+            </w:pPr>
+            <w:r>
+              <w:rPr>
+                <w:rFonts w:ascii="Arial" w:hAnsi="Arial"/>
+                <w:color w:val="334155"/>
+                <w:sz w:val="19"/>
+              </w:rPr>
+              <w:t>Bóc tách ra có 2 nguyên nhân cốt lõi:</w:t>
+            </w:r>
+          </w:p>
+          <w:p>
+            <w:pPr>
+              <w:spacing w:before="20" w:after="40" w:line="276" w:lineRule="auto"/>
+            </w:pPr>
+            <w:r>
+              <w:rPr>
+                <w:rFonts w:ascii="Arial" w:hAnsi="Arial"/>
+                <w:color w:val="334155"/>
+                <w:sz w:val="19"/>
+              </w:rPr>
+              <w:t>1. BƯU TÁ CỐ TÌNH NÉ QUÉT QR ĐỂ CẦM TIỀN MẶT 'XOAY VÒNG ĐẢO NỢ':</w:t>
+            </w:r>
+          </w:p>
+          <w:p>
+            <w:pPr>
+              <w:spacing w:before="20" w:after="40" w:line="276" w:lineRule="auto"/>
+            </w:pPr>
+            <w:r>
+              <w:rPr>
+                <w:rFonts w:ascii="Arial" w:hAnsi="Arial"/>
+                <w:color w:val="334155"/>
+                <w:sz w:val="19"/>
+              </w:rPr>
+              <w:t>Shipper thu tiền mặt của khách xong có tâm lý giữ lại trong ví cá nhân để chi tiêu riêng, rồi lấy tiền thu của ngày hôm sau bù đắp nộp về cho ngày hôm trước! Hiện tượng 'xoay vòng công nợ' này nếu bưu cục không chốt quỹ chặt chẽ từng ca thì chỉ cần shipper thua lỗ cá độ hoặc gặp biến cố là lập tức bùng nợ, biến thành chiếm dụng công nợ hàng chục triệu đồng!</w:t>
+            </w:r>
+          </w:p>
+          <w:p>
+            <w:pPr>
+              <w:spacing w:before="20" w:after="40" w:line="276" w:lineRule="auto"/>
+            </w:pPr>
+            <w:r>
+              <w:rPr>
+                <w:rFonts w:ascii="Arial" w:hAnsi="Arial"/>
+                <w:color w:val="334155"/>
+                <w:sz w:val="19"/>
+              </w:rPr>
+              <w:t>2. NGỤY BIỆN 'NGƯỜI DÂN VÙNG QUÊ KHÔNG CÓ TÀI KHOẢN':</w:t>
+            </w:r>
+          </w:p>
+          <w:p>
+            <w:pPr>
+              <w:spacing w:before="20" w:after="40" w:line="276" w:lineRule="auto"/>
+            </w:pPr>
+            <w:r>
+              <w:rPr>
+                <w:rFonts w:ascii="Arial" w:hAnsi="Arial"/>
+                <w:color w:val="334155"/>
+                <w:sz w:val="19"/>
+              </w:rPr>
+              <w:t>Nhiều AM đổ lỗi rằng Đắk Nông hay vùng nông thôn Bình Thuận bà con không biết chuyển khoản. Thực tế hiện nay người dân đi chợ mua rau cũng quét mã VietQR. Bưu tá lười in mã QR, lười chìa điện thoại cho khách quét vì muốn nhận tiền mặt cho tiện tay!</w:t>
+            </w:r>
+          </w:p>
+          <w:p>
+            <w:pPr>
+              <w:spacing w:before="20" w:after="40" w:line="276" w:lineRule="auto"/>
+            </w:pPr>
+            <w:r>
+              <w:rPr>
+                <w:rFonts w:ascii="Arial" w:hAnsi="Arial"/>
+                <w:color w:val="334155"/>
+                <w:sz w:val="19"/>
+              </w:rPr>
+            </w:r>
+          </w:p>
+          <w:p>
+            <w:pPr>
+              <w:spacing w:before="20" w:after="40" w:line="276" w:lineRule="auto"/>
+            </w:pPr>
+            <w:r>
+              <w:rPr>
+                <w:rFonts w:ascii="Arial" w:hAnsi="Arial"/>
+                <w:b/>
                 <w:color w:val="0F172A"/>
-                <w:sz w:val="19"/>
-              </w:rPr>
-              <w:t>Giờ em xin chuyển sang Tab 14 mổ xẻ Báo cáo truy thu 2 tuần ạ!"</w:t>
+                <w:sz w:val="20"/>
+              </w:rPr>
+              <w:t>🎯 QUYẾT SÁCH HÀNH ĐỘNG &amp; MỆNH LỆNH TÁC CHIẾN TUẦN W41:</w:t>
+            </w:r>
+          </w:p>
+          <w:p>
+            <w:pPr>
+              <w:spacing w:before="20" w:after="40" w:line="276" w:lineRule="auto"/>
+            </w:pPr>
+            <w:r>
+              <w:rPr>
+                <w:rFonts w:ascii="Arial" w:hAnsi="Arial"/>
+                <w:color w:val="334155"/>
+                <w:sz w:val="19"/>
+              </w:rPr>
+              <w:t>1. YÊU CẦU GIẢI TRÌNH TRONG 24H: AM Huỳnh Thúc Duân và AM Huỳnh Thị Kim Chi phải gửi văn bản giải trình lý do vì sao tỷ lệ tiền mặt tăng vọt từ 7% đến 9,5%p về phòng Vận hành vùng trước 17h00 chiều mai.</w:t>
+            </w:r>
+          </w:p>
+          <w:p>
+            <w:pPr>
+              <w:spacing w:before="20" w:after="40" w:line="276" w:lineRule="auto"/>
+            </w:pPr>
+            <w:r>
+              <w:rPr>
+                <w:rFonts w:ascii="Arial" w:hAnsi="Arial"/>
+                <w:color w:val="334155"/>
+                <w:sz w:val="19"/>
+              </w:rPr>
+              <w:t>2. LÀM VIỆC 1-1 VỚI AM LÊ THANH NHỰT: Phòng Tài chính - Kế toán vùng làm việc trực tiếp với anh Nhựt để kiểm tra quy trình nộp tiền tại Hàm Thuận và Hàm Liêm; trang bị ngay mã VietQR tại quầy và cấp mã bưu tá.</w:t>
+            </w:r>
+          </w:p>
+          <w:p>
+            <w:pPr>
+              <w:spacing w:before="20" w:after="40" w:line="276" w:lineRule="auto"/>
+            </w:pPr>
+            <w:r>
+              <w:rPr>
+                <w:rFonts w:ascii="Arial" w:hAnsi="Arial"/>
+                <w:color w:val="334155"/>
+                <w:sz w:val="19"/>
+              </w:rPr>
+              <w:t>3. SIẾT CHẶT KỶ LUẬT THU NỘP QUỸ: 100% bưu cục phải thực hiện chốt quỹ tiền mặt 2 lần/ngày: Chốt ca trưa lúc 12h00 và chốt ca chiều lúc 18h30. Shipper không nộp hết tiền mặt về tài khoản công ty trước 19h00 sẽ bị khóa app không cho xuất bến ngày hôm sau!</w:t>
+            </w:r>
+          </w:p>
+          <w:p>
+            <w:pPr>
+              <w:spacing w:before="20" w:after="40" w:line="276" w:lineRule="auto"/>
+            </w:pPr>
+            <w:r>
+              <w:rPr>
+                <w:rFonts w:ascii="Arial" w:hAnsi="Arial"/>
+                <w:color w:val="334155"/>
+                <w:sz w:val="19"/>
+              </w:rPr>
+              <w:t>4. GIAO CHỈ TIÊU TUẦN W41: Ép tỷ lệ tiền mặt của anh Duân, anh Nhựt, chị Chi từ trên 75-80% xuống dưới mốc 60%!</w:t>
+            </w:r>
+          </w:p>
+          <w:p>
+            <w:pPr>
+              <w:spacing w:before="20" w:after="40" w:line="276" w:lineRule="auto"/>
+            </w:pPr>
+            <w:r>
+              <w:rPr>
+                <w:rFonts w:ascii="Arial" w:hAnsi="Arial"/>
+                <w:color w:val="334155"/>
+                <w:sz w:val="19"/>
+              </w:rPr>
+              <w:t>Bây giờ, em xin chuyển sang Tab 14 mổ xẻ Báo cáo Truy thu 2 tuần ạ!</w:t>
             </w:r>
           </w:p>
         </w:tc>
@@ -8089,6 +8492,7 @@
             <w:shd w:fill="F1F5F9"/>
             <w:shd w:fill="F1F5F9"/>
             <w:shd w:fill="F1F5F9"/>
+            <w:shd w:fill="F1F5F9"/>
           </w:tcPr>
           <w:p>
             <w:pPr>
@@ -8101,7 +8505,7 @@
                 <w:color w:val="0F172A"/>
                 <w:sz w:val="24"/>
               </w:rPr>
-              <w:t>TAB 14: 🗣️ PHÂN TÍCH BÁO CÁO TRUY THU 2 TUẦN (W39 VS W40) (BẬT TAB 14 DASHBOARD):</w:t>
+              <w:t>TAB 14: 🗣️ BÁO CÁO TRUY THU 2 TUẦN: VỤ ÁN CHIẾM DỤNG TẠI BẮC CAM RANH &amp; 419 TICKET TỒN ĐỌNG (BẬT TAB 14 DASHBOARD):</w:t>
             </w:r>
           </w:p>
           <w:p>
@@ -8115,59 +8519,60 @@
                 <w:color w:val="0F172A"/>
                 <w:sz w:val="20"/>
               </w:rPr>
-              <w:t>📍 1. BẢNG TỔNG HỢP TRUY THU VÙNG NAM TRUNG BỘ:</w:t>
-            </w:r>
-          </w:p>
-          <w:p>
-            <w:pPr>
-              <w:spacing w:before="20" w:after="40" w:line="276" w:lineRule="auto"/>
-            </w:pPr>
-            <w:r>
-              <w:rPr>
-                <w:rFonts w:ascii="Arial" w:hAnsi="Arial"/>
-                <w:color w:val="334155"/>
-                <w:sz w:val="19"/>
-              </w:rPr>
-              <w:t>• Tổng số bản ghi (ticket): 2.424 bản ghi (giảm 1.652 đơn / -40,5% so với 4.076 bản ghi tuần W39).</w:t>
-            </w:r>
-          </w:p>
-          <w:p>
-            <w:pPr>
-              <w:spacing w:before="20" w:after="40" w:line="276" w:lineRule="auto"/>
-            </w:pPr>
-            <w:r>
-              <w:rPr>
-                <w:rFonts w:ascii="Arial" w:hAnsi="Arial"/>
-                <w:color w:val="334155"/>
-                <w:sz w:val="19"/>
-              </w:rPr>
-              <w:t>• Số tiền phát sinh ban đầu: 433,1 Triệu VNĐ (W39: 317,3 Tr ₫, TĂNG MẠNH +115,8 Tr ₫ / +36,5%).</w:t>
-            </w:r>
-          </w:p>
-          <w:p>
-            <w:pPr>
-              <w:spacing w:before="20" w:after="40" w:line="276" w:lineRule="auto"/>
-            </w:pPr>
-            <w:r>
-              <w:rPr>
-                <w:rFonts w:ascii="Arial" w:hAnsi="Arial"/>
-                <w:color w:val="334155"/>
-                <w:sz w:val="19"/>
-              </w:rPr>
-              <w:t>• Số tiền điều chỉnh giảm: -246,0 Triệu VNĐ.</w:t>
-            </w:r>
-          </w:p>
-          <w:p>
-            <w:pPr>
-              <w:spacing w:before="20" w:after="40" w:line="276" w:lineRule="auto"/>
-            </w:pPr>
-            <w:r>
-              <w:rPr>
-                <w:rFonts w:ascii="Arial" w:hAnsi="Arial"/>
-                <w:color w:val="334155"/>
-                <w:sz w:val="19"/>
-              </w:rPr>
-              <w:t>• Số tiền thực tế CẦN TRUY THU: 187,1 Triệu VNĐ (W39: 312,1 Tr ₫, GIẢM -125,0 Tr ₫ / -40,1%).</w:t>
+              <w:t>📍 1. BẢNG TỔNG HỢP SO SÁNH 2 TUẦN TRUY THU TOÀN VÙNG:</w:t>
+            </w:r>
+          </w:p>
+          <w:p>
+            <w:pPr>
+              <w:spacing w:before="20" w:after="40" w:line="276" w:lineRule="auto"/>
+            </w:pPr>
+            <w:r>
+              <w:rPr>
+                <w:rFonts w:ascii="Arial" w:hAnsi="Arial"/>
+                <w:color w:val="334155"/>
+                <w:sz w:val="19"/>
+              </w:rPr>
+              <w:t>• Tổng số bản ghi (ticket): 2.424 bản ghi (W39: 4.076 bản ghi, giảm -1.652 đơn / -40,5%).</w:t>
+            </w:r>
+          </w:p>
+          <w:p>
+            <w:pPr>
+              <w:spacing w:before="20" w:after="40" w:line="276" w:lineRule="auto"/>
+            </w:pPr>
+            <w:r>
+              <w:rPr>
+                <w:rFonts w:ascii="Arial" w:hAnsi="Arial"/>
+                <w:b/>
+                <w:color w:val="B91C1C"/>
+                <w:sz w:val="19"/>
+              </w:rPr>
+              <w:t>• Số tiền phát sinh ban đầu: 433,1 Triệu VNĐ (W39: 317,3 Tr ₫, TĂNG VỌT +115,8 Tr ₫ / +36,5% ➔ BÁO ĐỘNG ĐỎ VI PHẠM TĂNG MẠNH!).</w:t>
+            </w:r>
+          </w:p>
+          <w:p>
+            <w:pPr>
+              <w:spacing w:before="20" w:after="40" w:line="276" w:lineRule="auto"/>
+            </w:pPr>
+            <w:r>
+              <w:rPr>
+                <w:rFonts w:ascii="Arial" w:hAnsi="Arial"/>
+                <w:color w:val="334155"/>
+                <w:sz w:val="19"/>
+              </w:rPr>
+              <w:t>• Số tiền điều chỉnh giảm: -246,0 Triệu VNĐ (chủ yếu là bù trừ đối soát backlog từ kỳ trước).</w:t>
+            </w:r>
+          </w:p>
+          <w:p>
+            <w:pPr>
+              <w:spacing w:before="20" w:after="40" w:line="276" w:lineRule="auto"/>
+            </w:pPr>
+            <w:r>
+              <w:rPr>
+                <w:rFonts w:ascii="Arial" w:hAnsi="Arial"/>
+                <w:color w:val="334155"/>
+                <w:sz w:val="19"/>
+              </w:rPr>
+              <w:t>• Số tiền thực tế CẦN TRUY THU: 187,1 Triệu VNĐ (W39: 312,1 Tr ₫, giảm -125,0 Tr ₫ / -40,1%).</w:t>
             </w:r>
           </w:p>
           <w:p>
@@ -8193,46 +8598,72 @@
                 <w:color w:val="0F172A"/>
                 <w:sz w:val="20"/>
               </w:rPr>
-              <w:t>📍 2. BẢNG 1: CƠ CẤU 3 LOẠI HÌNH VI PHẠM TRỌNG ĐIỂM:</w:t>
-            </w:r>
-          </w:p>
-          <w:p>
-            <w:pPr>
-              <w:spacing w:before="20" w:after="40" w:line="276" w:lineRule="auto"/>
-            </w:pPr>
-            <w:r>
-              <w:rPr>
-                <w:rFonts w:ascii="Arial" w:hAnsi="Arial"/>
-                <w:color w:val="334155"/>
-                <w:sz w:val="19"/>
-              </w:rPr>
-              <w:t>• 1. Liên đới chiếm dụng: 56,8 Triệu VNĐ (4 đơn) ➔ Số tiền cực lớn trên số đơn rất nhỏ, tính chất đặc biệt nghiêm trọng!</w:t>
-            </w:r>
-          </w:p>
-          <w:p>
-            <w:pPr>
-              <w:spacing w:before="20" w:after="40" w:line="276" w:lineRule="auto"/>
-            </w:pPr>
-            <w:r>
-              <w:rPr>
-                <w:rFonts w:ascii="Arial" w:hAnsi="Arial"/>
-                <w:color w:val="334155"/>
-                <w:sz w:val="19"/>
-              </w:rPr>
-              <w:t>• 2. Tick mất hàng: 41,2 Triệu VNĐ (53 đơn).</w:t>
-            </w:r>
-          </w:p>
-          <w:p>
-            <w:pPr>
-              <w:spacing w:before="20" w:after="40" w:line="276" w:lineRule="auto"/>
-            </w:pPr>
-            <w:r>
-              <w:rPr>
-                <w:rFonts w:ascii="Arial" w:hAnsi="Arial"/>
-                <w:color w:val="334155"/>
-                <w:sz w:val="19"/>
-              </w:rPr>
-              <w:t>• 3. Mất / Thiếu / Tráo sản phẩm: 30,9 Triệu VNĐ (76 đơn).</w:t>
+              <w:t>📍 2. BẢNG 1: CƠ CẤU 5 LOẠI HÌNH VI PHẠM TRỌNG ĐIỂM:</w:t>
+            </w:r>
+          </w:p>
+          <w:p>
+            <w:pPr>
+              <w:spacing w:before="20" w:after="40" w:line="276" w:lineRule="auto"/>
+            </w:pPr>
+            <w:r>
+              <w:rPr>
+                <w:rFonts w:ascii="Arial" w:hAnsi="Arial"/>
+                <w:color w:val="334155"/>
+                <w:sz w:val="19"/>
+              </w:rPr>
+              <w:t>• 1. LIÊN ĐỚI CHIẾM DỤNG: 56,8 Triệu VNĐ (chỉ 4 đơn hàng nhưng số tiền cực lớn!) ➔ Tính chất đặc biệt nghiêm trọng!</w:t>
+            </w:r>
+          </w:p>
+          <w:p>
+            <w:pPr>
+              <w:spacing w:before="20" w:after="40" w:line="276" w:lineRule="auto"/>
+            </w:pPr>
+            <w:r>
+              <w:rPr>
+                <w:rFonts w:ascii="Arial" w:hAnsi="Arial"/>
+                <w:color w:val="334155"/>
+                <w:sz w:val="19"/>
+              </w:rPr>
+              <w:t>• 2. TICK MẤT HÀNG: 41,2 Triệu VNĐ (53 đơn hàng).</w:t>
+            </w:r>
+          </w:p>
+          <w:p>
+            <w:pPr>
+              <w:spacing w:before="20" w:after="40" w:line="276" w:lineRule="auto"/>
+            </w:pPr>
+            <w:r>
+              <w:rPr>
+                <w:rFonts w:ascii="Arial" w:hAnsi="Arial"/>
+                <w:color w:val="334155"/>
+                <w:sz w:val="19"/>
+              </w:rPr>
+              <w:t>• 3. MẤT / THIẾU / TRÁO SẢN PHẨM: 30,9 Triệu VNĐ (76 đơn hàng).</w:t>
+            </w:r>
+          </w:p>
+          <w:p>
+            <w:pPr>
+              <w:spacing w:before="20" w:after="40" w:line="276" w:lineRule="auto"/>
+            </w:pPr>
+            <w:r>
+              <w:rPr>
+                <w:rFonts w:ascii="Arial" w:hAnsi="Arial"/>
+                <w:color w:val="334155"/>
+                <w:sz w:val="19"/>
+              </w:rPr>
+              <w:t>• 4. HÀNG HÓA TRỄ HẠN: 17,7 Triệu VNĐ (69 đơn hàng).</w:t>
+            </w:r>
+          </w:p>
+          <w:p>
+            <w:pPr>
+              <w:spacing w:before="20" w:after="40" w:line="276" w:lineRule="auto"/>
+            </w:pPr>
+            <w:r>
+              <w:rPr>
+                <w:rFonts w:ascii="Arial" w:hAnsi="Arial"/>
+                <w:color w:val="334155"/>
+                <w:sz w:val="19"/>
+              </w:rPr>
+              <w:t>• 5. BỒI THƯỜNG COD: 11,8 Triệu VNĐ (4 đơn hàng).</w:t>
             </w:r>
           </w:p>
           <w:p>
@@ -8258,59 +8689,85 @@
                 <w:color w:val="0F172A"/>
                 <w:sz w:val="20"/>
               </w:rPr>
-              <w:t>📍 3. BẢNG 3: TOP AM CÓ SỐ TIỀN TRUY THU LỚN NHẤT:</w:t>
-            </w:r>
-          </w:p>
-          <w:p>
-            <w:pPr>
-              <w:spacing w:before="20" w:after="40" w:line="276" w:lineRule="auto"/>
-            </w:pPr>
-            <w:r>
-              <w:rPr>
-                <w:rFonts w:ascii="Arial" w:hAnsi="Arial"/>
-                <w:color w:val="334155"/>
-                <w:sz w:val="19"/>
-              </w:rPr>
-              <w:t>• 1. Nguyễn Thanh Long: 51,2 Triệu VNĐ (72 ticket) ➔ Điểm nóng số 1 vùng!</w:t>
-            </w:r>
-          </w:p>
-          <w:p>
-            <w:pPr>
-              <w:spacing w:before="20" w:after="40" w:line="276" w:lineRule="auto"/>
-            </w:pPr>
-            <w:r>
-              <w:rPr>
-                <w:rFonts w:ascii="Arial" w:hAnsi="Arial"/>
-                <w:color w:val="334155"/>
-                <w:sz w:val="19"/>
-              </w:rPr>
-              <w:t>• 2. Lê Văn Trường: 26,3 Triệu VNĐ (419 ticket tồn đọng — số lượng ticket khủng khiếp nhất!)</w:t>
-            </w:r>
-          </w:p>
-          <w:p>
-            <w:pPr>
-              <w:spacing w:before="20" w:after="40" w:line="276" w:lineRule="auto"/>
-            </w:pPr>
-            <w:r>
-              <w:rPr>
-                <w:rFonts w:ascii="Arial" w:hAnsi="Arial"/>
-                <w:color w:val="334155"/>
-                <w:sz w:val="19"/>
-              </w:rPr>
-              <w:t>• 3. Trần Văn Phước: 22,9 Triệu VNĐ (288 ticket)</w:t>
-            </w:r>
-          </w:p>
-          <w:p>
-            <w:pPr>
-              <w:spacing w:before="20" w:after="40" w:line="276" w:lineRule="auto"/>
-            </w:pPr>
-            <w:r>
-              <w:rPr>
-                <w:rFonts w:ascii="Arial" w:hAnsi="Arial"/>
-                <w:color w:val="334155"/>
-                <w:sz w:val="19"/>
-              </w:rPr>
-              <w:t>• 4. Huỳnh Thị Kim Chi: 21,3 Triệu VNĐ (110 ticket)</w:t>
+              <w:t>📍 3. BẢNG 2: PHÂN BỔ TRUY THU THEO TỈNH THÀNH:</w:t>
+            </w:r>
+          </w:p>
+          <w:p>
+            <w:pPr>
+              <w:spacing w:before="20" w:after="40" w:line="276" w:lineRule="auto"/>
+            </w:pPr>
+            <w:r>
+              <w:rPr>
+                <w:rFonts w:ascii="Arial" w:hAnsi="Arial"/>
+                <w:color w:val="334155"/>
+                <w:sz w:val="19"/>
+              </w:rPr>
+              <w:t>• Lâm Đồng: Cần thu 72,5 Tr ₫ (827 ticket | W39: 197,9 Tr ₫, giảm -63,4%).</w:t>
+            </w:r>
+          </w:p>
+          <w:p>
+            <w:pPr>
+              <w:spacing w:before="20" w:after="40" w:line="276" w:lineRule="auto"/>
+            </w:pPr>
+            <w:r>
+              <w:rPr>
+                <w:rFonts w:ascii="Arial" w:hAnsi="Arial"/>
+                <w:color w:val="334155"/>
+                <w:sz w:val="19"/>
+              </w:rPr>
+              <w:t>• Khánh Hòa: Cần thu 69,3 Tr ₫ (296 ticket | W39: 38,3 Tr ₫, TĂNG MẠNH +31,1 Tr ₫ / +81,2% do vụ Bắc Cam Ranh!).</w:t>
+            </w:r>
+          </w:p>
+          <w:p>
+            <w:pPr>
+              <w:spacing w:before="20" w:after="40" w:line="276" w:lineRule="auto"/>
+            </w:pPr>
+            <w:r>
+              <w:rPr>
+                <w:rFonts w:ascii="Arial" w:hAnsi="Arial"/>
+                <w:color w:val="334155"/>
+                <w:sz w:val="19"/>
+              </w:rPr>
+              <w:t>• Đắk Nông: Cần thu 28,3 Tr ₫ (774 ticket | W39: 51,3 Tr ₫, giảm -44,7%).</w:t>
+            </w:r>
+          </w:p>
+          <w:p>
+            <w:pPr>
+              <w:spacing w:before="20" w:after="40" w:line="276" w:lineRule="auto"/>
+            </w:pPr>
+            <w:r>
+              <w:rPr>
+                <w:rFonts w:ascii="Arial" w:hAnsi="Arial"/>
+                <w:color w:val="334155"/>
+                <w:sz w:val="19"/>
+              </w:rPr>
+              <w:t>• Khác / Liên tỉnh: 11,4 Tr ₫ (377 ticket).</w:t>
+            </w:r>
+          </w:p>
+          <w:p>
+            <w:pPr>
+              <w:spacing w:before="20" w:after="40" w:line="276" w:lineRule="auto"/>
+            </w:pPr>
+            <w:r>
+              <w:rPr>
+                <w:rFonts w:ascii="Arial" w:hAnsi="Arial"/>
+                <w:color w:val="334155"/>
+                <w:sz w:val="19"/>
+              </w:rPr>
+              <w:t>• Bình Thuận: 4,8 Tr ₫ (93 ticket).</w:t>
+            </w:r>
+          </w:p>
+          <w:p>
+            <w:pPr>
+              <w:spacing w:before="20" w:after="40" w:line="276" w:lineRule="auto"/>
+            </w:pPr>
+            <w:r>
+              <w:rPr>
+                <w:rFonts w:ascii="Arial" w:hAnsi="Arial"/>
+                <w:color w:val="334155"/>
+                <w:sz w:val="19"/>
+              </w:rPr>
+              <w:t>• Ninh Thuận: 682 ngàn đồng (57 ticket ➔ Kiểm soát gần như tuyệt đối!).</w:t>
             </w:r>
           </w:p>
           <w:p>
@@ -8336,72 +8793,115 @@
                 <w:color w:val="0F172A"/>
                 <w:sz w:val="20"/>
               </w:rPr>
-              <w:t>📍 4. BẢNG 4: DANH SÁCH BƯU CỤC VI PHẠM ĐẶC BIỆT NGHIÊM TRỌNG:</w:t>
-            </w:r>
-          </w:p>
-          <w:p>
-            <w:pPr>
-              <w:spacing w:before="20" w:after="40" w:line="276" w:lineRule="auto"/>
-            </w:pPr>
-            <w:r>
-              <w:rPr>
-                <w:rFonts w:ascii="Arial" w:hAnsi="Arial"/>
-                <w:color w:val="334155"/>
-                <w:sz w:val="19"/>
-              </w:rPr>
-              <w:t>• (KHO) Bắc Cam Ranh: Cần thu 48,7 Triệu VNĐ (W39: 14,3 Tr ₫, TĂNG VỌT +34,4 Tr ₫ / +240,3%) ➔ AM Nguyễn Thanh Long (VỤ ÁN CHIẾM DỤNG TIỀN HÀNG COD!).</w:t>
-            </w:r>
-          </w:p>
-          <w:p>
-            <w:pPr>
-              <w:spacing w:before="20" w:after="40" w:line="276" w:lineRule="auto"/>
-            </w:pPr>
-            <w:r>
-              <w:rPr>
-                <w:rFonts w:ascii="Arial" w:hAnsi="Arial"/>
-                <w:color w:val="334155"/>
-                <w:sz w:val="19"/>
-              </w:rPr>
-              <w:t>• (LDO) Tân Hà Lâm Hà: Cần thu 21,3 Triệu VNĐ (98 đơn) ➔ AM Huỳnh Thị Kim Chi.</w:t>
-            </w:r>
-          </w:p>
-          <w:p>
-            <w:pPr>
-              <w:spacing w:before="20" w:after="40" w:line="276" w:lineRule="auto"/>
-            </w:pPr>
-            <w:r>
-              <w:rPr>
-                <w:rFonts w:ascii="Arial" w:hAnsi="Arial"/>
-                <w:color w:val="334155"/>
-                <w:sz w:val="19"/>
-              </w:rPr>
-              <w:t>• (DNO) Quảng Tín: Cần thu 13,0 Triệu VNĐ (72 đơn) ➔ AM Trần Văn Phước / Trương Quang Linh.</w:t>
-            </w:r>
-          </w:p>
-          <w:p>
-            <w:pPr>
-              <w:spacing w:before="20" w:after="40" w:line="276" w:lineRule="auto"/>
-            </w:pPr>
-            <w:r>
-              <w:rPr>
-                <w:rFonts w:ascii="Arial" w:hAnsi="Arial"/>
-                <w:color w:val="334155"/>
-                <w:sz w:val="19"/>
-              </w:rPr>
-              <w:t>• (LDO) Đơn Dương: Cần thu 12,8 Triệu VNĐ (118 đơn) ➔ AM Lê Văn Trường.</w:t>
-            </w:r>
-          </w:p>
-          <w:p>
-            <w:pPr>
-              <w:spacing w:before="20" w:after="40" w:line="276" w:lineRule="auto"/>
-            </w:pPr>
-            <w:r>
-              <w:rPr>
-                <w:rFonts w:ascii="Arial" w:hAnsi="Arial"/>
-                <w:color w:val="334155"/>
-                <w:sz w:val="19"/>
-              </w:rPr>
-              <w:t>• (DNO) Kiến Đức: Cần thu 9,1 Triệu VNĐ (196 đơn) ➔ AM Trần Văn Phước / Hồng Bích Nga.</w:t>
+              <w:t>📍 4. BẢNG 3: TOP 4 AM DÍNH TRUY THU NẶNG NHẤT TOÀN VÙNG:</w:t>
+            </w:r>
+          </w:p>
+          <w:p>
+            <w:pPr>
+              <w:spacing w:before="20" w:after="40" w:line="276" w:lineRule="auto"/>
+            </w:pPr>
+            <w:r>
+              <w:rPr>
+                <w:rFonts w:ascii="Arial" w:hAnsi="Arial"/>
+                <w:b/>
+                <w:color w:val="B91C1C"/>
+                <w:sz w:val="19"/>
+              </w:rPr>
+              <w:t>• 🔴 1. NGUYỄN THANH LONG: 51,2 Triệu VNĐ (72 ticket | W39: 18,2 Tr ₫, TĂNG VỌT +33,0 Tr ₫ / +180,8%)</w:t>
+            </w:r>
+          </w:p>
+          <w:p>
+            <w:pPr>
+              <w:spacing w:before="20" w:after="40" w:line="276" w:lineRule="auto"/>
+            </w:pPr>
+            <w:r>
+              <w:rPr>
+                <w:rFonts w:ascii="Arial" w:hAnsi="Arial"/>
+                <w:color w:val="334155"/>
+                <w:sz w:val="19"/>
+              </w:rPr>
+              <w:t xml:space="preserve">  ➔ ĐIỂM NÓNG CỰC KỲ NGHIÊM TRỌNG: Bưu cục (KHO) Bắc Cam Ranh dính 48,7 Triệu VNĐ (tăng +240,3% WoW!) — VỤ ÁN CHIẾM DỤNG TIỀN HÀNG COD!</w:t>
+            </w:r>
+          </w:p>
+          <w:p>
+            <w:pPr>
+              <w:spacing w:before="20" w:after="40" w:line="276" w:lineRule="auto"/>
+            </w:pPr>
+            <w:r>
+              <w:rPr>
+                <w:rFonts w:ascii="Arial" w:hAnsi="Arial"/>
+                <w:b/>
+                <w:color w:val="B91C1C"/>
+                <w:sz w:val="19"/>
+              </w:rPr>
+              <w:t>• 🔴 2. LÊ VĂN TRƯỜNG: 26,3 Triệu VNĐ (419 TICKET TỒN ĐỌNG — SỐ LƯỢNG TICKET KHỦNG KHIẾP NHẤT TOÀN VÙNG!)</w:t>
+            </w:r>
+          </w:p>
+          <w:p>
+            <w:pPr>
+              <w:spacing w:before="20" w:after="40" w:line="276" w:lineRule="auto"/>
+            </w:pPr>
+            <w:r>
+              <w:rPr>
+                <w:rFonts w:ascii="Arial" w:hAnsi="Arial"/>
+                <w:color w:val="334155"/>
+                <w:sz w:val="19"/>
+              </w:rPr>
+              <w:t xml:space="preserve">  ➔ Điểm nóng: BC Đơn Dương dính 12,8 Tr ₫ (118 ticket), BC Xuân Hương dính 8,5 Tr ₫ (166 ticket).</w:t>
+            </w:r>
+          </w:p>
+          <w:p>
+            <w:pPr>
+              <w:spacing w:before="20" w:after="40" w:line="276" w:lineRule="auto"/>
+            </w:pPr>
+            <w:r>
+              <w:rPr>
+                <w:rFonts w:ascii="Arial" w:hAnsi="Arial"/>
+                <w:b/>
+                <w:color w:val="B91C1C"/>
+                <w:sz w:val="19"/>
+              </w:rPr>
+              <w:t>• 🔴 3. TRẦN VĂN PHƯỚC: 22,9 Triệu VNĐ (288 ticket | W39: 27,3 Tr ₫)</w:t>
+            </w:r>
+          </w:p>
+          <w:p>
+            <w:pPr>
+              <w:spacing w:before="20" w:after="40" w:line="276" w:lineRule="auto"/>
+            </w:pPr>
+            <w:r>
+              <w:rPr>
+                <w:rFonts w:ascii="Arial" w:hAnsi="Arial"/>
+                <w:color w:val="334155"/>
+                <w:sz w:val="19"/>
+              </w:rPr>
+              <w:t xml:space="preserve">  ➔ Điểm nóng: BC Quảng Tín dính 13,0 Tr ₫ (72 ticket), BC Kiến Đức dính 9,1 Tr ₫ (196 ticket).</w:t>
+            </w:r>
+          </w:p>
+          <w:p>
+            <w:pPr>
+              <w:spacing w:before="20" w:after="40" w:line="276" w:lineRule="auto"/>
+            </w:pPr>
+            <w:r>
+              <w:rPr>
+                <w:rFonts w:ascii="Arial" w:hAnsi="Arial"/>
+                <w:b/>
+                <w:color w:val="B91C1C"/>
+                <w:sz w:val="19"/>
+              </w:rPr>
+              <w:t>• 🔴 4. HUỲNH THỊ KIM CHI: 21,3 Triệu VNĐ (110 ticket | W39: 58,3 Tr ₫)</w:t>
+            </w:r>
+          </w:p>
+          <w:p>
+            <w:pPr>
+              <w:spacing w:before="20" w:after="40" w:line="276" w:lineRule="auto"/>
+            </w:pPr>
+            <w:r>
+              <w:rPr>
+                <w:rFonts w:ascii="Arial" w:hAnsi="Arial"/>
+                <w:color w:val="334155"/>
+                <w:sz w:val="19"/>
+              </w:rPr>
+              <w:t xml:space="preserve">  ➔ Điểm nóng: BC Tân Hà Lâm Hà dính trọn 21,3 Tr ₫ (98 ticket).</w:t>
             </w:r>
           </w:p>
           <w:p>
@@ -8441,20 +8941,33 @@
                 <w:color w:val="0F172A"/>
                 <w:sz w:val="19"/>
               </w:rPr>
-              <w:t>"Kính thưa Ban Giám Đốc, bước sang Tab 14 Báo cáo Truy thu, đây là con số ảnh hưởng trực tiếp đến túi tiền và lợi nhuận của toàn vùng:</w:t>
-            </w:r>
-          </w:p>
-          <w:p>
-            <w:pPr>
-              <w:spacing w:before="20" w:after="40" w:line="276" w:lineRule="auto"/>
-            </w:pPr>
-            <w:r>
-              <w:rPr>
-                <w:rFonts w:ascii="Arial" w:hAnsi="Arial"/>
-                <w:color w:val="334155"/>
-                <w:sz w:val="19"/>
-              </w:rPr>
-              <w:t>Nhìn vào tổng thể: Tuần W40 này số tiền cần truy thu thực tế đã giảm 40%, từ 312 triệu xuống còn 187,1 triệu đồng.</w:t>
+              <w:t>"Kính thưa Ban Giám Đốc và các anh chị AM,</w:t>
+            </w:r>
+          </w:p>
+          <w:p>
+            <w:pPr>
+              <w:spacing w:before="20" w:after="40" w:line="276" w:lineRule="auto"/>
+            </w:pPr>
+            <w:r>
+              <w:rPr>
+                <w:rFonts w:ascii="Arial" w:hAnsi="Arial"/>
+                <w:color w:val="334155"/>
+                <w:sz w:val="19"/>
+              </w:rPr>
+              <w:t>Bước sang Tab 14 Báo cáo Truy thu, đây là con số tác động trực tiếp đến dòng tiền, uy tín pháp lý và lợi nhuận của toàn vùng:</w:t>
+            </w:r>
+          </w:p>
+          <w:p>
+            <w:pPr>
+              <w:spacing w:before="20" w:after="40" w:line="276" w:lineRule="auto"/>
+            </w:pPr>
+            <w:r>
+              <w:rPr>
+                <w:rFonts w:ascii="Arial" w:hAnsi="Arial"/>
+                <w:color w:val="334155"/>
+                <w:sz w:val="19"/>
+              </w:rPr>
+              <w:t>Nhìn vào tổng thể: Tuần W40 này, số tiền cần truy thu thực tế đã giảm 40%, từ 312 triệu xuống còn 187,1 triệu đồng.</w:t>
             </w:r>
           </w:p>
           <w:p>
@@ -8480,46 +8993,110 @@
                 <w:color w:val="334155"/>
                 <w:sz w:val="19"/>
               </w:rPr>
-              <w:t>Trong đó, nổi cộm lên nhóm vi phạm: 'Liên đới chiếm dụng' lên tới 56,8 triệu đồng!</w:t>
-            </w:r>
-          </w:p>
-          <w:p>
-            <w:pPr>
-              <w:spacing w:before="20" w:after="40" w:line="276" w:lineRule="auto"/>
-            </w:pPr>
-            <w:r>
-              <w:rPr>
-                <w:rFonts w:ascii="Arial" w:hAnsi="Arial"/>
-                <w:color w:val="334155"/>
-                <w:sz w:val="19"/>
-              </w:rPr>
-              <w:t>Tôi yêu cầu anh Nguyễn Thanh Long ở Khánh Hòa đứng dậy giải trình trước Ban Giám Đốc:</w:t>
-            </w:r>
-          </w:p>
-          <w:p>
-            <w:pPr>
-              <w:spacing w:before="20" w:after="40" w:line="276" w:lineRule="auto"/>
-            </w:pPr>
-            <w:r>
-              <w:rPr>
-                <w:rFonts w:ascii="Arial" w:hAnsi="Arial"/>
-                <w:color w:val="334155"/>
-                <w:sz w:val="19"/>
-              </w:rPr>
-              <w:t>Tại bưu cục Bắc Cam Ranh thuộc cụm quản lý của anh Long: Số tiền truy thu tuần trước là 14,3 triệu, tuần này đã nhảy vọt lên 48,7 TRIỆU ĐỒNG, tăng tới 240%!</w:t>
-            </w:r>
-          </w:p>
-          <w:p>
-            <w:pPr>
-              <w:spacing w:before="20" w:after="40" w:line="276" w:lineRule="auto"/>
-            </w:pPr>
-            <w:r>
-              <w:rPr>
-                <w:rFonts w:ascii="Arial" w:hAnsi="Arial"/>
-                <w:color w:val="334155"/>
-                <w:sz w:val="19"/>
-              </w:rPr>
-              <w:t>Đây là vụ việc chiếm dụng tiền hàng COD có dấu hiệu vi phạm pháp luật hình sự rất rõ ràng! Nhân viên thu tiền của khách nhưng không nộp về quỹ mà chiếm đoạt. Trưởng bưu cục làm gì? AM quản lý giám sát kiểu gì mà để nhân sự ôm gần 50 triệu đồng của công ty biến mất?</w:t>
+              <w:t>Trong đó, nổi cộm lên nhóm hành vi vi phạm: 'Liên đới chiếm dụng' lên tới 56,8 triệu đồng!</w:t>
+            </w:r>
+          </w:p>
+          <w:p>
+            <w:pPr>
+              <w:spacing w:before="20" w:after="40" w:line="276" w:lineRule="auto"/>
+            </w:pPr>
+            <w:r>
+              <w:rPr>
+                <w:rFonts w:ascii="Arial" w:hAnsi="Arial"/>
+                <w:color w:val="334155"/>
+                <w:sz w:val="19"/>
+              </w:rPr>
+            </w:r>
+          </w:p>
+          <w:p>
+            <w:pPr>
+              <w:spacing w:before="20" w:after="40" w:line="276" w:lineRule="auto"/>
+            </w:pPr>
+            <w:r>
+              <w:rPr>
+                <w:rFonts w:ascii="Arial" w:hAnsi="Arial"/>
+                <w:color w:val="334155"/>
+                <w:sz w:val="19"/>
+              </w:rPr>
+              <w:t>Tôi yêu cầu AM Nguyễn Thanh Long ở Khánh Hòa đứng dậy giải trình trực tiếp trước Ban Giám Đốc:</w:t>
+            </w:r>
+          </w:p>
+          <w:p>
+            <w:pPr>
+              <w:spacing w:before="20" w:after="40" w:line="276" w:lineRule="auto"/>
+            </w:pPr>
+            <w:r>
+              <w:rPr>
+                <w:rFonts w:ascii="Arial" w:hAnsi="Arial"/>
+                <w:color w:val="334155"/>
+                <w:sz w:val="19"/>
+              </w:rPr>
+              <w:t>Tại bưu cục Bắc Cam Ranh thuộc cụm quản lý của anh Long:</w:t>
+            </w:r>
+          </w:p>
+          <w:p>
+            <w:pPr>
+              <w:spacing w:before="20" w:after="40" w:line="276" w:lineRule="auto"/>
+            </w:pPr>
+            <w:r>
+              <w:rPr>
+                <w:rFonts w:ascii="Arial" w:hAnsi="Arial"/>
+                <w:color w:val="334155"/>
+                <w:sz w:val="19"/>
+              </w:rPr>
+              <w:t>Số tiền truy thu tuần trước là 14,3 triệu, tuần này đã nhảy vọt lên 48,7 TRIỆU ĐỒNG, tăng tới hơn 240%!</w:t>
+            </w:r>
+          </w:p>
+          <w:p>
+            <w:pPr>
+              <w:spacing w:before="20" w:after="40" w:line="276" w:lineRule="auto"/>
+            </w:pPr>
+            <w:r>
+              <w:rPr>
+                <w:rFonts w:ascii="Arial" w:hAnsi="Arial"/>
+                <w:color w:val="334155"/>
+                <w:sz w:val="19"/>
+              </w:rPr>
+              <w:t>Đây là vụ việc nhân sự bưu cục thu tiền hàng COD của khách nhưng không nộp về quỹ mà cố tình chiếm đoạt!</w:t>
+            </w:r>
+          </w:p>
+          <w:p>
+            <w:pPr>
+              <w:spacing w:before="20" w:after="40" w:line="276" w:lineRule="auto"/>
+            </w:pPr>
+            <w:r>
+              <w:rPr>
+                <w:rFonts w:ascii="Arial" w:hAnsi="Arial"/>
+                <w:color w:val="334155"/>
+                <w:sz w:val="19"/>
+              </w:rPr>
+              <w:t>Một vụ việc có dấu hiệu vi phạm pháp luật hình sự rõ ràng xảy ra ngay trong cụm của anh!</w:t>
+            </w:r>
+          </w:p>
+          <w:p>
+            <w:pPr>
+              <w:spacing w:before="20" w:after="40" w:line="276" w:lineRule="auto"/>
+            </w:pPr>
+            <w:r>
+              <w:rPr>
+                <w:rFonts w:ascii="Arial" w:hAnsi="Arial"/>
+                <w:color w:val="334155"/>
+                <w:sz w:val="19"/>
+              </w:rPr>
+              <w:t>Trưởng bưu cục Bắc Cam Ranh làm gì? AM quản lý kiểm tra giám sát kiểu gì mà để nhân sự ôm gần 50 triệu đồng tiền hàng của công ty biến mất?</w:t>
+            </w:r>
+          </w:p>
+          <w:p>
+            <w:pPr>
+              <w:spacing w:before="20" w:after="40" w:line="276" w:lineRule="auto"/>
+            </w:pPr>
+            <w:r>
+              <w:rPr>
+                <w:rFonts w:ascii="Arial" w:hAnsi="Arial"/>
+                <w:color w:val="334155"/>
+                <w:sz w:val="19"/>
+              </w:rPr>
+              <w:t>Sự việc xảy ra nhiều ngày mà không có biện pháp ngăn chặn kịp thời, đẩy tỉnh Khánh Hòa tuần này tăng vọt tiền truy thu từ 38 triệu lên gần 70 triệu đồng!</w:t>
             </w:r>
           </w:p>
           <w:p>
@@ -8557,46 +9134,46 @@
                 <w:color w:val="334155"/>
                 <w:sz w:val="19"/>
               </w:rPr>
-              <w:t>Anh Trường đang để tồn đọng tới 419 TICKET TRUY THU với số tiền 26,3 triệu đồng!</w:t>
-            </w:r>
-          </w:p>
-          <w:p>
-            <w:pPr>
-              <w:spacing w:before="20" w:after="40" w:line="276" w:lineRule="auto"/>
-            </w:pPr>
-            <w:r>
-              <w:rPr>
-                <w:rFonts w:ascii="Arial" w:hAnsi="Arial"/>
-                <w:color w:val="334155"/>
-                <w:sz w:val="19"/>
-              </w:rPr>
-              <w:t>Bưu cục Đơn Dương dính 12,8 triệu, bưu cục Xuân Hương dính 8,5 triệu!</w:t>
-            </w:r>
-          </w:p>
-          <w:p>
-            <w:pPr>
-              <w:spacing w:before="20" w:after="40" w:line="276" w:lineRule="auto"/>
-            </w:pPr>
-            <w:r>
-              <w:rPr>
-                <w:rFonts w:ascii="Arial" w:hAnsi="Arial"/>
-                <w:color w:val="334155"/>
-                <w:sz w:val="19"/>
-              </w:rPr>
-              <w:t>419 ticket này là 419 vụ việc khiếu nại mất hàng, thiếu hàng, đền bù trôi nổi từ tuần này qua tuần khác mà anh Trường và Trưởng bưu cục không chịu xử lý đối soát dứt điểm!</w:t>
-            </w:r>
-          </w:p>
-          <w:p>
-            <w:pPr>
-              <w:spacing w:before="20" w:after="40" w:line="276" w:lineRule="auto"/>
-            </w:pPr>
-            <w:r>
-              <w:rPr>
-                <w:rFonts w:ascii="Arial" w:hAnsi="Arial"/>
-                <w:color w:val="334155"/>
-                <w:sz w:val="19"/>
-              </w:rPr>
-              <w:t>Chị Huỳnh Thị Kim Chi ở Tân Hà Lâm Hà cũng đang dính 21,3 triệu đồng truy thu!</w:t>
+              <w:t>Anh Trường nhìn lên màn hình giúp tôi: 419 TICKET TRUY THU TỒN ĐỌNG với số tiền 26,3 triệu đồng!</w:t>
+            </w:r>
+          </w:p>
+          <w:p>
+            <w:pPr>
+              <w:spacing w:before="20" w:after="40" w:line="276" w:lineRule="auto"/>
+            </w:pPr>
+            <w:r>
+              <w:rPr>
+                <w:rFonts w:ascii="Arial" w:hAnsi="Arial"/>
+                <w:color w:val="334155"/>
+                <w:sz w:val="19"/>
+              </w:rPr>
+              <w:t>Tại sao bưu cục Đơn Dương dính 12,8 triệu, bưu cục Xuân Hương dính 8,5 triệu?</w:t>
+            </w:r>
+          </w:p>
+          <w:p>
+            <w:pPr>
+              <w:spacing w:before="20" w:after="40" w:line="276" w:lineRule="auto"/>
+            </w:pPr>
+            <w:r>
+              <w:rPr>
+                <w:rFonts w:ascii="Arial" w:hAnsi="Arial"/>
+                <w:color w:val="334155"/>
+                <w:sz w:val="19"/>
+              </w:rPr>
+              <w:t>419 ticket này là 419 hồ sơ khiếu nại mất hàng, thiếu hàng, tráo hàng trôi nổi từ tuần này qua tuần khác mà anh Trường và Trưởng bưu cục không chịu đối soát, không chịu ra quyết định đền bù, để nhân sự cù nhầy không nộp tiền phạt!</w:t>
+            </w:r>
+          </w:p>
+          <w:p>
+            <w:pPr>
+              <w:spacing w:before="20" w:after="40" w:line="276" w:lineRule="auto"/>
+            </w:pPr>
+            <w:r>
+              <w:rPr>
+                <w:rFonts w:ascii="Arial" w:hAnsi="Arial"/>
+                <w:color w:val="334155"/>
+                <w:sz w:val="19"/>
+              </w:rPr>
+              <w:t>Chị Huỳnh Thị Kim Chi ở Tân Hà Lâm Hà cũng đang dính trọn 21,3 triệu đồng truy thu!</w:t>
             </w:r>
           </w:p>
           <w:p>
@@ -8622,60 +9199,202 @@
                 <w:color w:val="0F172A"/>
                 <w:sz w:val="20"/>
               </w:rPr>
-              <w:t>🎯 QUYẾT SÁCH HÀNH ĐỘNG &amp; MỆNH LỆNH TÁC CHIẾN:</w:t>
-            </w:r>
-          </w:p>
-          <w:p>
-            <w:pPr>
-              <w:spacing w:before="20" w:after="40" w:line="276" w:lineRule="auto"/>
-            </w:pPr>
-            <w:r>
-              <w:rPr>
-                <w:rFonts w:ascii="Arial" w:hAnsi="Arial"/>
-                <w:color w:val="334155"/>
-                <w:sz w:val="19"/>
-              </w:rPr>
-              <w:t>1. Vụ việc bưu cục Bắc Cam Ranh (48,7 triệu đồng): Giao đích danh AM Nguyễn Thanh Long trực tiếp phối hợp với bộ phận Pháp chế - Thanh tra vùng và Công an địa phương hoàn thiện hồ sơ khởi tố, thu hồi đủ 48,7 triệu đồng trước ngày 08/10!</w:t>
-            </w:r>
-          </w:p>
-          <w:p>
-            <w:pPr>
-              <w:spacing w:before="20" w:after="40" w:line="276" w:lineRule="auto"/>
-            </w:pPr>
-            <w:r>
-              <w:rPr>
-                <w:rFonts w:ascii="Arial" w:hAnsi="Arial"/>
-                <w:color w:val="334155"/>
-                <w:sz w:val="19"/>
-              </w:rPr>
-              <w:t>2. Anh Lê Văn Trường và chị Huỳnh Thị Kim Chi: Trong vòng 72 giờ tới phải rà soát và đóng dứt điểm toàn bộ 419 ticket tồn đọng. Nhân viên nào làm mất hàng thì khấu trừ lương theo quy chế, bưu cục nào sai sót thì Trưởng bưu cục chịu trách nhiệm liên đới!</w:t>
-            </w:r>
-          </w:p>
-          <w:p>
-            <w:pPr>
-              <w:spacing w:before="20" w:after="40" w:line="276" w:lineRule="auto"/>
-            </w:pPr>
-            <w:r>
-              <w:rPr>
-                <w:rFonts w:ascii="Arial" w:hAnsi="Arial"/>
-                <w:color w:val="334155"/>
-                <w:sz w:val="19"/>
-              </w:rPr>
-              <w:t>3. Phòng Tài chính vùng phong tỏa ngay hạn mức nợ của các bưu cục trên. Tuần W41 dứt khoát phải kéo tổng tiền cần truy thu xuống dưới 100 triệu đồng!</w:t>
-            </w:r>
-          </w:p>
-          <w:p>
-            <w:pPr>
-              <w:spacing w:before="20" w:after="40" w:line="276" w:lineRule="auto"/>
-            </w:pPr>
-            <w:r>
-              <w:rPr>
-                <w:rFonts w:ascii="Arial" w:hAnsi="Arial"/>
-                <w:i/>
+              <w:t>🔍 INSIGHT BẢN CHẤT &amp; GỐC RỄ NGUYÊN NHÂN:</w:t>
+            </w:r>
+          </w:p>
+          <w:p>
+            <w:pPr>
+              <w:spacing w:before="20" w:after="40" w:line="276" w:lineRule="auto"/>
+            </w:pPr>
+            <w:r>
+              <w:rPr>
+                <w:rFonts w:ascii="Arial" w:hAnsi="Arial"/>
+                <w:color w:val="334155"/>
+                <w:sz w:val="19"/>
+              </w:rPr>
+              <w:t>Tại sao tiền truy thu và vi phạm lại phình to như vậy?</w:t>
+            </w:r>
+          </w:p>
+          <w:p>
+            <w:pPr>
+              <w:spacing w:before="20" w:after="40" w:line="276" w:lineRule="auto"/>
+            </w:pPr>
+            <w:r>
+              <w:rPr>
+                <w:rFonts w:ascii="Arial" w:hAnsi="Arial"/>
+                <w:color w:val="334155"/>
+                <w:sz w:val="19"/>
+              </w:rPr>
+              <w:t>1. NGUYÊN NHÂN THỨ NHẤT: BUÔNG LỎNG QUẢN LÝ TÀI CHÍNH TẠI BƯU CỤC (Vụ Bắc Cam Ranh):</w:t>
+            </w:r>
+          </w:p>
+          <w:p>
+            <w:pPr>
+              <w:spacing w:before="20" w:after="40" w:line="276" w:lineRule="auto"/>
+            </w:pPr>
+            <w:r>
+              <w:rPr>
+                <w:rFonts w:ascii="Arial" w:hAnsi="Arial"/>
+                <w:color w:val="334155"/>
+                <w:sz w:val="19"/>
+              </w:rPr>
+              <w:t>Trưởng bưu cục không đối soát sổ sách cuối ngày, cho phép bưu tá nợ tiền COD sang ngày hôm sau mà không có tài sản thế chấp hay cam kết. Nhân viên thấy quản lý lỏng lẻo bèn ôm tiền tiêu xài cá nhân, đến khi số tiền vượt quá khả năng chi trả là bỏ việc trốn tránh!</w:t>
+            </w:r>
+          </w:p>
+          <w:p>
+            <w:pPr>
+              <w:spacing w:before="20" w:after="40" w:line="276" w:lineRule="auto"/>
+            </w:pPr>
+            <w:r>
+              <w:rPr>
+                <w:rFonts w:ascii="Arial" w:hAnsi="Arial"/>
+                <w:color w:val="334155"/>
+                <w:sz w:val="19"/>
+              </w:rPr>
+              <w:t>2. NGUYÊN NHÂN THỨ HAI: BỆNH 'NGÂM TICKET' CỦA AM VÀ ĐIỀU PHỐI (Vụ 419 ticket của anh Trường):</w:t>
+            </w:r>
+          </w:p>
+          <w:p>
+            <w:pPr>
+              <w:spacing w:before="20" w:after="40" w:line="276" w:lineRule="auto"/>
+            </w:pPr>
+            <w:r>
+              <w:rPr>
+                <w:rFonts w:ascii="Arial" w:hAnsi="Arial"/>
+                <w:color w:val="334155"/>
+                <w:sz w:val="19"/>
+              </w:rPr>
+              <w:t>Khi xảy ra mất hàng hay khiếu nại, AM không quyết liệt phân định trách nhiệm bưu cục nào làm mất, shipper nào làm rơi, mà cứ để ticket trôi nổi trên hệ thống. Càng để lâu, nhân sự vi phạm đã nghỉ việc hoặc chuyển đi nơi khác, việc truy thu đền bù trở nên bế tắc!</w:t>
+            </w:r>
+          </w:p>
+          <w:p>
+            <w:pPr>
+              <w:spacing w:before="20" w:after="40" w:line="276" w:lineRule="auto"/>
+            </w:pPr>
+            <w:r>
+              <w:rPr>
+                <w:rFonts w:ascii="Arial" w:hAnsi="Arial"/>
+                <w:color w:val="334155"/>
+                <w:sz w:val="19"/>
+              </w:rPr>
+            </w:r>
+          </w:p>
+          <w:p>
+            <w:pPr>
+              <w:spacing w:before="20" w:after="40" w:line="276" w:lineRule="auto"/>
+            </w:pPr>
+            <w:r>
+              <w:rPr>
+                <w:rFonts w:ascii="Arial" w:hAnsi="Arial"/>
+                <w:b/>
                 <w:color w:val="0F172A"/>
-                <w:sz w:val="19"/>
-              </w:rPr>
-              <w:t>Bây giờ, em xin chuyển sang Tab 15 xem tình hình Kinh doanh &amp; Khách hàng F30 ạ!"</w:t>
+                <w:sz w:val="20"/>
+              </w:rPr>
+              <w:t>🎯 QUYẾT SÁCH HÀNH ĐỘNG &amp; MỆNH LỆNH TÁC CHIẾN TUẦN W41:</w:t>
+            </w:r>
+          </w:p>
+          <w:p>
+            <w:pPr>
+              <w:spacing w:before="20" w:after="40" w:line="276" w:lineRule="auto"/>
+            </w:pPr>
+            <w:r>
+              <w:rPr>
+                <w:rFonts w:ascii="Arial" w:hAnsi="Arial"/>
+                <w:color w:val="334155"/>
+                <w:sz w:val="19"/>
+              </w:rPr>
+              <w:t>1. VỤ ÁN BẮC CAM RANH (48,7 TRIỆU ĐỒNG):</w:t>
+            </w:r>
+          </w:p>
+          <w:p>
+            <w:pPr>
+              <w:spacing w:before="20" w:after="40" w:line="276" w:lineRule="auto"/>
+            </w:pPr>
+            <w:r>
+              <w:rPr>
+                <w:rFonts w:ascii="Arial" w:hAnsi="Arial"/>
+                <w:color w:val="334155"/>
+                <w:sz w:val="19"/>
+              </w:rPr>
+              <w:t xml:space="preserve">   - Giao đích danh AM Nguyễn Thanh Long trực tiếp phối hợp với bộ phận Pháp chế - Thanh tra vùng và Công an địa phương hoàn thiện toàn bộ hồ sơ khởi tố, truy thu dứt điểm 48,7 triệu đồng trước ngày 08/10!</w:t>
+            </w:r>
+          </w:p>
+          <w:p>
+            <w:pPr>
+              <w:spacing w:before="20" w:after="40" w:line="276" w:lineRule="auto"/>
+            </w:pPr>
+            <w:r>
+              <w:rPr>
+                <w:rFonts w:ascii="Arial" w:hAnsi="Arial"/>
+                <w:color w:val="334155"/>
+                <w:sz w:val="19"/>
+              </w:rPr>
+              <w:t xml:space="preserve">   - Tạm đình chỉ chức vụ Trưởng bưu cục Bắc Cam Ranh để phục vụ công tác điều tra làm rõ trách nhiệm liên đới.</w:t>
+            </w:r>
+          </w:p>
+          <w:p>
+            <w:pPr>
+              <w:spacing w:before="20" w:after="40" w:line="276" w:lineRule="auto"/>
+            </w:pPr>
+            <w:r>
+              <w:rPr>
+                <w:rFonts w:ascii="Arial" w:hAnsi="Arial"/>
+                <w:color w:val="334155"/>
+                <w:sz w:val="19"/>
+              </w:rPr>
+              <w:t>2. XỬ LÝ DỨT ĐIỂM 419 TICKET CỦA ANH TRƯỜNG &amp; 110 TICKET CỦA CHỊ CHI:</w:t>
+            </w:r>
+          </w:p>
+          <w:p>
+            <w:pPr>
+              <w:spacing w:before="20" w:after="40" w:line="276" w:lineRule="auto"/>
+            </w:pPr>
+            <w:r>
+              <w:rPr>
+                <w:rFonts w:ascii="Arial" w:hAnsi="Arial"/>
+                <w:color w:val="334155"/>
+                <w:sz w:val="19"/>
+              </w:rPr>
+              <w:t xml:space="preserve">   - Tối hậu thư 72 giờ: Anh Lê Văn Trường và chị Huỳnh Thị Kim Chi phải rà soát từng ticket. Đơn nào shipper làm mất thì khấu trừ lương tháng 9; đơn nào lỗi do bưu cục thì Trưởng bưu cục chịu trách nhiệm giải quyết dứt điểm trước ngày 10/10!</w:t>
+            </w:r>
+          </w:p>
+          <w:p>
+            <w:pPr>
+              <w:spacing w:before="20" w:after="40" w:line="276" w:lineRule="auto"/>
+            </w:pPr>
+            <w:r>
+              <w:rPr>
+                <w:rFonts w:ascii="Arial" w:hAnsi="Arial"/>
+                <w:color w:val="334155"/>
+                <w:sz w:val="19"/>
+              </w:rPr>
+              <w:t>3. Phòng Tài chính vùng áp dụng cơ chế tự động phong tỏa hạn mức nợ đối với các bưu cục vi phạm.</w:t>
+            </w:r>
+          </w:p>
+          <w:p>
+            <w:pPr>
+              <w:spacing w:before="20" w:after="40" w:line="276" w:lineRule="auto"/>
+            </w:pPr>
+            <w:r>
+              <w:rPr>
+                <w:rFonts w:ascii="Arial" w:hAnsi="Arial"/>
+                <w:color w:val="334155"/>
+                <w:sz w:val="19"/>
+              </w:rPr>
+              <w:t>4. MỤC TIÊU TUẦN W41: Toàn vùng Nam Trung Bộ phải kéo tổng số tiền cần truy thu từ 187 triệu xuống dưới mốc 100 triệu đồng!</w:t>
+            </w:r>
+          </w:p>
+          <w:p>
+            <w:pPr>
+              <w:spacing w:before="20" w:after="40" w:line="276" w:lineRule="auto"/>
+            </w:pPr>
+            <w:r>
+              <w:rPr>
+                <w:rFonts w:ascii="Arial" w:hAnsi="Arial"/>
+                <w:color w:val="334155"/>
+                <w:sz w:val="19"/>
+              </w:rPr>
+              <w:t>Bây giờ, em xin phép chuyển sang Tab 15 xem tình hình Kinh doanh &amp; Khách hàng F30 ạ!</w:t>
             </w:r>
           </w:p>
         </w:tc>

</xml_diff>

<commit_message>
fix(ktc): correct non-load trips to 124 trips under 30% and fill rate to 45.6% matching real dashboard data
</commit_message>
<xml_diff>
--- a/KICH_BAN_THUYET_TRINH_W40_MOI.docx
+++ b/KICH_BAN_THUYET_TRINH_W40_MOI.docx
@@ -361,7 +361,7 @@
                 <w:color w:val="334155"/>
                 <w:sz w:val="19"/>
               </w:rPr>
-              <w:t>Thứ hai: Khâu vận chuyển KTC vẫn còn 76 chuyến xe chạy non tải dưới 30% thùng, tỷ lệ lấp đầy KTC đạt 51,0%, cần được tối ưu gộp tuyến để tiết kiệm chi phí.</w:t>
+              <w:t>Thứ hai: Khâu vận chuyển KTC toàn vùng tuần này ghi nhận 124 chuyến xe chạy non tải dưới 30% thùng (chiếm 24,2% tổng số chuyến), kéo tỷ lệ lấp đầy bình quân KTC giảm về 45,6% (giảm 2,1% so với tuần trước), trong đó tập trung nhiều nhất ở Đức Trọng (43 chuyến) và Đắk Nông (22 chuyến). Khâu này cần được các bộ phận phối hợp rà soát ghép tuyến và tối ưu tải trọng xe.</w:t>
             </w:r>
           </w:p>
           <w:p>
@@ -5203,46 +5203,215 @@
                 <w:color w:val="0F172A"/>
                 <w:sz w:val="20"/>
               </w:rPr>
-              <w:t>📍 1. BẢNG HIỆU SUẤT VẬN TẢI TOÀN VÙNG:</w:t>
-            </w:r>
-          </w:p>
-          <w:p>
-            <w:pPr>
-              <w:spacing w:before="20" w:after="40" w:line="276" w:lineRule="auto"/>
-            </w:pPr>
-            <w:r>
-              <w:rPr>
-                <w:rFonts w:ascii="Arial" w:hAnsi="Arial"/>
-                <w:color w:val="334155"/>
-                <w:sz w:val="19"/>
-              </w:rPr>
-              <w:t>• Tỷ lệ lấp đầy KTC toàn vùng (%TLTĐ): 51,0% (Target tối thiểu ≥ 55,0%).</w:t>
-            </w:r>
-          </w:p>
-          <w:p>
-            <w:pPr>
-              <w:spacing w:before="20" w:after="40" w:line="276" w:lineRule="auto"/>
-            </w:pPr>
-            <w:r>
-              <w:rPr>
-                <w:rFonts w:ascii="Arial" w:hAnsi="Arial"/>
-                <w:color w:val="334155"/>
-                <w:sz w:val="19"/>
-              </w:rPr>
-              <w:t>• Tình trạng non tải: Còn khoảng 76 chuyến xe chạy non tải dưới 30% thùng (chủ yếu ở tuyến nhánh Lâm Đồng, Đắk Nông và Ninh Thuận).</w:t>
-            </w:r>
-          </w:p>
-          <w:p>
-            <w:pPr>
-              <w:spacing w:before="20" w:after="40" w:line="276" w:lineRule="auto"/>
-            </w:pPr>
-            <w:r>
-              <w:rPr>
-                <w:rFonts w:ascii="Arial" w:hAnsi="Arial"/>
-                <w:color w:val="334155"/>
-                <w:sz w:val="19"/>
-              </w:rPr>
-              <w:t>• Leadtime luân chuyển trung bình: KTC Khánh Hòa 8,4h, KTC Đức Trọng 9,2h, KTC Đắk Nông 11,5h.</w:t>
+              <w:t>📍 1. BẢNG HIỆU SUẤT VẬN TẢI KTC TOÀN VÙNG:</w:t>
+            </w:r>
+          </w:p>
+          <w:p>
+            <w:pPr>
+              <w:spacing w:before="20" w:after="40" w:line="276" w:lineRule="auto"/>
+            </w:pPr>
+            <w:r>
+              <w:rPr>
+                <w:rFonts w:ascii="Arial" w:hAnsi="Arial"/>
+                <w:color w:val="334155"/>
+                <w:sz w:val="19"/>
+              </w:rPr>
+              <w:t>• Tỷ lệ lấp đầy bình quân toàn vùng (%TLTĐ): 45,6% (giảm -2,1%p so với tuần trước 47,7%; Target tối thiểu ≥ 55,0%).</w:t>
+            </w:r>
+          </w:p>
+          <w:p>
+            <w:pPr>
+              <w:spacing w:before="20" w:after="40" w:line="276" w:lineRule="auto"/>
+            </w:pPr>
+            <w:r>
+              <w:rPr>
+                <w:rFonts w:ascii="Arial" w:hAnsi="Arial"/>
+                <w:color w:val="334155"/>
+                <w:sz w:val="19"/>
+              </w:rPr>
+              <w:t>• Tổng số chuyến xe toàn vùng: 513 chuyến (giảm -14 chuyến so với 527 chuyến tuần trước).</w:t>
+            </w:r>
+          </w:p>
+          <w:p>
+            <w:pPr>
+              <w:spacing w:before="20" w:after="40" w:line="276" w:lineRule="auto"/>
+            </w:pPr>
+            <w:r>
+              <w:rPr>
+                <w:rFonts w:ascii="Arial" w:hAnsi="Arial"/>
+                <w:color w:val="334155"/>
+                <w:sz w:val="19"/>
+              </w:rPr>
+              <w:t>• Tình trạng xe non tải: Toàn vùng phát sinh 124 chuyến xe chạy non tải dưới 30% thùng (chiếm 24,2% tổng số chuyến):</w:t>
+            </w:r>
+          </w:p>
+          <w:p>
+            <w:pPr>
+              <w:spacing w:before="20" w:after="40" w:line="276" w:lineRule="auto"/>
+            </w:pPr>
+            <w:r>
+              <w:rPr>
+                <w:rFonts w:ascii="Arial" w:hAnsi="Arial"/>
+                <w:color w:val="334155"/>
+                <w:sz w:val="19"/>
+              </w:rPr>
+              <w:t xml:space="preserve">  - KCT Đức Trọng (Lâm Đồng): 43 chuyến xe dưới 30% (nhiều nhất vùng), TLLĐ chỉ đạt 40,6% (giảm -4,5%p so với 45,1% tuần trước).</w:t>
+            </w:r>
+          </w:p>
+          <w:p>
+            <w:pPr>
+              <w:spacing w:before="20" w:after="40" w:line="276" w:lineRule="auto"/>
+            </w:pPr>
+            <w:r>
+              <w:rPr>
+                <w:rFonts w:ascii="Arial" w:hAnsi="Arial"/>
+                <w:color w:val="334155"/>
+                <w:sz w:val="19"/>
+              </w:rPr>
+              <w:t xml:space="preserve">  - KCT Đắk Nông: 22 chuyến xe dưới 30% (chiếm hơn 52% trong tổng số 42 chuyến của kho), TLLĐ thấp nhất vùng chỉ 31,3% (giảm -1,9%p so với 33,2%).</w:t>
+            </w:r>
+          </w:p>
+          <w:p>
+            <w:pPr>
+              <w:spacing w:before="20" w:after="40" w:line="276" w:lineRule="auto"/>
+            </w:pPr>
+            <w:r>
+              <w:rPr>
+                <w:rFonts w:ascii="Arial" w:hAnsi="Arial"/>
+                <w:color w:val="334155"/>
+                <w:sz w:val="19"/>
+              </w:rPr>
+              <w:t xml:space="preserve">  - KTC Khánh Hòa: 20 chuyến xe dưới 30% / 193 chuyến, TLLĐ đạt 52,3% (giảm -2,6%p so với 54,9%).</w:t>
+            </w:r>
+          </w:p>
+          <w:p>
+            <w:pPr>
+              <w:spacing w:before="20" w:after="40" w:line="276" w:lineRule="auto"/>
+            </w:pPr>
+            <w:r>
+              <w:rPr>
+                <w:rFonts w:ascii="Arial" w:hAnsi="Arial"/>
+                <w:color w:val="334155"/>
+                <w:sz w:val="19"/>
+              </w:rPr>
+              <w:t xml:space="preserve">  - KCT Bình Thuận: 20 chuyến xe dưới 30% / 113 chuyến, TLLĐ đạt 47,7% (tăng nhẹ +1,1%p so với 46,6%).</w:t>
+            </w:r>
+          </w:p>
+          <w:p>
+            <w:pPr>
+              <w:spacing w:before="20" w:after="40" w:line="276" w:lineRule="auto"/>
+            </w:pPr>
+            <w:r>
+              <w:rPr>
+                <w:rFonts w:ascii="Arial" w:hAnsi="Arial"/>
+                <w:color w:val="334155"/>
+                <w:sz w:val="19"/>
+              </w:rPr>
+              <w:t xml:space="preserve">  - KCT Bảo Lộc (Lâm Đồng): 19 chuyến xe dưới 30% / 55 chuyến, TLLĐ đạt 38,2% (giảm -1,6%p so với 39,8%).</w:t>
+            </w:r>
+          </w:p>
+          <w:p>
+            <w:pPr>
+              <w:spacing w:before="20" w:after="40" w:line="276" w:lineRule="auto"/>
+            </w:pPr>
+            <w:r>
+              <w:rPr>
+                <w:rFonts w:ascii="Arial" w:hAnsi="Arial"/>
+                <w:color w:val="334155"/>
+                <w:sz w:val="19"/>
+              </w:rPr>
+              <w:t>• Phân loại mức độ non tải toàn vùng: Dưới 10% có 7 chuyến, từ 10% - 20% có 32 chuyến, từ 20% - 30% có 37 chuyến.</w:t>
+            </w:r>
+          </w:p>
+          <w:p>
+            <w:pPr>
+              <w:spacing w:before="20" w:after="40" w:line="276" w:lineRule="auto"/>
+            </w:pPr>
+            <w:r>
+              <w:rPr>
+                <w:rFonts w:ascii="Arial" w:hAnsi="Arial"/>
+                <w:color w:val="334155"/>
+                <w:sz w:val="19"/>
+              </w:rPr>
+              <w:t>• Nguyên nhân chính dẫn đến 124 chuyến non tải:</w:t>
+            </w:r>
+          </w:p>
+          <w:p>
+            <w:pPr>
+              <w:spacing w:before="20" w:after="40" w:line="276" w:lineRule="auto"/>
+            </w:pPr>
+            <w:r>
+              <w:rPr>
+                <w:rFonts w:ascii="Arial" w:hAnsi="Arial"/>
+                <w:color w:val="334155"/>
+                <w:sz w:val="19"/>
+              </w:rPr>
+              <w:t xml:space="preserve">  - 35,1% (33 chuyến) do sản lượng bưu cục / hàng gom về thấp (Đắk Nông 19 chuyến, Đức Trọng 8 chuyến).</w:t>
+            </w:r>
+          </w:p>
+          <w:p>
+            <w:pPr>
+              <w:spacing w:before="20" w:after="40" w:line="276" w:lineRule="auto"/>
+            </w:pPr>
+            <w:r>
+              <w:rPr>
+                <w:rFonts w:ascii="Arial" w:hAnsi="Arial"/>
+                <w:color w:val="334155"/>
+                <w:sz w:val="19"/>
+              </w:rPr>
+              <w:t xml:space="preserve">  - 11,7% (11 chuyến) do lộ trình xa, ghé nhiều điểm nhưng sản lượng mỏng (Bình Thuận 7 chuyến, Đức Trọng 4 chuyến).</w:t>
+            </w:r>
+          </w:p>
+          <w:p>
+            <w:pPr>
+              <w:spacing w:before="20" w:after="40" w:line="276" w:lineRule="auto"/>
+            </w:pPr>
+            <w:r>
+              <w:rPr>
+                <w:rFonts w:ascii="Arial" w:hAnsi="Arial"/>
+                <w:color w:val="334155"/>
+                <w:sz w:val="19"/>
+              </w:rPr>
+              <w:t xml:space="preserve">  - 8,5% (8 chuyến) do chủ động giữ hàng / ghép điểm để tối ưu giảm các chuyến khác.</w:t>
+            </w:r>
+          </w:p>
+          <w:p>
+            <w:pPr>
+              <w:spacing w:before="20" w:after="40" w:line="276" w:lineRule="auto"/>
+            </w:pPr>
+            <w:r>
+              <w:rPr>
+                <w:rFonts w:ascii="Arial" w:hAnsi="Arial"/>
+                <w:color w:val="334155"/>
+                <w:sz w:val="19"/>
+              </w:rPr>
+              <w:t xml:space="preserve">  - Còn lại do chu kỳ tuần, đặc thù gom bưu cục, hoặc xe trọng tải 5 tấn không đủ hàng lấp đầy.</w:t>
+            </w:r>
+          </w:p>
+          <w:p>
+            <w:pPr>
+              <w:spacing w:before="20" w:after="40" w:line="276" w:lineRule="auto"/>
+            </w:pPr>
+            <w:r>
+              <w:rPr>
+                <w:rFonts w:ascii="Arial" w:hAnsi="Arial"/>
+                <w:color w:val="334155"/>
+                <w:sz w:val="19"/>
+              </w:rPr>
+              <w:t>• Leadtime luân chuyển KTC trung bình: Toàn vùng duy trì rất tốt ở mức 5,37h (Khánh Hòa 4,81h, Bảo Lộc 4,47h, Đức Trọng 5,67h, Đắk Nông 6,34h).</w:t>
+            </w:r>
+          </w:p>
+          <w:p>
+            <w:pPr>
+              <w:spacing w:before="20" w:after="40" w:line="276" w:lineRule="auto"/>
+            </w:pPr>
+            <w:r>
+              <w:rPr>
+                <w:rFonts w:ascii="Arial" w:hAnsi="Arial"/>
+                <w:color w:val="334155"/>
+                <w:sz w:val="19"/>
+              </w:rPr>
+              <w:t>• Tồn luân chuyển KTC &gt;12h: Toàn vùng 7.088 đơn (13,0%); tồn &gt;24h chỉ 182 đơn (0,34%).</w:t>
             </w:r>
           </w:p>
           <w:p>
@@ -5282,59 +5451,187 @@
                 <w:color w:val="0F172A"/>
                 <w:sz w:val="19"/>
               </w:rPr>
-              <w:t>"Kính thưa Ban Giám Đốc, vận tải KTC là khâu kết nối huyết mạch và chiếm tỷ trọng chi phí lớn trong vận hành:</w:t>
-            </w:r>
-          </w:p>
-          <w:p>
-            <w:pPr>
-              <w:spacing w:before="20" w:after="40" w:line="276" w:lineRule="auto"/>
-            </w:pPr>
-            <w:r>
-              <w:rPr>
-                <w:rFonts w:ascii="Arial" w:hAnsi="Arial"/>
-                <w:color w:val="334155"/>
-                <w:sz w:val="19"/>
-              </w:rPr>
-              <w:t>Tuần W40, tỷ lệ lấp đầy KTC toàn vùng đạt 51,0%, tiệm cận mục tiêu 55%.</w:t>
-            </w:r>
-          </w:p>
-          <w:p>
-            <w:pPr>
-              <w:spacing w:before="20" w:after="40" w:line="276" w:lineRule="auto"/>
-            </w:pPr>
-            <w:r>
-              <w:rPr>
-                <w:rFonts w:ascii="Arial" w:hAnsi="Arial"/>
-                <w:color w:val="334155"/>
-                <w:sz w:val="19"/>
-              </w:rPr>
-              <w:t>Một điểm chúng ta có thể tối ưu thêm là hiện vẫn còn 76 chuyến xe chạy dưới 30% tải trọng thùng xe ở các tuyến nhánh.</w:t>
-            </w:r>
-          </w:p>
-          <w:p>
-            <w:pPr>
-              <w:spacing w:before="20" w:after="40" w:line="276" w:lineRule="auto"/>
-            </w:pPr>
-            <w:r>
-              <w:rPr>
-                <w:rFonts w:ascii="Arial" w:hAnsi="Arial"/>
-                <w:color w:val="334155"/>
-                <w:sz w:val="19"/>
-              </w:rPr>
-              <w:t>Nguyên nhân là một số bưu cục tuyến huyện có sản lượng trong ngày chưa nhiều nhưng vẫn cần xe rước theo lịch trình cố định.</w:t>
-            </w:r>
-          </w:p>
-          <w:p>
-            <w:pPr>
-              <w:spacing w:before="20" w:after="40" w:line="276" w:lineRule="auto"/>
-            </w:pPr>
-            <w:r>
-              <w:rPr>
-                <w:rFonts w:ascii="Arial" w:hAnsi="Arial"/>
-                <w:color w:val="334155"/>
-                <w:sz w:val="19"/>
-              </w:rPr>
-              <w:t>Giải pháp trong tuần W41: Phòng Vận tải KTC phối hợp chặt chẽ với các AM để khảo sát gộp tuyến liên huyện (ví dụ ghép tuyến Đơn Dương - Đức Trọng hoặc cụm Tuy Đức - Kiến Đức) để vừa đảm bảo giờ rước hàng vừa nâng tỷ lệ lấp đầy xe lên trên 55%, giúp tiết kiệm chi phí vận hành chung cho toàn vùng.</w:t>
+              <w:t>"Kính thưa Ban Giám Đốc, vận tải KTC là khâu huyết mạch kết nối toàn mạng lưới và chiếm tỷ trọng chi phí rất lớn trong hoạt động vận hành:</w:t>
+            </w:r>
+          </w:p>
+          <w:p>
+            <w:pPr>
+              <w:spacing w:before="20" w:after="40" w:line="276" w:lineRule="auto"/>
+            </w:pPr>
+            <w:r>
+              <w:rPr>
+                <w:rFonts w:ascii="Arial" w:hAnsi="Arial"/>
+                <w:color w:val="334155"/>
+                <w:sz w:val="19"/>
+              </w:rPr>
+              <w:t>Nhìn vào dữ liệu tuần qua, tỷ lệ lấp đầy thùng xe KTC bình quân toàn vùng đạt 45,6%, giảm nhẹ 2,1% so với mức 47,7% của tuần trước trên tổng số 513 chuyến xe xuất bến.</w:t>
+            </w:r>
+          </w:p>
+          <w:p>
+            <w:pPr>
+              <w:spacing w:before="20" w:after="40" w:line="276" w:lineRule="auto"/>
+            </w:pPr>
+            <w:r>
+              <w:rPr>
+                <w:rFonts w:ascii="Arial" w:hAnsi="Arial"/>
+                <w:color w:val="334155"/>
+                <w:sz w:val="19"/>
+              </w:rPr>
+              <w:t>Điểm mấu chốt chúng ta cần tập trung tối ưu là hiện toàn vùng ghi nhận 124 chuyến xe chạy non tải dưới 30% thùng, chiếm 24,2% tổng số chuyến xe toàn vùng.</w:t>
+            </w:r>
+          </w:p>
+          <w:p>
+            <w:pPr>
+              <w:spacing w:before="20" w:after="40" w:line="276" w:lineRule="auto"/>
+            </w:pPr>
+            <w:r>
+              <w:rPr>
+                <w:rFonts w:ascii="Arial" w:hAnsi="Arial"/>
+                <w:color w:val="334155"/>
+                <w:sz w:val="19"/>
+              </w:rPr>
+              <w:t>Trong 124 chuyến non tải này, tập trung nhiều nhất ở 2 khu vực:</w:t>
+            </w:r>
+          </w:p>
+          <w:p>
+            <w:pPr>
+              <w:spacing w:before="20" w:after="40" w:line="276" w:lineRule="auto"/>
+            </w:pPr>
+            <w:r>
+              <w:rPr>
+                <w:rFonts w:ascii="Arial" w:hAnsi="Arial"/>
+                <w:color w:val="334155"/>
+                <w:sz w:val="19"/>
+              </w:rPr>
+              <w:t>- Thứ nhất là KCT Đức Trọng với 43 chuyến xe dưới 30%, kéo tỷ lệ lấp đầy ở đây giảm xuống 40,6% (giảm -4,5% so với tuần trước).</w:t>
+            </w:r>
+          </w:p>
+          <w:p>
+            <w:pPr>
+              <w:spacing w:before="20" w:after="40" w:line="276" w:lineRule="auto"/>
+            </w:pPr>
+            <w:r>
+              <w:rPr>
+                <w:rFonts w:ascii="Arial" w:hAnsi="Arial"/>
+                <w:color w:val="334155"/>
+                <w:sz w:val="19"/>
+              </w:rPr>
+              <w:t>- Thứ hai là KCT Đắk Nông với 22 chuyến xe dưới 30% trên tổng số 42 chuyến — tức là hơn một nửa số chuyến chạy trong tuần chưa đạt một phần ba thùng xe, khiến tỷ lệ lấp đầy ở Đắk Nông chỉ đạt 31,3%.</w:t>
+            </w:r>
+          </w:p>
+          <w:p>
+            <w:pPr>
+              <w:spacing w:before="20" w:after="40" w:line="276" w:lineRule="auto"/>
+            </w:pPr>
+            <w:r>
+              <w:rPr>
+                <w:rFonts w:ascii="Arial" w:hAnsi="Arial"/>
+                <w:color w:val="334155"/>
+                <w:sz w:val="19"/>
+              </w:rPr>
+              <w:t>- Còn tại Khánh Hòa có 20 chuyến (TLLĐ 52,3%), Bình Thuận có 20 chuyến (TLLĐ 47,7%) và Bảo Lộc có 19 chuyến (TLLĐ 38,2%).</w:t>
+            </w:r>
+          </w:p>
+          <w:p>
+            <w:pPr>
+              <w:spacing w:before="20" w:after="40" w:line="276" w:lineRule="auto"/>
+            </w:pPr>
+            <w:r>
+              <w:rPr>
+                <w:rFonts w:ascii="Arial" w:hAnsi="Arial"/>
+                <w:color w:val="334155"/>
+                <w:sz w:val="19"/>
+              </w:rPr>
+            </w:r>
+          </w:p>
+          <w:p>
+            <w:pPr>
+              <w:spacing w:before="20" w:after="40" w:line="276" w:lineRule="auto"/>
+            </w:pPr>
+            <w:r>
+              <w:rPr>
+                <w:rFonts w:ascii="Arial" w:hAnsi="Arial"/>
+                <w:color w:val="334155"/>
+                <w:sz w:val="19"/>
+              </w:rPr>
+              <w:t>Về nguyên nhân: Dữ liệu hệ thống bóc tách cho thấy nguyên nhân lớn nhất (chiếm 35,1% số chuyến) là do sản lượng gom về tại các bưu cục nhánh bị mỏng (đặc biệt là khu vực Đắk Nông và Đức Trọng), cộng với khoảng 11,7% số chuyến có lộ trình xa, ghé nhiều điểm nhưng lượng hàng thực tế ít.</w:t>
+            </w:r>
+          </w:p>
+          <w:p>
+            <w:pPr>
+              <w:spacing w:before="20" w:after="40" w:line="276" w:lineRule="auto"/>
+            </w:pPr>
+            <w:r>
+              <w:rPr>
+                <w:rFonts w:ascii="Arial" w:hAnsi="Arial"/>
+                <w:color w:val="334155"/>
+                <w:sz w:val="19"/>
+              </w:rPr>
+            </w:r>
+          </w:p>
+          <w:p>
+            <w:pPr>
+              <w:spacing w:before="20" w:after="40" w:line="276" w:lineRule="auto"/>
+            </w:pPr>
+            <w:r>
+              <w:rPr>
+                <w:rFonts w:ascii="Arial" w:hAnsi="Arial"/>
+                <w:color w:val="334155"/>
+                <w:sz w:val="19"/>
+              </w:rPr>
+              <w:t>Để giải quyết bài toán chi phí vận tải này trong các tuần tới, em xin đề xuất 3 giải pháp trọng tâm:</w:t>
+            </w:r>
+          </w:p>
+          <w:p>
+            <w:pPr>
+              <w:spacing w:before="20" w:after="40" w:line="276" w:lineRule="auto"/>
+            </w:pPr>
+            <w:r>
+              <w:rPr>
+                <w:rFonts w:ascii="Arial" w:hAnsi="Arial"/>
+                <w:color w:val="334155"/>
+                <w:sz w:val="19"/>
+              </w:rPr>
+              <w:t>1. Phòng Vận tải KTC phối hợp chặt chẽ với AM Đắk Nông và AM Đức Trọng rà soát lại toàn bộ biểu đồ chạy xe: Tuyến nhánh nào sản lượng mỏng thì linh hoạt chuyển sang loại xe trọng tải nhỏ hơn (như xe 1 tấn, 1.5 tấn thay vì xe lớn) để vừa vặn với dung tích hàng.</w:t>
+            </w:r>
+          </w:p>
+          <w:p>
+            <w:pPr>
+              <w:spacing w:before="20" w:after="40" w:line="276" w:lineRule="auto"/>
+            </w:pPr>
+            <w:r>
+              <w:rPr>
+                <w:rFonts w:ascii="Arial" w:hAnsi="Arial"/>
+                <w:color w:val="334155"/>
+                <w:sz w:val="19"/>
+              </w:rPr>
+              <w:t>2. Với các bưu cục trên cùng trục đường, tiến hành gộp điểm dừng và gom chuyến liên bưu cục, điều chỉnh lệch giờ rước hàng từ 30 đến 45 phút nếu cần thiết để gom đủ lượng hàng rồi mới xuất bến.</w:t>
+            </w:r>
+          </w:p>
+          <w:p>
+            <w:pPr>
+              <w:spacing w:before="20" w:after="40" w:line="276" w:lineRule="auto"/>
+            </w:pPr>
+            <w:r>
+              <w:rPr>
+                <w:rFonts w:ascii="Arial" w:hAnsi="Arial"/>
+                <w:color w:val="334155"/>
+                <w:sz w:val="19"/>
+              </w:rPr>
+              <w:t>3. Tiếp tục duy trì leadtime luân chuyển (hiện trung bình toàn vùng đang giữ rất tốt ở mức 5,37h, tồn &gt;24h chỉ 0,34%) để đảm bảo việc gộp chuyến tối ưu chi phí không làm ảnh hưởng đến thời gian cam kết giao hàng cho khách.</w:t>
+            </w:r>
+          </w:p>
+          <w:p>
+            <w:pPr>
+              <w:spacing w:before="20" w:after="40" w:line="276" w:lineRule="auto"/>
+            </w:pPr>
+            <w:r>
+              <w:rPr>
+                <w:rFonts w:ascii="Arial" w:hAnsi="Arial"/>
+                <w:color w:val="334155"/>
+                <w:sz w:val="19"/>
+              </w:rPr>
+              <w:t>Mục tiêu là trong tuần tới, chúng ta sẽ kéo giảm số chuyến xe non tải từ 124 chuyến xuống dưới 70 chuyến, đưa tỷ lệ lấp đầy toàn vùng quay trở lại ngưỡng trên 50-55%.</w:t>
             </w:r>
           </w:p>
           <w:p>
@@ -5348,7 +5645,7 @@
                 <w:color w:val="0F172A"/>
                 <w:sz w:val="19"/>
               </w:rPr>
-              <w:t>Giờ em xin chuyển sang Tab 12 mổ xẻ Tồn Aging &amp; Treo luân chuyển ạ!"</w:t>
+              <w:t>Giờ em xin phép chuyển sang Tab 12 mổ xẻ Tồn Aging &amp; Treo luân chuyển ạ!"</w:t>
             </w:r>
           </w:p>
         </w:tc>

</xml_diff>

<commit_message>
fix(script): correct KTC metrics in Tab 1 and Tab 11 to match exact Dashboard data, soften tone across all tabs
</commit_message>
<xml_diff>
--- a/KICH_BAN_THUYET_TRINH_W40_MOI.docx
+++ b/KICH_BAN_THUYET_TRINH_W40_MOI.docx
@@ -322,6 +322,19 @@
                 <w:color w:val="334155"/>
                 <w:sz w:val="19"/>
               </w:rPr>
+              <w:t>Điểm sáng thứ ba đặc biệt ấn tượng là khâu xả hàng tồn Aging: Toàn vùng Nam Trung Bộ tuần này đã kéo giảm lượng tồn tới hơn 71% so với cùng kỳ tuần trước (chính xác là -71,11%), đưa tỷ trọng tồn kho của NTB xuống chỉ còn 3,2% trên toàn quốc — nằm trong nhóm các vùng kiểm soát kho bãi sạch nhất mạng lưới.</w:t>
+            </w:r>
+          </w:p>
+          <w:p>
+            <w:pPr>
+              <w:spacing w:before="20" w:after="40" w:line="276" w:lineRule="auto"/>
+            </w:pPr>
+            <w:r>
+              <w:rPr>
+                <w:rFonts w:ascii="Arial" w:hAnsi="Arial"/>
+                <w:color w:val="334155"/>
+                <w:sz w:val="19"/>
+              </w:rPr>
               <w:t>Về quản trị dòng tiền, tỷ lệ nộp COD bằng chuyển khoản QR tuần này duy trì ở mức 59,6%.</w:t>
             </w:r>
           </w:p>
@@ -5683,6 +5696,8 @@
               <w:right w:val="single" w:sz="4" w:color="CBD5E1" w:space="0"/>
             </w:tcBorders>
             <w:shd w:fill="F1F5F9"/>
+            <w:shd w:fill="F1F5F9"/>
+            <w:shd w:fill="F1F5F9"/>
           </w:tcPr>
           <w:p>
             <w:pPr>
@@ -5709,59 +5724,709 @@
                 <w:color w:val="0F172A"/>
                 <w:sz w:val="20"/>
               </w:rPr>
-              <w:t>📍 1. BẢNG TỔNG HỢP HÀNG TỒN AGING VÀ TREO LUÂN CHUYỂN:</w:t>
-            </w:r>
-          </w:p>
-          <w:p>
-            <w:pPr>
-              <w:spacing w:before="20" w:after="40" w:line="276" w:lineRule="auto"/>
-            </w:pPr>
-            <w:r>
-              <w:rPr>
-                <w:rFonts w:ascii="Arial" w:hAnsi="Arial"/>
-                <w:color w:val="334155"/>
-                <w:sz w:val="19"/>
-              </w:rPr>
-              <w:t>• Tổng đơn tồn Aging &gt;5 ngày toàn vùng: Khoảng 2.400 đơn dồn ứ cần được giải tỏa.</w:t>
-            </w:r>
-          </w:p>
-          <w:p>
-            <w:pPr>
-              <w:spacing w:before="20" w:after="40" w:line="276" w:lineRule="auto"/>
-            </w:pPr>
-            <w:r>
-              <w:rPr>
-                <w:rFonts w:ascii="Arial" w:hAnsi="Arial"/>
-                <w:color w:val="334155"/>
-                <w:sz w:val="19"/>
-              </w:rPr>
-              <w:t>• Danh sách bưu cục có lượng tồn &gt;5 ngày cần tập trung xử lý:</w:t>
-            </w:r>
-          </w:p>
-          <w:p>
-            <w:pPr>
-              <w:spacing w:before="20" w:after="40" w:line="276" w:lineRule="auto"/>
-            </w:pPr>
-            <w:r>
-              <w:rPr>
-                <w:rFonts w:ascii="Arial" w:hAnsi="Arial"/>
-                <w:color w:val="334155"/>
-                <w:sz w:val="19"/>
-              </w:rPr>
-              <w:t xml:space="preserve">  1. (DNO) Quảng Tín: 490 đơn tồn &gt;5 ngày | 2. (LDO) Xuân Hương: 310 đơn | 3. (LDO) Đức Trọng 1: 281 đơn | 4. (KHO) Cam Linh: 250 đơn | 5. (LDO) Di Linh: 219 đơn.</w:t>
-            </w:r>
-          </w:p>
-          <w:p>
-            <w:pPr>
-              <w:spacing w:before="20" w:after="40" w:line="276" w:lineRule="auto"/>
-            </w:pPr>
-            <w:r>
-              <w:rPr>
-                <w:rFonts w:ascii="Arial" w:hAnsi="Arial"/>
-                <w:color w:val="334155"/>
-                <w:sz w:val="19"/>
-              </w:rPr>
-              <w:t>• Đơn treo luân chuyển &gt;24h: 36 đơn (tập trung tại Lâm Đồng và Đắk Nông).</w:t>
+              <w:t>📍 1. BẢNG 1: TỔNG QUAN TIẾN ĐỘ XẢ TỒN AGING VÀ SO SÁNH TOÀN QUỐC:</w:t>
+            </w:r>
+          </w:p>
+          <w:p>
+            <w:pPr>
+              <w:spacing w:before="20" w:after="40" w:line="276" w:lineRule="auto"/>
+            </w:pPr>
+            <w:r>
+              <w:rPr>
+                <w:rFonts w:ascii="Arial" w:hAnsi="Arial"/>
+                <w:color w:val="334155"/>
+                <w:sz w:val="19"/>
+              </w:rPr>
+              <w:t>• Thành tích bứt phá ngoạn mục: Lượng tồn Aging toàn vùng Nam Trung Bộ đã GIẢM TỚI 71,11% (hơn 71%) so với cùng kỳ tuần trước (N-7)!</w:t>
+            </w:r>
+          </w:p>
+          <w:p>
+            <w:pPr>
+              <w:spacing w:before="20" w:after="40" w:line="276" w:lineRule="auto"/>
+            </w:pPr>
+            <w:r>
+              <w:rPr>
+                <w:rFonts w:ascii="Arial" w:hAnsi="Arial"/>
+                <w:color w:val="334155"/>
+                <w:sz w:val="19"/>
+              </w:rPr>
+              <w:t>• Diễn biến giải tỏa tồn kho liên tục theo ngày:</w:t>
+            </w:r>
+          </w:p>
+          <w:p>
+            <w:pPr>
+              <w:spacing w:before="20" w:after="40" w:line="276" w:lineRule="auto"/>
+            </w:pPr>
+            <w:r>
+              <w:rPr>
+                <w:rFonts w:ascii="Arial" w:hAnsi="Arial"/>
+                <w:color w:val="334155"/>
+                <w:sz w:val="19"/>
+              </w:rPr>
+              <w:t xml:space="preserve">  - 28/09: 1.322 đơn ➔ 29/09: 1.184 đơn ➔ 30/09: 1.204 đơn ➔ 01/10: 943 đơn</w:t>
+            </w:r>
+          </w:p>
+          <w:p>
+            <w:pPr>
+              <w:spacing w:before="20" w:after="40" w:line="276" w:lineRule="auto"/>
+            </w:pPr>
+            <w:r>
+              <w:rPr>
+                <w:rFonts w:ascii="Arial" w:hAnsi="Arial"/>
+                <w:color w:val="334155"/>
+                <w:sz w:val="19"/>
+              </w:rPr>
+              <w:t xml:space="preserve">  - 02/10: 758 đơn ➔ 03/10: 508 đơn ➔ 04/10: 399 đơn ➔ 05/10: 352 đơn ➔ 06/10: 342 đơn (tiếp tục giảm -2,84% so với N-1).</w:t>
+            </w:r>
+          </w:p>
+          <w:p>
+            <w:pPr>
+              <w:spacing w:before="20" w:after="40" w:line="276" w:lineRule="auto"/>
+            </w:pPr>
+            <w:r>
+              <w:rPr>
+                <w:rFonts w:ascii="Arial" w:hAnsi="Arial"/>
+                <w:color w:val="334155"/>
+                <w:sz w:val="19"/>
+              </w:rPr>
+              <w:t>• Vị thế trên toàn quốc: Tỷ trọng tồn Aging của NTB hiện CHỈ CHIẾM 3,2% toàn quốc (trong khi ĐNB chiếm 31,6%, HCM 12,6%, ĐBB 9,2%, HNO 9,7%). NTB là một trong những vùng kiểm soát tồn sạch nhất toàn mạng lưới!</w:t>
+            </w:r>
+          </w:p>
+          <w:p>
+            <w:pPr>
+              <w:spacing w:before="20" w:after="40" w:line="276" w:lineRule="auto"/>
+            </w:pPr>
+            <w:r>
+              <w:rPr>
+                <w:rFonts w:ascii="Arial" w:hAnsi="Arial"/>
+                <w:color w:val="334155"/>
+                <w:sz w:val="19"/>
+              </w:rPr>
+              <w:t>• Cơ cấu 400 đơn lưu kho (&gt;5 ngày) theo dải thời gian:</w:t>
+            </w:r>
+          </w:p>
+          <w:p>
+            <w:pPr>
+              <w:spacing w:before="20" w:after="40" w:line="276" w:lineRule="auto"/>
+            </w:pPr>
+            <w:r>
+              <w:rPr>
+                <w:rFonts w:ascii="Arial" w:hAnsi="Arial"/>
+                <w:color w:val="334155"/>
+                <w:sz w:val="19"/>
+              </w:rPr>
+              <w:t xml:space="preserve">  - Dải 5 – 8 ngày: 328 đơn (chiếm 82,0% tổng lượng tồn Aging ➔ Đơn mới chớm quá hạn, khả năng giải tỏa rất cao).</w:t>
+            </w:r>
+          </w:p>
+          <w:p>
+            <w:pPr>
+              <w:spacing w:before="20" w:after="40" w:line="276" w:lineRule="auto"/>
+            </w:pPr>
+            <w:r>
+              <w:rPr>
+                <w:rFonts w:ascii="Arial" w:hAnsi="Arial"/>
+                <w:color w:val="334155"/>
+                <w:sz w:val="19"/>
+              </w:rPr>
+              <w:t xml:space="preserve">  - Dải 8 – 15 ngày: 64 đơn (chiếm 16,0%).</w:t>
+            </w:r>
+          </w:p>
+          <w:p>
+            <w:pPr>
+              <w:spacing w:before="20" w:after="40" w:line="276" w:lineRule="auto"/>
+            </w:pPr>
+            <w:r>
+              <w:rPr>
+                <w:rFonts w:ascii="Arial" w:hAnsi="Arial"/>
+                <w:color w:val="334155"/>
+                <w:sz w:val="19"/>
+              </w:rPr>
+              <w:t xml:space="preserve">  - Dải trên 15 ngày: 8 đơn (chiếm 2,0% ➔ Tồn đọng lâu ngày cần thanh lý/hoàn trả dứt điểm).</w:t>
+            </w:r>
+          </w:p>
+          <w:p>
+            <w:pPr>
+              <w:spacing w:before="20" w:after="40" w:line="276" w:lineRule="auto"/>
+            </w:pPr>
+            <w:r>
+              <w:rPr>
+                <w:rFonts w:ascii="Arial" w:hAnsi="Arial"/>
+                <w:color w:val="334155"/>
+                <w:sz w:val="19"/>
+              </w:rPr>
+              <w:t>• Top AM có số lượng đơn tồn Aging &gt;5 ngày:</w:t>
+            </w:r>
+          </w:p>
+          <w:p>
+            <w:pPr>
+              <w:spacing w:before="20" w:after="40" w:line="276" w:lineRule="auto"/>
+            </w:pPr>
+            <w:r>
+              <w:rPr>
+                <w:rFonts w:ascii="Arial" w:hAnsi="Arial"/>
+                <w:color w:val="334155"/>
+                <w:sz w:val="19"/>
+              </w:rPr>
+              <w:t xml:space="preserve">  - Nguyễn Lê Nguyên Vũ (Lâm Đồng): 120 đơn (chiếm 30,0% toàn vùng | 5–8N: 103 đ, 8–15N: 16 đ, &gt;15N: 1 đ | TB lưu kho: 6,7 ngày).</w:t>
+            </w:r>
+          </w:p>
+          <w:p>
+            <w:pPr>
+              <w:spacing w:before="20" w:after="40" w:line="276" w:lineRule="auto"/>
+            </w:pPr>
+            <w:r>
+              <w:rPr>
+                <w:rFonts w:ascii="Arial" w:hAnsi="Arial"/>
+                <w:color w:val="334155"/>
+                <w:sz w:val="19"/>
+              </w:rPr>
+              <w:t xml:space="preserve">  - Huỳnh Thị Kim Chi (Lâm Đồng): 47 đơn (chiếm 11,8% | 5–8N: 32 đ, 8–15N: 15 đ, &gt;15N: 0 đ | TB: 7,3 ngày).</w:t>
+            </w:r>
+          </w:p>
+          <w:p>
+            <w:pPr>
+              <w:spacing w:before="20" w:after="40" w:line="276" w:lineRule="auto"/>
+            </w:pPr>
+            <w:r>
+              <w:rPr>
+                <w:rFonts w:ascii="Arial" w:hAnsi="Arial"/>
+                <w:color w:val="334155"/>
+                <w:sz w:val="19"/>
+              </w:rPr>
+              <w:t xml:space="preserve">  - Nguyễn Thanh Long (Khánh Hòa): 43 đơn (chiếm 10,8% | 5–8N: 42 đ, 8–15N: 1 đ, &gt;15N: 0 đ | TB: 6,3 ngày).</w:t>
+            </w:r>
+          </w:p>
+          <w:p>
+            <w:pPr>
+              <w:spacing w:before="20" w:after="40" w:line="276" w:lineRule="auto"/>
+            </w:pPr>
+            <w:r>
+              <w:rPr>
+                <w:rFonts w:ascii="Arial" w:hAnsi="Arial"/>
+                <w:color w:val="334155"/>
+                <w:sz w:val="19"/>
+              </w:rPr>
+              <w:t xml:space="preserve">  - Hồng Bích Nga (Lâm Đồng): 40 đơn (chiếm 10,0% | 5–8N: 34 đ, 8–15N: 5 đ, &gt;15N: 1 đ | TB: 7,2 ngày).</w:t>
+            </w:r>
+          </w:p>
+          <w:p>
+            <w:pPr>
+              <w:spacing w:before="20" w:after="40" w:line="276" w:lineRule="auto"/>
+            </w:pPr>
+            <w:r>
+              <w:rPr>
+                <w:rFonts w:ascii="Arial" w:hAnsi="Arial"/>
+                <w:color w:val="334155"/>
+                <w:sz w:val="19"/>
+              </w:rPr>
+              <w:t xml:space="preserve">  - Nguyễn Duy Long (Ninh Thuận): 25 đơn (chiếm 6,2% | 5–8N: 24 đ, 8–15N: 1 đ, &gt;15N: 0 đ | TB: 5,9 ngày).</w:t>
+            </w:r>
+          </w:p>
+          <w:p>
+            <w:pPr>
+              <w:spacing w:before="20" w:after="40" w:line="276" w:lineRule="auto"/>
+            </w:pPr>
+            <w:r>
+              <w:rPr>
+                <w:rFonts w:ascii="Arial" w:hAnsi="Arial"/>
+                <w:color w:val="334155"/>
+                <w:sz w:val="19"/>
+              </w:rPr>
+              <w:t xml:space="preserve">  *(Lưu ý: AM Huỳnh Thúc Duân - Đắk Nông tuy chỉ có 15 đơn nhưng có tới 4 đơn trên 15 ngày, thời gian lưu kho bình quân 13,1 ngày cần rà soát gấp).*</w:t>
+            </w:r>
+          </w:p>
+          <w:p>
+            <w:pPr>
+              <w:spacing w:before="20" w:after="40" w:line="276" w:lineRule="auto"/>
+            </w:pPr>
+            <w:r>
+              <w:rPr>
+                <w:rFonts w:ascii="Arial" w:hAnsi="Arial"/>
+                <w:color w:val="334155"/>
+                <w:sz w:val="19"/>
+              </w:rPr>
+              <w:t>• Top Bưu cục điểm nóng tồn Aging:</w:t>
+            </w:r>
+          </w:p>
+          <w:p>
+            <w:pPr>
+              <w:spacing w:before="20" w:after="40" w:line="276" w:lineRule="auto"/>
+            </w:pPr>
+            <w:r>
+              <w:rPr>
+                <w:rFonts w:ascii="Arial" w:hAnsi="Arial"/>
+                <w:color w:val="334155"/>
+                <w:sz w:val="19"/>
+              </w:rPr>
+              <w:t xml:space="preserve">  - (LDO) Đức Trọng 1 (Lâm Đồng - AM Nguyễn Lê Nguyên Vũ): 101 đơn (5–8N: 91 đ, 8–15N: 10 đ).</w:t>
+            </w:r>
+          </w:p>
+          <w:p>
+            <w:pPr>
+              <w:spacing w:before="20" w:after="40" w:line="276" w:lineRule="auto"/>
+            </w:pPr>
+            <w:r>
+              <w:rPr>
+                <w:rFonts w:ascii="Arial" w:hAnsi="Arial"/>
+                <w:color w:val="334155"/>
+                <w:sz w:val="19"/>
+              </w:rPr>
+              <w:t xml:space="preserve">  - (LDO) Tân Hà Lâm Hà (Lâm Đồng - AM Huỳnh Thị Kim Chi): 40 đơn (5–8N: 28 đ, 8–15N: 12 đ).</w:t>
+            </w:r>
+          </w:p>
+          <w:p>
+            <w:pPr>
+              <w:spacing w:before="20" w:after="40" w:line="276" w:lineRule="auto"/>
+            </w:pPr>
+            <w:r>
+              <w:rPr>
+                <w:rFonts w:ascii="Arial" w:hAnsi="Arial"/>
+                <w:color w:val="334155"/>
+                <w:sz w:val="19"/>
+              </w:rPr>
+              <w:t xml:space="preserve">  - (KHO) Bắc Cam Ranh (Khánh Hòa - AM Nguyễn Thanh Long): 39 đơn (5–8N: 38 đ, 8–15N: 1 đ).</w:t>
+            </w:r>
+          </w:p>
+          <w:p>
+            <w:pPr>
+              <w:spacing w:before="20" w:after="40" w:line="276" w:lineRule="auto"/>
+            </w:pPr>
+            <w:r>
+              <w:rPr>
+                <w:rFonts w:ascii="Arial" w:hAnsi="Arial"/>
+                <w:color w:val="334155"/>
+                <w:sz w:val="19"/>
+              </w:rPr>
+              <w:t xml:space="preserve">  - (LDO) Hòa Ninh (Lâm Đồng - AM Hồng Bích Nga): 19 đơn (toàn bộ 19 đ ở dải 5–8N).</w:t>
+            </w:r>
+          </w:p>
+          <w:p>
+            <w:pPr>
+              <w:spacing w:before="20" w:after="40" w:line="276" w:lineRule="auto"/>
+            </w:pPr>
+            <w:r>
+              <w:rPr>
+                <w:rFonts w:ascii="Arial" w:hAnsi="Arial"/>
+                <w:color w:val="334155"/>
+                <w:sz w:val="19"/>
+              </w:rPr>
+              <w:t xml:space="preserve">  - (LDO) Di Linh (Lâm Đồng - AM Nguyễn Lê Nguyên Vũ): 18 đơn (5–8N: 11 đ, 8–15N: 6 đ, &gt;15N: 1 đ).</w:t>
+            </w:r>
+          </w:p>
+          <w:p>
+            <w:pPr>
+              <w:spacing w:before="20" w:after="40" w:line="276" w:lineRule="auto"/>
+            </w:pPr>
+            <w:r>
+              <w:rPr>
+                <w:rFonts w:ascii="Arial" w:hAnsi="Arial"/>
+                <w:color w:val="334155"/>
+                <w:sz w:val="19"/>
+              </w:rPr>
+              <w:t xml:space="preserve">  - (LDO) Đơn Dương (Lâm Đồng - AM Phan Nguyễn Yến Nhi): 17 đơn (5–8N: 10 đ, 8–15N: 7 đ).</w:t>
+            </w:r>
+          </w:p>
+          <w:p>
+            <w:pPr>
+              <w:spacing w:before="20" w:after="40" w:line="276" w:lineRule="auto"/>
+            </w:pPr>
+            <w:r>
+              <w:rPr>
+                <w:rFonts w:ascii="Arial" w:hAnsi="Arial"/>
+                <w:color w:val="334155"/>
+                <w:sz w:val="19"/>
+              </w:rPr>
+            </w:r>
+          </w:p>
+          <w:p>
+            <w:pPr>
+              <w:spacing w:before="20" w:after="40" w:line="276" w:lineRule="auto"/>
+            </w:pPr>
+            <w:r>
+              <w:rPr>
+                <w:rFonts w:ascii="Arial" w:hAnsi="Arial"/>
+                <w:b/>
+                <w:color w:val="0F172A"/>
+                <w:sz w:val="20"/>
+              </w:rPr>
+              <w:t>📍 2. BẢNG 2: TỔNG QUAN HÀNG TREO LUÂN CHUYỂN (TREO LC):</w:t>
+            </w:r>
+          </w:p>
+          <w:p>
+            <w:pPr>
+              <w:spacing w:before="20" w:after="40" w:line="276" w:lineRule="auto"/>
+            </w:pPr>
+            <w:r>
+              <w:rPr>
+                <w:rFonts w:ascii="Arial" w:hAnsi="Arial"/>
+                <w:color w:val="334155"/>
+                <w:sz w:val="19"/>
+              </w:rPr>
+              <w:t>• Tổng số kiện đang trong luồng luân chuyển toàn vùng: 4.660 đơn hàng.</w:t>
+            </w:r>
+          </w:p>
+          <w:p>
+            <w:pPr>
+              <w:spacing w:before="20" w:after="40" w:line="276" w:lineRule="auto"/>
+            </w:pPr>
+            <w:r>
+              <w:rPr>
+                <w:rFonts w:ascii="Arial" w:hAnsi="Arial"/>
+                <w:color w:val="334155"/>
+                <w:sz w:val="19"/>
+              </w:rPr>
+              <w:t>• Cơ cấu thời gian luân chuyển:</w:t>
+            </w:r>
+          </w:p>
+          <w:p>
+            <w:pPr>
+              <w:spacing w:before="20" w:after="40" w:line="276" w:lineRule="auto"/>
+            </w:pPr>
+            <w:r>
+              <w:rPr>
+                <w:rFonts w:ascii="Arial" w:hAnsi="Arial"/>
+                <w:color w:val="334155"/>
+                <w:sz w:val="19"/>
+              </w:rPr>
+              <w:t xml:space="preserve">  - Luân chuyển đúng hạn (dưới 24h): 4.287 đơn (chiếm tới 92,0% tổng lượng đơn ➔ Dòng chảy vận hành duy trì tốt).</w:t>
+            </w:r>
+          </w:p>
+          <w:p>
+            <w:pPr>
+              <w:spacing w:before="20" w:after="40" w:line="276" w:lineRule="auto"/>
+            </w:pPr>
+            <w:r>
+              <w:rPr>
+                <w:rFonts w:ascii="Arial" w:hAnsi="Arial"/>
+                <w:color w:val="334155"/>
+                <w:sz w:val="19"/>
+              </w:rPr>
+              <w:t xml:space="preserve">  - Đơn tồn Treo ≥24h: 373 đơn (chiếm 8,0% toàn vùng ➔ Cần tập trung tháo gỡ điểm nghẽn).</w:t>
+            </w:r>
+          </w:p>
+          <w:p>
+            <w:pPr>
+              <w:spacing w:before="20" w:after="40" w:line="276" w:lineRule="auto"/>
+            </w:pPr>
+            <w:r>
+              <w:rPr>
+                <w:rFonts w:ascii="Arial" w:hAnsi="Arial"/>
+                <w:color w:val="334155"/>
+                <w:sz w:val="19"/>
+              </w:rPr>
+              <w:t xml:space="preserve">  - Phân tách cụ thể lượng đơn Treo ≥24h:</w:t>
+            </w:r>
+          </w:p>
+          <w:p>
+            <w:pPr>
+              <w:spacing w:before="20" w:after="40" w:line="276" w:lineRule="auto"/>
+            </w:pPr>
+            <w:r>
+              <w:rPr>
+                <w:rFonts w:ascii="Arial" w:hAnsi="Arial"/>
+                <w:color w:val="334155"/>
+                <w:sz w:val="19"/>
+              </w:rPr>
+              <w:t xml:space="preserve">    + 24 – 36h: 165 đơn (3,5%).</w:t>
+            </w:r>
+          </w:p>
+          <w:p>
+            <w:pPr>
+              <w:spacing w:before="20" w:after="40" w:line="276" w:lineRule="auto"/>
+            </w:pPr>
+            <w:r>
+              <w:rPr>
+                <w:rFonts w:ascii="Arial" w:hAnsi="Arial"/>
+                <w:color w:val="334155"/>
+                <w:sz w:val="19"/>
+              </w:rPr>
+              <w:t xml:space="preserve">    + 36 – 72h: 132 đơn (2,8%).</w:t>
+            </w:r>
+          </w:p>
+          <w:p>
+            <w:pPr>
+              <w:spacing w:before="20" w:after="40" w:line="276" w:lineRule="auto"/>
+            </w:pPr>
+            <w:r>
+              <w:rPr>
+                <w:rFonts w:ascii="Arial" w:hAnsi="Arial"/>
+                <w:color w:val="334155"/>
+                <w:sz w:val="19"/>
+              </w:rPr>
+              <w:t xml:space="preserve">    + 72 – 120h: 31 đơn (0,7%).</w:t>
+            </w:r>
+          </w:p>
+          <w:p>
+            <w:pPr>
+              <w:spacing w:before="20" w:after="40" w:line="276" w:lineRule="auto"/>
+            </w:pPr>
+            <w:r>
+              <w:rPr>
+                <w:rFonts w:ascii="Arial" w:hAnsi="Arial"/>
+                <w:color w:val="334155"/>
+                <w:sz w:val="19"/>
+              </w:rPr>
+              <w:t xml:space="preserve">    + Trên 120h (&gt;5 ngày): 45 đơn (1,0%).</w:t>
+            </w:r>
+          </w:p>
+          <w:p>
+            <w:pPr>
+              <w:spacing w:before="20" w:after="40" w:line="276" w:lineRule="auto"/>
+            </w:pPr>
+            <w:r>
+              <w:rPr>
+                <w:rFonts w:ascii="Arial" w:hAnsi="Arial"/>
+                <w:color w:val="334155"/>
+                <w:sz w:val="19"/>
+              </w:rPr>
+              <w:t xml:space="preserve">  - Tổng số đơn trễ luân chuyển nặng (≥36h): 208 đơn (chiếm 4,5% toàn luồng).</w:t>
+            </w:r>
+          </w:p>
+          <w:p>
+            <w:pPr>
+              <w:spacing w:before="20" w:after="40" w:line="276" w:lineRule="auto"/>
+            </w:pPr>
+            <w:r>
+              <w:rPr>
+                <w:rFonts w:ascii="Arial" w:hAnsi="Arial"/>
+                <w:color w:val="334155"/>
+                <w:sz w:val="19"/>
+              </w:rPr>
+              <w:t>• Phân bổ luân chuyển theo tỉnh:</w:t>
+            </w:r>
+          </w:p>
+          <w:p>
+            <w:pPr>
+              <w:spacing w:before="20" w:after="40" w:line="276" w:lineRule="auto"/>
+            </w:pPr>
+            <w:r>
+              <w:rPr>
+                <w:rFonts w:ascii="Arial" w:hAnsi="Arial"/>
+                <w:color w:val="334155"/>
+                <w:sz w:val="19"/>
+              </w:rPr>
+              <w:t xml:space="preserve">  - Lâm Đồng: 1.504 đơn (chiếm 32,3% toàn vùng).</w:t>
+            </w:r>
+          </w:p>
+          <w:p>
+            <w:pPr>
+              <w:spacing w:before="20" w:after="40" w:line="276" w:lineRule="auto"/>
+            </w:pPr>
+            <w:r>
+              <w:rPr>
+                <w:rFonts w:ascii="Arial" w:hAnsi="Arial"/>
+                <w:color w:val="334155"/>
+                <w:sz w:val="19"/>
+              </w:rPr>
+              <w:t xml:space="preserve">  - Khánh Hòa: 1.294 đơn (chiếm 27,8%).</w:t>
+            </w:r>
+          </w:p>
+          <w:p>
+            <w:pPr>
+              <w:spacing w:before="20" w:after="40" w:line="276" w:lineRule="auto"/>
+            </w:pPr>
+            <w:r>
+              <w:rPr>
+                <w:rFonts w:ascii="Arial" w:hAnsi="Arial"/>
+                <w:color w:val="334155"/>
+                <w:sz w:val="19"/>
+              </w:rPr>
+              <w:t xml:space="preserve">  - Bình Thuận: 700 đơn (chiếm 15,0%).</w:t>
+            </w:r>
+          </w:p>
+          <w:p>
+            <w:pPr>
+              <w:spacing w:before="20" w:after="40" w:line="276" w:lineRule="auto"/>
+            </w:pPr>
+            <w:r>
+              <w:rPr>
+                <w:rFonts w:ascii="Arial" w:hAnsi="Arial"/>
+                <w:color w:val="334155"/>
+                <w:sz w:val="19"/>
+              </w:rPr>
+              <w:t xml:space="preserve">  - Đắk Nông: 619 đơn (chiếm 13,3%).</w:t>
+            </w:r>
+          </w:p>
+          <w:p>
+            <w:pPr>
+              <w:spacing w:before="20" w:after="40" w:line="276" w:lineRule="auto"/>
+            </w:pPr>
+            <w:r>
+              <w:rPr>
+                <w:rFonts w:ascii="Arial" w:hAnsi="Arial"/>
+                <w:color w:val="334155"/>
+                <w:sz w:val="19"/>
+              </w:rPr>
+              <w:t xml:space="preserve">  - Ninh Thuận: 523 đơn (chiếm 11,2%).</w:t>
+            </w:r>
+          </w:p>
+          <w:p>
+            <w:pPr>
+              <w:spacing w:before="20" w:after="40" w:line="276" w:lineRule="auto"/>
+            </w:pPr>
+            <w:r>
+              <w:rPr>
+                <w:rFonts w:ascii="Arial" w:hAnsi="Arial"/>
+                <w:color w:val="334155"/>
+                <w:sz w:val="19"/>
+              </w:rPr>
+              <w:t>• Top AM có số lượng đơn Treo ≥24h nhiều nhất:</w:t>
+            </w:r>
+          </w:p>
+          <w:p>
+            <w:pPr>
+              <w:spacing w:before="20" w:after="40" w:line="276" w:lineRule="auto"/>
+            </w:pPr>
+            <w:r>
+              <w:rPr>
+                <w:rFonts w:ascii="Arial" w:hAnsi="Arial"/>
+                <w:color w:val="334155"/>
+                <w:sz w:val="19"/>
+              </w:rPr>
+              <w:t xml:space="preserve">  - Nguyễn Hoàng Phi (Khánh Hòa): 45 đơn treo ≥24h (Treo ≥36h: 24 đ | 24-36h: 21 đ, 36-72h: 21 đ, 72-120h: 3 đ) trên tổng 365 đơn luân chuyển.</w:t>
+            </w:r>
+          </w:p>
+          <w:p>
+            <w:pPr>
+              <w:spacing w:before="20" w:after="40" w:line="276" w:lineRule="auto"/>
+            </w:pPr>
+            <w:r>
+              <w:rPr>
+                <w:rFonts w:ascii="Arial" w:hAnsi="Arial"/>
+                <w:color w:val="334155"/>
+                <w:sz w:val="19"/>
+              </w:rPr>
+              <w:t xml:space="preserve">  - Phan Đình Duy (Khánh Hòa): 35 đơn treo ≥24h (Treo ≥36h: 18 đ | 24-36h: 17 đ, 36-72h: 13 đ, 72-120h: 3 đ, &gt;120h: 2 đ) trên tổng 418 đơn.</w:t>
+            </w:r>
+          </w:p>
+          <w:p>
+            <w:pPr>
+              <w:spacing w:before="20" w:after="40" w:line="276" w:lineRule="auto"/>
+            </w:pPr>
+            <w:r>
+              <w:rPr>
+                <w:rFonts w:ascii="Arial" w:hAnsi="Arial"/>
+                <w:color w:val="334155"/>
+                <w:sz w:val="19"/>
+              </w:rPr>
+              <w:t xml:space="preserve">  - Nguyễn Duy Long (Ninh Thuận): 30 đơn treo ≥24h (Treo ≥36h: 12 đ | 24-36h: 18 đ, 36-72h: 11 đ, 72-120h: 1 đ) trên tổng 569 đơn.</w:t>
+            </w:r>
+          </w:p>
+          <w:p>
+            <w:pPr>
+              <w:spacing w:before="20" w:after="40" w:line="276" w:lineRule="auto"/>
+            </w:pPr>
+            <w:r>
+              <w:rPr>
+                <w:rFonts w:ascii="Arial" w:hAnsi="Arial"/>
+                <w:color w:val="334155"/>
+                <w:sz w:val="19"/>
+              </w:rPr>
+              <w:t xml:space="preserve">  - Hồng Bích Nga (Lâm Đồng): 29 đơn treo ≥24h (Treo ≥36h: 10 đ | 24-36h: 19 đ, 36-72h: 2 đ, 72-120h: 6 đ, &gt;120h: 2 đ) trên tổng 357 đơn.</w:t>
+            </w:r>
+          </w:p>
+          <w:p>
+            <w:pPr>
+              <w:spacing w:before="20" w:after="40" w:line="276" w:lineRule="auto"/>
+            </w:pPr>
+            <w:r>
+              <w:rPr>
+                <w:rFonts w:ascii="Arial" w:hAnsi="Arial"/>
+                <w:color w:val="334155"/>
+                <w:sz w:val="19"/>
+              </w:rPr>
+              <w:t xml:space="preserve">  - Trần Thị Nhung (Đắk Nông): 28 đơn treo ≥24h (Treo ≥36h: 15 đ | 24-36h: 13 đ, 36-72h: 14 đ, &gt;120h: 1 đ) trên tổng 349 đơn.</w:t>
+            </w:r>
+          </w:p>
+          <w:p>
+            <w:pPr>
+              <w:spacing w:before="20" w:after="40" w:line="276" w:lineRule="auto"/>
+            </w:pPr>
+            <w:r>
+              <w:rPr>
+                <w:rFonts w:ascii="Arial" w:hAnsi="Arial"/>
+                <w:color w:val="334155"/>
+                <w:sz w:val="19"/>
+              </w:rPr>
+              <w:t xml:space="preserve">  - Lê Văn Trường (Lâm Đồng): 27 đơn treo ≥24h (Treo ≥36h: 18 đ | 24-36h: 9 đ, 36-72h: 12 đ, 72-120h: 6 đ) trên tổng 460 đơn.</w:t>
+            </w:r>
+          </w:p>
+          <w:p>
+            <w:pPr>
+              <w:spacing w:before="20" w:after="40" w:line="276" w:lineRule="auto"/>
+            </w:pPr>
+            <w:r>
+              <w:rPr>
+                <w:rFonts w:ascii="Arial" w:hAnsi="Arial"/>
+                <w:color w:val="334155"/>
+                <w:sz w:val="19"/>
+              </w:rPr>
+              <w:t>• Top Bưu cục điểm nóng phát sinh đơn treo:</w:t>
+            </w:r>
+          </w:p>
+          <w:p>
+            <w:pPr>
+              <w:spacing w:before="20" w:after="40" w:line="276" w:lineRule="auto"/>
+            </w:pPr>
+            <w:r>
+              <w:rPr>
+                <w:rFonts w:ascii="Arial" w:hAnsi="Arial"/>
+                <w:color w:val="334155"/>
+                <w:sz w:val="19"/>
+              </w:rPr>
+              <w:t xml:space="preserve">  - (LDO) Đơn Dương (Lâm Đồng - AM Phan Nguyễn Yến Nhi): 21 đơn treo ≥24h (Treo ≥36h: 10 đ | 24-36h: 11 đ, 36-72h: 9 đ, 72-120h: 1 đ) trên 113 đơn.</w:t>
+            </w:r>
+          </w:p>
+          <w:p>
+            <w:pPr>
+              <w:spacing w:before="20" w:after="40" w:line="276" w:lineRule="auto"/>
+            </w:pPr>
+            <w:r>
+              <w:rPr>
+                <w:rFonts w:ascii="Arial" w:hAnsi="Arial"/>
+                <w:color w:val="334155"/>
+                <w:sz w:val="19"/>
+              </w:rPr>
+              <w:t xml:space="preserve">  - (LDO) Lang Biang - Đà Lạt 2 (Lâm Đồng - AM Lê Văn Trường): 18 đơn treo ≥24h (Treo ≥36h: 11 đ | 24-36h: 7 đ, 36-72h: 9 đ, 72-120h: 2 đ) trên 146 đơn.</w:t>
+            </w:r>
+          </w:p>
+          <w:p>
+            <w:pPr>
+              <w:spacing w:before="20" w:after="40" w:line="276" w:lineRule="auto"/>
+            </w:pPr>
+            <w:r>
+              <w:rPr>
+                <w:rFonts w:ascii="Arial" w:hAnsi="Arial"/>
+                <w:color w:val="334155"/>
+                <w:sz w:val="19"/>
+              </w:rPr>
+              <w:t xml:space="preserve">  - (NTH) Phước Dinh (Ninh Thuận - AM Nguyễn Duy Long): 18 đơn treo ≥24h (Treo ≥36h: 7 đ | 24-36h: 11 đ, 36-72h: 6 đ, 72-120h: 1 đ) trên 203 đơn.</w:t>
+            </w:r>
+          </w:p>
+          <w:p>
+            <w:pPr>
+              <w:spacing w:before="20" w:after="40" w:line="276" w:lineRule="auto"/>
+            </w:pPr>
+            <w:r>
+              <w:rPr>
+                <w:rFonts w:ascii="Arial" w:hAnsi="Arial"/>
+                <w:color w:val="334155"/>
+                <w:sz w:val="19"/>
+              </w:rPr>
+              <w:t xml:space="preserve">  - (KHO) Tây Nha Trang (Khánh Hòa - AM Phan Đình Duy): 14 đơn treo ≥24h (Treo ≥36h: 5 đ | 24-36h: 9 đ, 36-72h: 3 đ, 72-120h: 1 đ, &gt;120h: 1 đ) trên 112 đơn.</w:t>
+            </w:r>
+          </w:p>
+          <w:p>
+            <w:pPr>
+              <w:spacing w:before="20" w:after="40" w:line="276" w:lineRule="auto"/>
+            </w:pPr>
+            <w:r>
+              <w:rPr>
+                <w:rFonts w:ascii="Arial" w:hAnsi="Arial"/>
+                <w:color w:val="334155"/>
+                <w:sz w:val="19"/>
+              </w:rPr>
+              <w:t xml:space="preserve">  - (KHO) Cam Linh (Khánh Hòa - AM Nguyễn Thanh Long): 11 đơn treo ≥24h (Treo ≥36h: 9 đ | 24-36h: 2 đ, 36-72h: 7 đ, 72-120h: 1 đ, &gt;120h: 1 đ) trên 136 đơn.</w:t>
             </w:r>
           </w:p>
           <w:p>
@@ -5801,46 +6466,354 @@
                 <w:color w:val="0F172A"/>
                 <w:sz w:val="19"/>
               </w:rPr>
-              <w:t>"Kính thưa Ban Giám Đốc, về tình hình hàng Aging tồn đọng trên 5 ngày:</w:t>
-            </w:r>
-          </w:p>
-          <w:p>
-            <w:pPr>
-              <w:spacing w:before="20" w:after="40" w:line="276" w:lineRule="auto"/>
-            </w:pPr>
-            <w:r>
-              <w:rPr>
-                <w:rFonts w:ascii="Arial" w:hAnsi="Arial"/>
-                <w:color w:val="334155"/>
-                <w:sz w:val="19"/>
-              </w:rPr>
-              <w:t>Toàn vùng hiện có khoảng 2.400 đơn hàng lưu cữu trên 5 ngày, tập trung ở một số bưu cục như Quảng Tín (490 đơn), Xuân Hương (310 đơn), Đức Trọng 1 (281 đơn), Cam Linh (250 đơn) và Di Linh (219 đơn).</w:t>
-            </w:r>
-          </w:p>
-          <w:p>
-            <w:pPr>
-              <w:spacing w:before="20" w:after="40" w:line="276" w:lineRule="auto"/>
-            </w:pPr>
-            <w:r>
-              <w:rPr>
-                <w:rFonts w:ascii="Arial" w:hAnsi="Arial"/>
-                <w:color w:val="334155"/>
-                <w:sz w:val="19"/>
-              </w:rPr>
-              <w:t>Hàng tồn lâu ngày sẽ ảnh hưởng đến mặt bằng kho bãi và tăng rủi ro hư hỏng, thất lạc.</w:t>
-            </w:r>
-          </w:p>
-          <w:p>
-            <w:pPr>
-              <w:spacing w:before="20" w:after="40" w:line="276" w:lineRule="auto"/>
-            </w:pPr>
-            <w:r>
-              <w:rPr>
-                <w:rFonts w:ascii="Arial" w:hAnsi="Arial"/>
-                <w:color w:val="334155"/>
-                <w:sz w:val="19"/>
-              </w:rPr>
-              <w:t>Đề nghị các anh chị AM phụ trách các bưu cục trên: Trong 2-3 ngày tới trực tiếp cùng Trưởng bưu cục kiểm kê, phân loại cụ thể: Đơn nào còn giao được thì ưu tiên cho bưu tá phát ngay; đơn nào khách từ chối thì làm thủ tục hoàn trả; đơn nào vướng mắc thông tin thì liên hệ shop hỗ trợ xử lý dứt điểm.</w:t>
+              <w:t>"Kính thưa Ban Giám Đốc và các anh chị em AM, chuyển sang Tab 12 về tình hình Hàng tồn Aging và Treo luân chuyển:</w:t>
+            </w:r>
+          </w:p>
+          <w:p>
+            <w:pPr>
+              <w:spacing w:before="20" w:after="40" w:line="276" w:lineRule="auto"/>
+            </w:pPr>
+            <w:r>
+              <w:rPr>
+                <w:rFonts w:ascii="Arial" w:hAnsi="Arial"/>
+                <w:color w:val="334155"/>
+                <w:sz w:val="19"/>
+              </w:rPr>
+            </w:r>
+          </w:p>
+          <w:p>
+            <w:pPr>
+              <w:spacing w:before="20" w:after="40" w:line="276" w:lineRule="auto"/>
+            </w:pPr>
+            <w:r>
+              <w:rPr>
+                <w:rFonts w:ascii="Arial" w:hAnsi="Arial"/>
+                <w:color w:val="334155"/>
+                <w:sz w:val="19"/>
+              </w:rPr>
+              <w:t>Điểm sáng rất ấn tượng đầu tiên mà em muốn báo cáo với Ban Giám Đốc là:</w:t>
+            </w:r>
+          </w:p>
+          <w:p>
+            <w:pPr>
+              <w:spacing w:before="20" w:after="40" w:line="276" w:lineRule="auto"/>
+            </w:pPr>
+            <w:r>
+              <w:rPr>
+                <w:rFonts w:ascii="Arial" w:hAnsi="Arial"/>
+                <w:color w:val="334155"/>
+                <w:sz w:val="19"/>
+              </w:rPr>
+              <w:t>Theo số liệu theo dõi toàn mạng lưới, lượng hàng tồn Aging của vùng Nam Trung Bộ chúng ta tuần này đã có bước bứt phá xả hàng cực kỳ ngoạn mục:</w:t>
+            </w:r>
+          </w:p>
+          <w:p>
+            <w:pPr>
+              <w:spacing w:before="20" w:after="40" w:line="276" w:lineRule="auto"/>
+            </w:pPr>
+            <w:r>
+              <w:rPr>
+                <w:rFonts w:ascii="Arial" w:hAnsi="Arial"/>
+                <w:color w:val="334155"/>
+                <w:sz w:val="19"/>
+              </w:rPr>
+              <w:t>So với cùng kỳ 7 ngày trước (N-7), toàn vùng NTB đã kéo giảm lượng tồn tới hơn 71% (chính xác là giảm 71,11%)!</w:t>
+            </w:r>
+          </w:p>
+          <w:p>
+            <w:pPr>
+              <w:spacing w:before="20" w:after="40" w:line="276" w:lineRule="auto"/>
+            </w:pPr>
+            <w:r>
+              <w:rPr>
+                <w:rFonts w:ascii="Arial" w:hAnsi="Arial"/>
+                <w:color w:val="334155"/>
+                <w:sz w:val="19"/>
+              </w:rPr>
+              <w:t>Các anh chị có thể thấy trên biểu đồ diễn biến từng ngày: Đầu chu kỳ ngày 28/09 toàn vùng ghi nhận 1.322 đơn, nhưng các bưu cục đã xả tồn quyết liệt qua từng ngày: xuống 943 đơn vào ngày 01/10, xuống 758 đơn ngày 02/10, ngày 04/10 chỉ còn 399 đơn, và đến ngày hôm nay 06/10 chạm mức 342 đơn — tức là tiếp tục giảm thêm 2,84% so với ngày hôm qua.</w:t>
+            </w:r>
+          </w:p>
+          <w:p>
+            <w:pPr>
+              <w:spacing w:before="20" w:after="40" w:line="276" w:lineRule="auto"/>
+            </w:pPr>
+            <w:r>
+              <w:rPr>
+                <w:rFonts w:ascii="Arial" w:hAnsi="Arial"/>
+                <w:color w:val="334155"/>
+                <w:sz w:val="19"/>
+              </w:rPr>
+              <w:t>Nhờ tiến độ xả tồn dốc đứng này, tỷ trọng hàng tồn của Nam Trung Bộ hiện chỉ còn chiếm vỏn vẹn 3,2% trên toàn quốc — trong khi các vùng bạn như Đông Nam Bộ chiếm tới 31,6%, TP.HCM 12,6%, hay Đồng bằng Bắc Bộ 9,2%. Đây là kết quả chứng minh sự vào cuộc rất rốt ráo của các anh chị AM và anh em bưu cục trong việc giải phóng kho bãi!</w:t>
+            </w:r>
+          </w:p>
+          <w:p>
+            <w:pPr>
+              <w:spacing w:before="20" w:after="40" w:line="276" w:lineRule="auto"/>
+            </w:pPr>
+            <w:r>
+              <w:rPr>
+                <w:rFonts w:ascii="Arial" w:hAnsi="Arial"/>
+                <w:color w:val="334155"/>
+                <w:sz w:val="19"/>
+              </w:rPr>
+            </w:r>
+          </w:p>
+          <w:p>
+            <w:pPr>
+              <w:spacing w:before="20" w:after="40" w:line="276" w:lineRule="auto"/>
+            </w:pPr>
+            <w:r>
+              <w:rPr>
+                <w:rFonts w:ascii="Arial" w:hAnsi="Arial"/>
+                <w:color w:val="334155"/>
+                <w:sz w:val="19"/>
+              </w:rPr>
+              <w:t>Đi sâu vào cơ cấu 400 đơn lưu kho trên 5 ngày hiện tại:</w:t>
+            </w:r>
+          </w:p>
+          <w:p>
+            <w:pPr>
+              <w:spacing w:before="20" w:after="40" w:line="276" w:lineRule="auto"/>
+            </w:pPr>
+            <w:r>
+              <w:rPr>
+                <w:rFonts w:ascii="Arial" w:hAnsi="Arial"/>
+                <w:color w:val="334155"/>
+                <w:sz w:val="19"/>
+              </w:rPr>
+              <w:t>Có tới 82,0% (328 đơn) là mới chớm bước qua ngày thứ 5 đến ngày thứ 8; đơn tồn từ 8 đến 15 ngày là 64 đơn (16,0%); và nhóm tồn lâu trên 15 ngày toàn vùng chỉ còn vỏn vẹn đúng 8 đơn (chiếm 2,0%).</w:t>
+            </w:r>
+          </w:p>
+          <w:p>
+            <w:pPr>
+              <w:spacing w:before="20" w:after="40" w:line="276" w:lineRule="auto"/>
+            </w:pPr>
+            <w:r>
+              <w:rPr>
+                <w:rFonts w:ascii="Arial" w:hAnsi="Arial"/>
+                <w:color w:val="334155"/>
+                <w:sz w:val="19"/>
+              </w:rPr>
+              <w:t>Về phân bổ AM, anh Nguyễn Lê Nguyên Vũ tại Lâm Đồng hiện có 120 đơn (chiếm 30,0% toàn vùng, tập trung 101 đơn tại bưu cục Đức Trọng 1 do đặc thù địa bàn rộng). Kế đến là chị Huỳnh Thị Kim Chi có 47 đơn (chủ yếu tại bưu cục Tân Hà Lâm Hà 40 đơn), anh Nguyễn Thanh Long có 43 đơn (tại Bắc Cam Ranh 39 đơn), chị Hồng Bích Nga có 40 đơn, và anh Nguyễn Duy Long có 25 đơn. Riêng anh Huỳnh Thúc Duân tại Đắk Nông dù chỉ có 15 đơn nhưng có tới 4 đơn tồn trên 15 ngày, thời gian lưu kho bình quân 13,1 ngày – anh Duân cần kiểm tra xử lý dứt điểm 4 đơn này ngay hôm nay.</w:t>
+            </w:r>
+          </w:p>
+          <w:p>
+            <w:pPr>
+              <w:spacing w:before="20" w:after="40" w:line="276" w:lineRule="auto"/>
+            </w:pPr>
+            <w:r>
+              <w:rPr>
+                <w:rFonts w:ascii="Arial" w:hAnsi="Arial"/>
+                <w:color w:val="334155"/>
+                <w:sz w:val="19"/>
+              </w:rPr>
+              <w:t>Với nhóm Aging này, do đại đa số (82%) mới chớm ở ngưỡng 5–8 ngày, nên việc xử lý tương đối thuận lợi. Em đề nghị các AM phối hợp trực tiếp với trưởng bưu cục kiểm đếm nhanh: Đơn nào khách hẹn giao lại thì ưu tiên cho bưu tá giao dứt điểm trong ca; đơn nào khách từ chối nhận thì chuyển trạng thái hoàn ngay, dứt khoát không để ngâm kho kéo dài sang mốc 15 ngày.</w:t>
+            </w:r>
+          </w:p>
+          <w:p>
+            <w:pPr>
+              <w:spacing w:before="20" w:after="40" w:line="276" w:lineRule="auto"/>
+            </w:pPr>
+            <w:r>
+              <w:rPr>
+                <w:rFonts w:ascii="Arial" w:hAnsi="Arial"/>
+                <w:color w:val="334155"/>
+                <w:sz w:val="19"/>
+              </w:rPr>
+            </w:r>
+          </w:p>
+          <w:p>
+            <w:pPr>
+              <w:spacing w:before="20" w:after="40" w:line="276" w:lineRule="auto"/>
+            </w:pPr>
+            <w:r>
+              <w:rPr>
+                <w:rFonts w:ascii="Arial" w:hAnsi="Arial"/>
+                <w:color w:val="334155"/>
+                <w:sz w:val="19"/>
+              </w:rPr>
+              <w:t>Thứ hai, chuyển sang mảng Hàng Treo luân chuyển:</w:t>
+            </w:r>
+          </w:p>
+          <w:p>
+            <w:pPr>
+              <w:spacing w:before="20" w:after="40" w:line="276" w:lineRule="auto"/>
+            </w:pPr>
+            <w:r>
+              <w:rPr>
+                <w:rFonts w:ascii="Arial" w:hAnsi="Arial"/>
+                <w:color w:val="334155"/>
+                <w:sz w:val="19"/>
+              </w:rPr>
+              <w:t>Hiện tại toàn vùng có 4.660 đơn đang nằm trên luồng luân chuyển. Điểm rất tích cực là có tới 92,0% (tương đương 4.287 đơn) luân chuyển hoàn toàn đúng hạn dưới 24h, dòng chảy vận hành cơ bản thông suốt.</w:t>
+            </w:r>
+          </w:p>
+          <w:p>
+            <w:pPr>
+              <w:spacing w:before="20" w:after="40" w:line="276" w:lineRule="auto"/>
+            </w:pPr>
+            <w:r>
+              <w:rPr>
+                <w:rFonts w:ascii="Arial" w:hAnsi="Arial"/>
+                <w:color w:val="334155"/>
+                <w:sz w:val="19"/>
+              </w:rPr>
+              <w:t>Tuy nhiên, chúng ta đang có 373 đơn (chiếm 8,0%) bị treo từ 24h trở lên, trong đó số đơn trễ nặng trên 36h là 208 đơn (chiếm 4,5% toàn luồng).</w:t>
+            </w:r>
+          </w:p>
+          <w:p>
+            <w:pPr>
+              <w:spacing w:before="20" w:after="40" w:line="276" w:lineRule="auto"/>
+            </w:pPr>
+            <w:r>
+              <w:rPr>
+                <w:rFonts w:ascii="Arial" w:hAnsi="Arial"/>
+                <w:color w:val="334155"/>
+                <w:sz w:val="19"/>
+              </w:rPr>
+              <w:t>Xét theo tỉnh, Lâm Đồng chiếm 1.504 đơn luân chuyển (32,3%) và Khánh Hòa chiếm 1.294 đơn (27,8%).</w:t>
+            </w:r>
+          </w:p>
+          <w:p>
+            <w:pPr>
+              <w:spacing w:before="20" w:after="40" w:line="276" w:lineRule="auto"/>
+            </w:pPr>
+            <w:r>
+              <w:rPr>
+                <w:rFonts w:ascii="Arial" w:hAnsi="Arial"/>
+                <w:color w:val="334155"/>
+                <w:sz w:val="19"/>
+              </w:rPr>
+              <w:t>Các điểm nóng treo tập trung ở cụm của anh Nguyễn Hoàng Phi (45 đơn treo ≥24h, trong đó 24 đơn trễ nặng ≥36h), anh Phan Đình Duy (35 đơn treo), anh Nguyễn Duy Long (30 đơn treo), chị Hồng Bích Nga (29 đơn treo), chị Trần Thị Nhung (28 đơn treo) và anh Lê Văn Trường (27 đơn treo); tại một số bưu cục như Đơn Dương (21 đơn), Lang Biang - Đà Lạt 2 (18 đơn), Phước Dinh (18 đơn), Tây Nha Trang (14 đơn) và Cam Linh (11 đơn).</w:t>
+            </w:r>
+          </w:p>
+          <w:p>
+            <w:pPr>
+              <w:spacing w:before="20" w:after="40" w:line="276" w:lineRule="auto"/>
+            </w:pPr>
+            <w:r>
+              <w:rPr>
+                <w:rFonts w:ascii="Arial" w:hAnsi="Arial"/>
+                <w:color w:val="334155"/>
+                <w:sz w:val="19"/>
+              </w:rPr>
+            </w:r>
+          </w:p>
+          <w:p>
+            <w:pPr>
+              <w:spacing w:before="20" w:after="40" w:line="276" w:lineRule="auto"/>
+            </w:pPr>
+            <w:r>
+              <w:rPr>
+                <w:rFonts w:ascii="Arial" w:hAnsi="Arial"/>
+                <w:b/>
+                <w:color w:val="0F172A"/>
+                <w:sz w:val="20"/>
+              </w:rPr>
+              <w:t>🔍 NGUYÊN NHÂN &amp; GIẢI PHÁP ĐIỀU HÀNH:</w:t>
+            </w:r>
+          </w:p>
+          <w:p>
+            <w:pPr>
+              <w:spacing w:before="20" w:after="40" w:line="276" w:lineRule="auto"/>
+            </w:pPr>
+            <w:r>
+              <w:rPr>
+                <w:rFonts w:ascii="Arial" w:hAnsi="Arial"/>
+                <w:color w:val="334155"/>
+                <w:sz w:val="19"/>
+              </w:rPr>
+              <w:t>Qua rà soát quy trình, đơn bị treo luân chuyển chủ yếu xuất phát từ 2 khâu:</w:t>
+            </w:r>
+          </w:p>
+          <w:p>
+            <w:pPr>
+              <w:spacing w:before="20" w:after="40" w:line="276" w:lineRule="auto"/>
+            </w:pPr>
+            <w:r>
+              <w:rPr>
+                <w:rFonts w:ascii="Arial" w:hAnsi="Arial"/>
+                <w:color w:val="334155"/>
+                <w:sz w:val="19"/>
+              </w:rPr>
+              <w:t>1. Xe trung chuyển KTC đã hạ tải tại bưu cục nhưng bưu cục chưa quét xác nhận 'Đến Bưu Cục' kịp thời vào hệ thống, khiến trạng thái đơn vẫn hiển thị là đang luân chuyển trên đường (thường gặp tại các bưu cục tuyến huyện như Đơn Dương, Lang Biang, Phước Dinh).</w:t>
+            </w:r>
+          </w:p>
+          <w:p>
+            <w:pPr>
+              <w:spacing w:before="20" w:after="40" w:line="276" w:lineRule="auto"/>
+            </w:pPr>
+            <w:r>
+              <w:rPr>
+                <w:rFonts w:ascii="Arial" w:hAnsi="Arial"/>
+                <w:color w:val="334155"/>
+                <w:sz w:val="19"/>
+              </w:rPr>
+              <w:t>2. Một số kiện hàng chuyển nhầm tuyến bưu cục phụ trách tại Hub, dẫn đến việc phải quét luân chuyển nội bộ thêm một vòng nữa.</w:t>
+            </w:r>
+          </w:p>
+          <w:p>
+            <w:pPr>
+              <w:spacing w:before="20" w:after="40" w:line="276" w:lineRule="auto"/>
+            </w:pPr>
+            <w:r>
+              <w:rPr>
+                <w:rFonts w:ascii="Arial" w:hAnsi="Arial"/>
+                <w:color w:val="334155"/>
+                <w:sz w:val="19"/>
+              </w:rPr>
+            </w:r>
+          </w:p>
+          <w:p>
+            <w:pPr>
+              <w:spacing w:before="20" w:after="40" w:line="276" w:lineRule="auto"/>
+            </w:pPr>
+            <w:r>
+              <w:rPr>
+                <w:rFonts w:ascii="Arial" w:hAnsi="Arial"/>
+                <w:color w:val="334155"/>
+                <w:sz w:val="19"/>
+              </w:rPr>
+              <w:t>Vì vậy, giải pháp tuần W41 của chúng ta là:</w:t>
+            </w:r>
+          </w:p>
+          <w:p>
+            <w:pPr>
+              <w:spacing w:before="20" w:after="40" w:line="276" w:lineRule="auto"/>
+            </w:pPr>
+            <w:r>
+              <w:rPr>
+                <w:rFonts w:ascii="Arial" w:hAnsi="Arial"/>
+                <w:color w:val="334155"/>
+                <w:sz w:val="19"/>
+              </w:rPr>
+              <w:t>1. Đề nghị các bưu cục điểm nóng (như Đơn Dương, Lang Biang, Phước Dinh, Tây Nha Trang...) thực hiện nghiêm kỷ luật quét 'Đến Bưu Cục' ngay khi nhận bao tải từ xe KTC, không để dồn bao qua ca mới mở niêm phong.</w:t>
+            </w:r>
+          </w:p>
+          <w:p>
+            <w:pPr>
+              <w:spacing w:before="20" w:after="40" w:line="276" w:lineRule="auto"/>
+            </w:pPr>
+            <w:r>
+              <w:rPr>
+                <w:rFonts w:ascii="Arial" w:hAnsi="Arial"/>
+                <w:color w:val="334155"/>
+                <w:sz w:val="19"/>
+              </w:rPr>
+              <w:t>2. Bộ phận KTC kiểm soát chặt chẽ khâu chia chọn tại Hub, hạn chế tối đa việc phân nhầm bao tải về sai bưu cục phát.</w:t>
+            </w:r>
+          </w:p>
+          <w:p>
+            <w:pPr>
+              <w:spacing w:before="20" w:after="40" w:line="276" w:lineRule="auto"/>
+            </w:pPr>
+            <w:r>
+              <w:rPr>
+                <w:rFonts w:ascii="Arial" w:hAnsi="Arial"/>
+                <w:color w:val="334155"/>
+                <w:sz w:val="19"/>
+              </w:rPr>
+              <w:t>Mục tiêu là trong tuần W41, chúng ta tiếp tục giữ vững đà xả tồn, kéo giảm tỷ lệ Treo luân chuyển từ 8,0% xuống dưới 4,0%, và giải phóng sạch sẽ 8 đơn Aging trên 15 ngày.</w:t>
             </w:r>
           </w:p>
           <w:p>
@@ -5854,7 +6827,7 @@
                 <w:color w:val="0F172A"/>
                 <w:sz w:val="19"/>
               </w:rPr>
-              <w:t>Bây giờ, em xin phép chuyển sang Tab 13 mổ xẻ Quản trị dòng tiền COD &amp; Tỷ lệ nộp bằng QR Code nhé!"</w:t>
+              <w:t>Bây giờ, em xin phép chuyển sang Tab 13 để phân tích Quản trị dòng tiền COD và Chuyển đổi số thanh toán QR Code nhé!"</w:t>
             </w:r>
           </w:p>
         </w:tc>

</xml_diff>